<commit_message>
docs: correct red-run description and dependency list in report
</commit_message>
<xml_diff>
--- a/docs/report/REPORT.docx
+++ b/docs/report/REPORT.docx
@@ -7,7 +7,7 @@
         <w:pStyle w:val="Title"/>
       </w:pPr>
       <w:r>
-        <w:t xml:space="preserve">Heart Disease Risk Prediction — MLOps Assignment 01</w:t>
+        <w:t xml:space="preserve">Heart Disease Risk Prediction — End-to-End MLOps Pipeline</w:t>
       </w:r>
     </w:p>
     <w:p>
@@ -3273,19 +3273,31 @@
         <w:t xml:space="preserve"> </w:t>
       </w:r>
       <w:r>
-        <w:t xml:space="preserve">broken commit was pushed to trigger a red run: lint/test/train-smoke fail</w:t>
-      </w:r>
-      <w:r>
-        <w:t xml:space="preserve"> </w:t>
-      </w:r>
-      <w:r>
-        <w:t xml:space="preserve">fast and the pipeline reports failure, then the fix was pushed to restore</w:t>
-      </w:r>
-      <w:r>
-        <w:t xml:space="preserve"> </w:t>
-      </w:r>
-      <w:r>
-        <w:t xml:space="preserve">a green run.</w:t>
+        <w:t xml:space="preserve">broken commit was pushed to trigger a red run: the test job fails, causing</w:t>
+      </w:r>
+      <w:r>
+        <w:t xml:space="preserve"> </w:t>
+      </w:r>
+      <w:r>
+        <w:t xml:space="preserve">the downstream train-smoke and docker jobs to be skipped (they depend on</w:t>
+      </w:r>
+      <w:r>
+        <w:t xml:space="preserve"> </w:t>
+      </w:r>
+      <w:r>
+        <w:t xml:space="preserve">test), while lint still passes independently; the pipeline reports failure</w:t>
+      </w:r>
+      <w:r>
+        <w:t xml:space="preserve"> </w:t>
+      </w:r>
+      <w:r>
+        <w:t xml:space="preserve">with the failing assertion visible in the logs. The fix was then pushed</w:t>
+      </w:r>
+      <w:r>
+        <w:t xml:space="preserve"> </w:t>
+      </w:r>
+      <w:r>
+        <w:t xml:space="preserve">to restore a green run.</w:t>
       </w:r>
     </w:p>
     <w:p>
@@ -3416,7 +3428,13 @@
         <w:t xml:space="preserve"> </w:t>
       </w:r>
       <w:r>
-        <w:t xml:space="preserve">scikit-learn, pandas, numpy, and joblib, eight pins mirrored from the root</w:t>
+        <w:t xml:space="preserve">scikit-learn, pandas, numpy, joblib, prometheus-client, and</w:t>
+      </w:r>
+      <w:r>
+        <w:t xml:space="preserve"> </w:t>
+      </w:r>
+      <w:r>
+        <w:t xml:space="preserve">prometheus-fastapi-instrumentator, eight pins mirrored from the root</w:t>
       </w:r>
       <w:r>
         <w:t xml:space="preserve"> </w:t>

</xml_diff>

<commit_message>
docs: final architecture diagram and regenerated report document
</commit_message>
<xml_diff>
--- a/docs/report/REPORT.docx
+++ b/docs/report/REPORT.docx
@@ -18,32 +18,6 @@
         <w:t xml:space="preserve">Adithya (2024AC05785)</w:t>
       </w:r>
     </w:p>
-    <w:sdt>
-      <w:sdtPr>
-        <w:docPartObj>
-          <w:docPartGallery w:val="Table of Contents"/>
-          <w:docPartUnique/>
-        </w:docPartObj>
-      </w:sdtPr>
-      <w:sdtContent>
-        <w:p>
-          <w:pPr>
-            <w:pStyle w:val="TOCHeading"/>
-          </w:pPr>
-          <w:r>
-            <w:t xml:space="preserve">Table of Contents</w:t>
-          </w:r>
-        </w:p>
-        <w:p>
-          <w:r>
-            <w:fldChar w:fldCharType="begin" w:dirty="true"/>
-            <w:instrText xml:space="preserve">TOC \o "1-3" \h \z \u</w:instrText>
-            <w:fldChar w:fldCharType="separate"/>
-            <w:fldChar w:fldCharType="end"/>
-          </w:r>
-        </w:p>
-      </w:sdtContent>
-    </w:sdt>
     <w:p>
       <w:pPr>
         <w:pStyle w:val="FirstParagraph"/>
@@ -104,31 +78,31 @@
         <w:t xml:space="preserve"> </w:t>
       </w:r>
       <w:r>
-        <w:t xml:space="preserve">Cleveland dataset. The goal was not simply to fit a model but to evidence</w:t>
-      </w:r>
-      <w:r>
-        <w:t xml:space="preserve"> </w:t>
-      </w:r>
-      <w:r>
-        <w:t xml:space="preserve">every stage of a production ML lifecycle: reproducible data preparation,</w:t>
-      </w:r>
-      <w:r>
-        <w:t xml:space="preserve"> </w:t>
-      </w:r>
-      <w:r>
-        <w:t xml:space="preserve">tracked experimentation, automated testing and CI/CD, containerized</w:t>
-      </w:r>
-      <w:r>
-        <w:t xml:space="preserve"> </w:t>
-      </w:r>
-      <w:r>
-        <w:t xml:space="preserve">serving, Kubernetes deployment, and monitoring — with every non-trivial</w:t>
-      </w:r>
-      <w:r>
-        <w:t xml:space="preserve"> </w:t>
-      </w:r>
-      <w:r>
-        <w:t xml:space="preserve">choice recorded and justified along the way rather than assumed.</w:t>
+        <w:t xml:space="preserve">Cleveland dataset. The goal was to evidence every stage of a production ML</w:t>
+      </w:r>
+      <w:r>
+        <w:t xml:space="preserve"> </w:t>
+      </w:r>
+      <w:r>
+        <w:t xml:space="preserve">lifecycle: reproducible data preparation, tracked experimentation, automated</w:t>
+      </w:r>
+      <w:r>
+        <w:t xml:space="preserve"> </w:t>
+      </w:r>
+      <w:r>
+        <w:t xml:space="preserve">testing and CI/CD, containerized serving, Kubernetes deployment, and</w:t>
+      </w:r>
+      <w:r>
+        <w:t xml:space="preserve"> </w:t>
+      </w:r>
+      <w:r>
+        <w:t xml:space="preserve">monitoring. Every non-trivial choice along the way is recorded and justified</w:t>
+      </w:r>
+      <w:r>
+        <w:t xml:space="preserve"> </w:t>
+      </w:r>
+      <w:r>
+        <w:t xml:space="preserve">below, not assumed.</w:t>
       </w:r>
     </w:p>
     <w:p>
@@ -136,7 +110,7 @@
         <w:pStyle w:val="BodyText"/>
       </w:pPr>
       <w:r>
-        <w:t xml:space="preserve">The system is organized around a stage-oriented repository layout —</w:t>
+        <w:t xml:space="preserve">The system is organized around a stage-oriented repository layout:</w:t>
       </w:r>
       <w:r>
         <w:t xml:space="preserve"> </w:t>
@@ -223,16 +197,13 @@
         <w:t xml:space="preserve">docs/</w:t>
       </w:r>
       <w:r>
-        <w:t xml:space="preserve"> </w:t>
-      </w:r>
-      <w:r>
-        <w:t xml:space="preserve">— chosen to map</w:t>
-      </w:r>
-      <w:r>
-        <w:t xml:space="preserve"> </w:t>
-      </w:r>
-      <w:r>
-        <w:t xml:space="preserve">1:1 onto the CI/CD stages (lint, test, build) and to stay clearly distinct</w:t>
+        <w:t xml:space="preserve">. This layout maps</w:t>
+      </w:r>
+      <w:r>
+        <w:t xml:space="preserve"> </w:t>
+      </w:r>
+      <w:r>
+        <w:t xml:space="preserve">1:1 onto the CI/CD stages (lint, test, build) and stays clearly distinct</w:t>
       </w:r>
       <w:r>
         <w:t xml:space="preserve"> </w:t>
@@ -278,7 +249,7 @@
       <w:r>
         <w:drawing>
           <wp:inline>
-            <wp:extent cx="5334000" cy="3162300"/>
+            <wp:extent cx="5334000" cy="2862212"/>
             <wp:effectExtent b="0" l="0" r="0" t="0"/>
             <wp:docPr descr="Architecture" title="" id="10" name="Picture"/>
             <a:graphic>
@@ -299,7 +270,7 @@
                   <pic:spPr bwMode="auto">
                     <a:xfrm>
                       <a:off x="0" y="0"/>
-                      <a:ext cx="5334000" cy="3162300"/>
+                      <a:ext cx="5334000" cy="2862212"/>
                     </a:xfrm>
                     <a:prstGeom prst="rect">
                       <a:avLst/>
@@ -620,7 +591,7 @@
         <w:pStyle w:val="FirstParagraph"/>
       </w:pPr>
       <w:r>
-        <w:t xml:space="preserve">Run the test suite before touching anything else —</w:t>
+        <w:t xml:space="preserve">Run the test suite before touching anything else with</w:t>
       </w:r>
       <w:r>
         <w:t xml:space="preserve"> </w:t>
@@ -632,16 +603,13 @@
         <w:t xml:space="preserve">pytest</w:t>
       </w:r>
       <w:r>
-        <w:t xml:space="preserve"> </w:t>
-      </w:r>
-      <w:r>
-        <w:t xml:space="preserve">— to confirm</w:t>
-      </w:r>
-      <w:r>
-        <w:t xml:space="preserve"> </w:t>
-      </w:r>
-      <w:r>
-        <w:t xml:space="preserve">the data pipeline and packaging logic behave as committed;</w:t>
+        <w:t xml:space="preserve">, to confirm</w:t>
+      </w:r>
+      <w:r>
+        <w:t xml:space="preserve"> </w:t>
+      </w:r>
+      <w:r>
+        <w:t xml:space="preserve">the data pipeline and packaging logic behave as committed.</w:t>
       </w:r>
       <w:r>
         <w:t xml:space="preserve"> </w:t>
@@ -668,7 +636,7 @@
         <w:t xml:space="preserve"> </w:t>
       </w:r>
       <w:r>
-        <w:t xml:space="preserve">and each closes with the trade-offs actually made rather than an idealized</w:t>
+        <w:t xml:space="preserve">and each closes with the trade-offs actually made, not an idealized</w:t>
       </w:r>
       <w:r>
         <w:t xml:space="preserve"> </w:t>
@@ -713,31 +681,31 @@
         <w:t xml:space="preserve"> </w:t>
       </w:r>
       <w:r>
-        <w:t xml:space="preserve">(id=45) rather than a</w:t>
-      </w:r>
-      <w:r>
-        <w:t xml:space="preserve"> </w:t>
-      </w:r>
-      <w:r>
-        <w:t xml:space="preserve">manual CSV download, which was verified to return exactly 303 rows × 13</w:t>
-      </w:r>
-      <w:r>
-        <w:t xml:space="preserve"> </w:t>
-      </w:r>
-      <w:r>
-        <w:t xml:space="preserve">features and matches the assignment’s dataset link — the alternative</w:t>
-      </w:r>
-      <w:r>
-        <w:t xml:space="preserve"> </w:t>
-      </w:r>
-      <w:r>
-        <w:t xml:space="preserve">combined four-site dataset (~920 rows) was rejected as not being what id=45</w:t>
-      </w:r>
-      <w:r>
-        <w:t xml:space="preserve"> </w:t>
-      </w:r>
-      <w:r>
-        <w:t xml:space="preserve">actually serves. The raw multi-class target</w:t>
+        <w:t xml:space="preserve">(id=45) instead of a</w:t>
+      </w:r>
+      <w:r>
+        <w:t xml:space="preserve"> </w:t>
+      </w:r>
+      <w:r>
+        <w:t xml:space="preserve">manual CSV download. This was verified to return exactly 303 rows × 13</w:t>
+      </w:r>
+      <w:r>
+        <w:t xml:space="preserve"> </w:t>
+      </w:r>
+      <w:r>
+        <w:t xml:space="preserve">features and matches the assignment’s dataset link; the alternative</w:t>
+      </w:r>
+      <w:r>
+        <w:t xml:space="preserve"> </w:t>
+      </w:r>
+      <w:r>
+        <w:t xml:space="preserve">combined four-site dataset (~920 rows) was rejected because it is not what</w:t>
+      </w:r>
+      <w:r>
+        <w:t xml:space="preserve"> </w:t>
+      </w:r>
+      <w:r>
+        <w:t xml:space="preserve">id=45 actually serves. The raw multi-class target</w:t>
       </w:r>
       <w:r>
         <w:t xml:space="preserve"> </w:t>
@@ -814,19 +782,19 @@
         <w:t xml:space="preserve"> </w:t>
       </w:r>
       <w:r>
-        <w:t xml:space="preserve">values were dropped rather than imputed, since both are categorical</w:t>
-      </w:r>
-      <w:r>
-        <w:t xml:space="preserve"> </w:t>
-      </w:r>
-      <w:r>
-        <w:t xml:space="preserve">clinical measurements (vessel count, thalassemia type) where imputation</w:t>
-      </w:r>
-      <w:r>
-        <w:t xml:space="preserve"> </w:t>
-      </w:r>
-      <w:r>
-        <w:t xml:space="preserve">would invent clinical facts, and dropping sidesteps any train/test leakage</w:t>
+        <w:t xml:space="preserve">values were dropped instead of imputed. Both are categorical clinical</w:t>
+      </w:r>
+      <w:r>
+        <w:t xml:space="preserve"> </w:t>
+      </w:r>
+      <w:r>
+        <w:t xml:space="preserve">measurements (vessel count, thalassemia type), and imputing them would</w:t>
+      </w:r>
+      <w:r>
+        <w:t xml:space="preserve"> </w:t>
+      </w:r>
+      <w:r>
+        <w:t xml:space="preserve">invent clinical facts; dropping also sidesteps any train/test leakage</w:t>
       </w:r>
       <w:r>
         <w:t xml:space="preserve"> </w:t>
@@ -838,7 +806,7 @@
         <w:t xml:space="preserve"> </w:t>
       </w:r>
       <w:r>
-        <w:t xml:space="preserve">no-disease vs 137 disease cases — a mild imbalance, handled downstream by</w:t>
+        <w:t xml:space="preserve">no-disease vs 137 disease cases, a mild imbalance handled downstream by</w:t>
       </w:r>
       <w:r>
         <w:t xml:space="preserve"> </w:t>
@@ -989,13 +957,13 @@
         <w:pStyle w:val="BodyText"/>
       </w:pPr>
       <w:r>
-        <w:t xml:space="preserve">Exploratory analysis surfaced several clinically sensible patterns: disease</w:t>
-      </w:r>
-      <w:r>
-        <w:t xml:space="preserve"> </w:t>
-      </w:r>
-      <w:r>
-        <w:t xml:space="preserve">prevalence is markedly higher in males (56%) than females (26%); patients</w:t>
+        <w:t xml:space="preserve">Exploratory analysis surfaced several clinically sensible patterns. Disease</w:t>
+      </w:r>
+      <w:r>
+        <w:t xml:space="preserve"> </w:t>
+      </w:r>
+      <w:r>
+        <w:t xml:space="preserve">prevalence is higher in males (56%) than females (26%). Patients</w:t>
       </w:r>
       <w:r>
         <w:t xml:space="preserve"> </w:t>
@@ -1007,13 +975,13 @@
         <w:t xml:space="preserve"> </w:t>
       </w:r>
       <w:r>
-        <w:t xml:space="preserve">show an 87% prevalence, the strongest subgroup signal in the data; and</w:t>
-      </w:r>
-      <w:r>
-        <w:t xml:space="preserve"> </w:t>
-      </w:r>
-      <w:r>
-        <w:t xml:space="preserve">among continuous features, ST-depression (</w:t>
+        <w:t xml:space="preserve">show an 87% prevalence, the strongest subgroup signal in the data. Among</w:t>
+      </w:r>
+      <w:r>
+        <w:t xml:space="preserve"> </w:t>
+      </w:r>
+      <w:r>
+        <w:t xml:space="preserve">continuous features, ST-depression (</w:t>
       </w:r>
       <w:r>
         <w:rPr>
@@ -1057,7 +1025,7 @@
         <w:pStyle w:val="BodyText"/>
       </w:pPr>
       <w:r>
-        <w:t xml:space="preserve">The figures themselves use a fixed two-class palette (no-disease blue</w:t>
+        <w:t xml:space="preserve">The figures themselves use a fixed two-class palette: no-disease blue</w:t>
       </w:r>
       <w:r>
         <w:t xml:space="preserve"> </w:t>
@@ -1087,31 +1055,31 @@
         <w:t xml:space="preserve"> </w:t>
       </w:r>
       <w:r>
-        <w:t xml:space="preserve">correlation heatmap, and a single-hue blue ramp for prevalence heatmaps),</w:t>
-      </w:r>
-      <w:r>
-        <w:t xml:space="preserve"> </w:t>
-      </w:r>
-      <w:r>
-        <w:t xml:space="preserve">validated colorblind-safe with a worst-pair contrast well above the</w:t>
-      </w:r>
-      <w:r>
-        <w:t xml:space="preserve"> </w:t>
-      </w:r>
-      <w:r>
-        <w:t xml:space="preserve">accessibility threshold, rather than left to seaborn’s defaults — this</w:t>
-      </w:r>
-      <w:r>
-        <w:t xml:space="preserve"> </w:t>
-      </w:r>
-      <w:r>
-        <w:t xml:space="preserve">keeps every chart in the notebook and the report visually consistent and</w:t>
-      </w:r>
-      <w:r>
-        <w:t xml:space="preserve"> </w:t>
-      </w:r>
-      <w:r>
-        <w:t xml:space="preserve">legible.</w:t>
+        <w:t xml:space="preserve">correlation heatmap, and a single-hue blue ramp for prevalence heatmaps.</w:t>
+      </w:r>
+      <w:r>
+        <w:t xml:space="preserve"> </w:t>
+      </w:r>
+      <w:r>
+        <w:t xml:space="preserve">The palette was validated colorblind-safe with a worst-pair contrast well</w:t>
+      </w:r>
+      <w:r>
+        <w:t xml:space="preserve"> </w:t>
+      </w:r>
+      <w:r>
+        <w:t xml:space="preserve">above the accessibility threshold, instead of leaving the choice to</w:t>
+      </w:r>
+      <w:r>
+        <w:t xml:space="preserve"> </w:t>
+      </w:r>
+      <w:r>
+        <w:t xml:space="preserve">seaborn’s defaults. This keeps every chart in the notebook and the report</w:t>
+      </w:r>
+      <w:r>
+        <w:t xml:space="preserve"> </w:t>
+      </w:r>
+      <w:r>
+        <w:t xml:space="preserve">visually consistent and legible.</w:t>
       </w:r>
     </w:p>
     <w:bookmarkEnd w:id="22"/>
@@ -1129,7 +1097,43 @@
         <w:pStyle w:val="FirstParagraph"/>
       </w:pPr>
       <w:r>
-        <w:t xml:space="preserve">Three clinically motivated derived features — rate-pressure product</w:t>
+        <w:t xml:space="preserve">Three clinically motivated derived features were added inside the</w:t>
+      </w:r>
+      <w:r>
+        <w:t xml:space="preserve"> </w:t>
+      </w:r>
+      <w:r>
+        <w:t xml:space="preserve">scikit-learn</w:t>
+      </w:r>
+      <w:r>
+        <w:t xml:space="preserve"> </w:t>
+      </w:r>
+      <w:r>
+        <w:rPr>
+          <w:rStyle w:val="VerbatimChar"/>
+        </w:rPr>
+        <w:t xml:space="preserve">Pipeline</w:t>
+      </w:r>
+      <w:r>
+        <w:t xml:space="preserve"> </w:t>
+      </w:r>
+      <w:r>
+        <w:t xml:space="preserve">itself, not pre-computed into the cleaned CSV: the</w:t>
+      </w:r>
+      <w:r>
+        <w:t xml:space="preserve"> </w:t>
+      </w:r>
+      <w:r>
+        <w:t xml:space="preserve">rate-pressure product (</w:t>
+      </w:r>
+      <w:r>
+        <w:rPr>
+          <w:rStyle w:val="VerbatimChar"/>
+        </w:rPr>
+        <w:t xml:space="preserve">trestbps × thalach</w:t>
+      </w:r>
+      <w:r>
+        <w:t xml:space="preserve">), heart-rate reserve</w:t>
       </w:r>
       <w:r>
         <w:t xml:space="preserve"> </w:t>
@@ -1141,15 +1145,6 @@
         <w:rPr>
           <w:rStyle w:val="VerbatimChar"/>
         </w:rPr>
-        <w:t xml:space="preserve">trestbps × thalach</w:t>
-      </w:r>
-      <w:r>
-        <w:t xml:space="preserve">), heart-rate reserve (</w:t>
-      </w:r>
-      <w:r>
-        <w:rPr>
-          <w:rStyle w:val="VerbatimChar"/>
-        </w:rPr>
         <w:t xml:space="preserve">220 − age − thalach</w:t>
       </w:r>
       <w:r>
@@ -1168,40 +1163,25 @@
         <w:t xml:space="preserve"> </w:t>
       </w:r>
       <w:r>
-        <w:t xml:space="preserve">interaction — were added inside the scikit-learn</w:t>
-      </w:r>
-      <w:r>
-        <w:t xml:space="preserve"> </w:t>
-      </w:r>
-      <w:r>
-        <w:rPr>
-          <w:rStyle w:val="VerbatimChar"/>
-        </w:rPr>
-        <w:t xml:space="preserve">Pipeline</w:t>
-      </w:r>
-      <w:r>
-        <w:t xml:space="preserve"> </w:t>
-      </w:r>
-      <w:r>
-        <w:t xml:space="preserve">itself (not pre-computed into the cleaned CSV), which guarantees</w:t>
-      </w:r>
-      <w:r>
-        <w:t xml:space="preserve"> </w:t>
-      </w:r>
-      <w:r>
-        <w:t xml:space="preserve">an identical transformation at training and inference time. A fourth</w:t>
-      </w:r>
-      <w:r>
-        <w:t xml:space="preserve"> </w:t>
-      </w:r>
-      <w:r>
-        <w:t xml:space="preserve">candidate, pulse pressure, was rejected outright: the dataset only carries</w:t>
-      </w:r>
-      <w:r>
-        <w:t xml:space="preserve"> </w:t>
-      </w:r>
-      <w:r>
-        <w:t xml:space="preserve">systolic blood pressure (</w:t>
+        <w:t xml:space="preserve">interaction. Computing</w:t>
+      </w:r>
+      <w:r>
+        <w:t xml:space="preserve"> </w:t>
+      </w:r>
+      <w:r>
+        <w:t xml:space="preserve">them inside the pipeline guarantees an identical transformation at training</w:t>
+      </w:r>
+      <w:r>
+        <w:t xml:space="preserve"> </w:t>
+      </w:r>
+      <w:r>
+        <w:t xml:space="preserve">and inference time. A fourth candidate, pulse pressure, was rejected</w:t>
+      </w:r>
+      <w:r>
+        <w:t xml:space="preserve"> </w:t>
+      </w:r>
+      <w:r>
+        <w:t xml:space="preserve">outright: the dataset only carries systolic blood pressure (</w:t>
       </w:r>
       <w:r>
         <w:rPr>
@@ -1210,13 +1190,13 @@
         <w:t xml:space="preserve">trestbps</w:t>
       </w:r>
       <w:r>
-        <w:t xml:space="preserve">), with no diastolic column to pair it</w:t>
-      </w:r>
-      <w:r>
-        <w:t xml:space="preserve"> </w:t>
-      </w:r>
-      <w:r>
-        <w:t xml:space="preserve">with.</w:t>
+        <w:t xml:space="preserve">),</w:t>
+      </w:r>
+      <w:r>
+        <w:t xml:space="preserve"> </w:t>
+      </w:r>
+      <w:r>
+        <w:t xml:space="preserve">with no diastolic column to pair it with.</w:t>
       </w:r>
     </w:p>
     <w:p>
@@ -1260,7 +1240,7 @@
         <w:t xml:space="preserve"> </w:t>
       </w:r>
       <w:r>
-        <w:t xml:space="preserve">and the three derived features when enabled;</w:t>
+        <w:t xml:space="preserve">and the three derived features when enabled.</w:t>
       </w:r>
       <w:r>
         <w:t xml:space="preserve"> </w:t>
@@ -1290,7 +1270,7 @@
         <w:t xml:space="preserve"> </w:t>
       </w:r>
       <w:r>
-        <w:t xml:space="preserve">to the genuinely nominal categoricals</w:t>
+        <w:t xml:space="preserve">handles the nominal categoricals</w:t>
       </w:r>
       <w:r>
         <w:t xml:space="preserve"> </w:t>
@@ -1338,7 +1318,7 @@
         <w:t xml:space="preserve">thal</w:t>
       </w:r>
       <w:r>
-        <w:t xml:space="preserve">; and passthrough for the binary features</w:t>
+        <w:t xml:space="preserve">, and the binary features</w:t>
       </w:r>
       <w:r>
         <w:t xml:space="preserve"> </w:t>
@@ -1374,13 +1354,16 @@
         <w:t xml:space="preserve">exang</w:t>
       </w:r>
       <w:r>
-        <w:t xml:space="preserve">. This keeps dimensionality low on a 297-row dataset while</w:t>
-      </w:r>
-      <w:r>
-        <w:t xml:space="preserve"> </w:t>
-      </w:r>
-      <w:r>
-        <w:t xml:space="preserve">protecting inference-time inputs from unseen category codes.</w:t>
+        <w:t xml:space="preserve"> </w:t>
+      </w:r>
+      <w:r>
+        <w:t xml:space="preserve">pass through unchanged. This keeps dimensionality low on a 297-row dataset</w:t>
+      </w:r>
+      <w:r>
+        <w:t xml:space="preserve"> </w:t>
+      </w:r>
+      <w:r>
+        <w:t xml:space="preserve">while protecting inference-time inputs from unseen category codes.</w:t>
       </w:r>
     </w:p>
     <w:p>
@@ -1388,7 +1371,7 @@
         <w:pStyle w:val="BodyText"/>
       </w:pPr>
       <w:r>
-        <w:t xml:space="preserve">Three model families — Logistic Regression, Random Forest, and XGBoost —</w:t>
+        <w:t xml:space="preserve">Three model families, Logistic Regression, Random Forest, and XGBoost,</w:t>
       </w:r>
       <w:r>
         <w:t xml:space="preserve"> </w:t>
@@ -1433,7 +1416,7 @@
         <w:t xml:space="preserve"> </w:t>
       </w:r>
       <w:r>
-        <w:t xml:space="preserve">split with</w:t>
+        <w:t xml:space="preserve">split. A</w:t>
       </w:r>
       <w:r>
         <w:t xml:space="preserve"> </w:t>
@@ -1448,35 +1431,37 @@
         <w:t xml:space="preserve"> </w:t>
       </w:r>
       <w:r>
-        <w:t xml:space="preserve">(a seed derived from the student ID) shared</w:t>
-      </w:r>
-      <w:r>
-        <w:t xml:space="preserve"> </w:t>
-      </w:r>
-      <w:r>
-        <w:t xml:space="preserve">across all runs so that differences are attributable to model/features</w:t>
-      </w:r>
-      <w:r>
-        <w:t xml:space="preserve"> </w:t>
-      </w:r>
-      <w:r>
-        <w:t xml:space="preserve">alone; the test split is touched exactly once per run to avoid selection</w:t>
-      </w:r>
-      <w:r>
-        <w:t xml:space="preserve"> </w:t>
-      </w:r>
-      <w:r>
-        <w:t xml:space="preserve">leakage. Metrics logged include CV mean±std ROC-AUC plus held-out accuracy,</w:t>
-      </w:r>
-      <w:r>
-        <w:t xml:space="preserve"> </w:t>
-      </w:r>
-      <w:r>
-        <w:t xml:space="preserve">precision, recall, F1, and ROC-AUC.</w:t>
-      </w:r>
-      <w:r>
-        <w:t xml:space="preserve"> </w:t>
-      </w:r>
+        <w:t xml:space="preserve">(a seed derived from the student ID) was</w:t>
+      </w:r>
+      <w:r>
+        <w:t xml:space="preserve"> </w:t>
+      </w:r>
+      <w:r>
+        <w:t xml:space="preserve">shared across all runs so that differences are attributable to model and</w:t>
+      </w:r>
+      <w:r>
+        <w:t xml:space="preserve"> </w:t>
+      </w:r>
+      <w:r>
+        <w:t xml:space="preserve">features alone; the test split is touched exactly once per run to avoid</w:t>
+      </w:r>
+      <w:r>
+        <w:t xml:space="preserve"> </w:t>
+      </w:r>
+      <w:r>
+        <w:t xml:space="preserve">selection leakage. Metrics logged include CV mean±std ROC-AUC plus</w:t>
+      </w:r>
+      <w:r>
+        <w:t xml:space="preserve"> </w:t>
+      </w:r>
+      <w:r>
+        <w:t xml:space="preserve">held-out accuracy, precision, recall, F1, and ROC-AUC.</w:t>
+      </w:r>
+    </w:p>
+    <w:p>
+      <w:pPr>
+        <w:pStyle w:val="BodyText"/>
+      </w:pPr>
       <w:r>
         <w:rPr>
           <w:rStyle w:val="VerbatimChar"/>
@@ -1502,19 +1487,25 @@
         <w:t xml:space="preserve"> </w:t>
       </w:r>
       <w:r>
-        <w:t xml:space="preserve">because the six grids are small enough to enumerate</w:t>
-      </w:r>
-      <w:r>
-        <w:t xml:space="preserve"> </w:t>
-      </w:r>
-      <w:r>
-        <w:t xml:space="preserve">exhaustively; nested cross-validation was judged more rigorous than</w:t>
-      </w:r>
-      <w:r>
-        <w:t xml:space="preserve"> </w:t>
-      </w:r>
-      <w:r>
-        <w:t xml:space="preserve">necessary for 297 rows and harder to present clearly; and</w:t>
+        <w:t xml:space="preserve">because the six</w:t>
+      </w:r>
+      <w:r>
+        <w:t xml:space="preserve"> </w:t>
+      </w:r>
+      <w:r>
+        <w:t xml:space="preserve">grids are small enough to enumerate exhaustively. Nested cross-validation</w:t>
+      </w:r>
+      <w:r>
+        <w:t xml:space="preserve"> </w:t>
+      </w:r>
+      <w:r>
+        <w:t xml:space="preserve">was judged more rigorous than necessary for 297 rows and harder to present</w:t>
+      </w:r>
+      <w:r>
+        <w:t xml:space="preserve"> </w:t>
+      </w:r>
+      <w:r>
+        <w:t xml:space="preserve">clearly. The seed</w:t>
       </w:r>
       <w:r>
         <w:t xml:space="preserve"> </w:t>
@@ -1529,25 +1520,25 @@
         <w:t xml:space="preserve"> </w:t>
       </w:r>
       <w:r>
-        <w:t xml:space="preserve">was chosen deliberately over the tutorial-universal seed 42 for</w:t>
-      </w:r>
-      <w:r>
-        <w:t xml:space="preserve"> </w:t>
-      </w:r>
-      <w:r>
-        <w:t xml:space="preserve">originality, with no effect on the validity of the comparison since it is</w:t>
-      </w:r>
-      <w:r>
-        <w:t xml:space="preserve"> </w:t>
-      </w:r>
-      <w:r>
-        <w:t xml:space="preserve">applied identically to every run. A third model family, XGBoost, was added</w:t>
-      </w:r>
-      <w:r>
-        <w:t xml:space="preserve"> </w:t>
-      </w:r>
-      <w:r>
-        <w:t xml:space="preserve">beyond the assignment’s two-model minimum specifically to make this</w:t>
+        <w:t xml:space="preserve">was chosen over the tutorial-universal</w:t>
+      </w:r>
+      <w:r>
+        <w:t xml:space="preserve"> </w:t>
+      </w:r>
+      <w:r>
+        <w:t xml:space="preserve">42 for originality; this has no effect on the validity of the comparison</w:t>
+      </w:r>
+      <w:r>
+        <w:t xml:space="preserve"> </w:t>
+      </w:r>
+      <w:r>
+        <w:t xml:space="preserve">since it is applied identically to every run. A third model family,</w:t>
+      </w:r>
+      <w:r>
+        <w:t xml:space="preserve"> </w:t>
+      </w:r>
+      <w:r>
+        <w:t xml:space="preserve">XGBoost, was added beyond the assignment’s two-model minimum to make this</w:t>
       </w:r>
       <w:r>
         <w:t xml:space="preserve"> </w:t>
@@ -2277,43 +2268,37 @@
         <w:t xml:space="preserve"> </w:t>
       </w:r>
       <w:r>
-        <w:t xml:space="preserve">set: test ROC-AUC 0.8817, CV 0.9195 ± 0.0123. The honest picture, however,</w:t>
-      </w:r>
-      <w:r>
-        <w:t xml:space="preserve"> </w:t>
-      </w:r>
-      <w:r>
-        <w:t xml:space="preserve">is mixed rather than uniformly positive: the clinical features helped</w:t>
-      </w:r>
-      <w:r>
-        <w:t xml:space="preserve"> </w:t>
-      </w:r>
-      <w:r>
-        <w:t xml:space="preserve">Logistic Regression (0.8817 vs 0.8761 raw) but slightly hurt Random Forest</w:t>
-      </w:r>
-      <w:r>
-        <w:t xml:space="preserve"> </w:t>
-      </w:r>
-      <w:r>
-        <w:t xml:space="preserve">(0.8493 vs 0.8583 raw) — tree ensembles can already capture the</w:t>
-      </w:r>
-      <w:r>
-        <w:t xml:space="preserve"> </w:t>
-      </w:r>
-      <w:r>
-        <w:t xml:space="preserve">interactions the derived features encode explicitly, so handing them a</w:t>
-      </w:r>
-      <w:r>
-        <w:t xml:space="preserve"> </w:t>
-      </w:r>
-      <w:r>
-        <w:t xml:space="preserve">redundant, correlated copy of that signal did not pay off, and in RF’s case</w:t>
-      </w:r>
-      <w:r>
-        <w:t xml:space="preserve"> </w:t>
-      </w:r>
-      <w:r>
-        <w:t xml:space="preserve">cost a little.</w:t>
+        <w:t xml:space="preserve">set: test ROC-AUC 0.8817, CV 0.9195 ± 0.0123. The honest picture is mixed,</w:t>
+      </w:r>
+      <w:r>
+        <w:t xml:space="preserve"> </w:t>
+      </w:r>
+      <w:r>
+        <w:t xml:space="preserve">not uniformly positive. The clinical features helped Logistic Regression</w:t>
+      </w:r>
+      <w:r>
+        <w:t xml:space="preserve"> </w:t>
+      </w:r>
+      <w:r>
+        <w:t xml:space="preserve">(0.8817 vs 0.8761 raw) but slightly hurt Random Forest (0.8493 vs 0.8583</w:t>
+      </w:r>
+      <w:r>
+        <w:t xml:space="preserve"> </w:t>
+      </w:r>
+      <w:r>
+        <w:t xml:space="preserve">raw). Tree ensembles can already capture the interactions the derived</w:t>
+      </w:r>
+      <w:r>
+        <w:t xml:space="preserve"> </w:t>
+      </w:r>
+      <w:r>
+        <w:t xml:space="preserve">features encode, so handing them a redundant, correlated copy of that</w:t>
+      </w:r>
+      <w:r>
+        <w:t xml:space="preserve"> </w:t>
+      </w:r>
+      <w:r>
+        <w:t xml:space="preserve">signal did not pay off, and in Random Forest’s case cost a little.</w:t>
       </w:r>
     </w:p>
     <w:bookmarkEnd w:id="26"/>
@@ -2512,13 +2497,13 @@
         <w:t xml:space="preserve"> </w:t>
       </w:r>
       <w:r>
-        <w:t xml:space="preserve">pinned MLflow 3.14.0 rather than the version the original brief assumed.</w:t>
-      </w:r>
-      <w:r>
-        <w:t xml:space="preserve"> </w:t>
-      </w:r>
-      <w:r>
-        <w:t xml:space="preserve">MLflow 3.x now raises on any</w:t>
+        <w:t xml:space="preserve">pinned MLflow 3.14.0, which differs from the version the original brief</w:t>
+      </w:r>
+      <w:r>
+        <w:t xml:space="preserve"> </w:t>
+      </w:r>
+      <w:r>
+        <w:t xml:space="preserve">assumed. MLflow 3.x now raises on any</w:t>
       </w:r>
       <w:r>
         <w:t xml:space="preserve"> </w:t>
@@ -2539,7 +2524,13 @@
         <w:t xml:space="preserve">./mlruns</w:t>
       </w:r>
       <w:r>
-        <w:t xml:space="preserve">-only tracking URI unless</w:t>
+        <w:t xml:space="preserve">-only tracking</w:t>
+      </w:r>
+      <w:r>
+        <w:t xml:space="preserve"> </w:t>
+      </w:r>
+      <w:r>
+        <w:t xml:space="preserve">URI unless</w:t>
       </w:r>
       <w:r>
         <w:t xml:space="preserve"> </w:t>
@@ -2554,13 +2545,13 @@
         <w:t xml:space="preserve"> </w:t>
       </w:r>
       <w:r>
-        <w:t xml:space="preserve">is explicitly set, since the pure file store</w:t>
-      </w:r>
-      <w:r>
-        <w:t xml:space="preserve"> </w:t>
-      </w:r>
-      <w:r>
-        <w:t xml:space="preserve">is in maintenance mode — the fix was to point the tracking URI at</w:t>
+        <w:t xml:space="preserve">is set, since the pure file</w:t>
+      </w:r>
+      <w:r>
+        <w:t xml:space="preserve"> </w:t>
+      </w:r>
+      <w:r>
+        <w:t xml:space="preserve">store is in maintenance mode. The fix was to point the tracking URI at</w:t>
       </w:r>
       <w:r>
         <w:t xml:space="preserve"> </w:t>
@@ -2602,7 +2593,15 @@
         <w:t xml:space="preserve"> </w:t>
       </w:r>
       <w:r>
-        <w:t xml:space="preserve">runs’ params and metrics. Separately,</w:t>
+        <w:t xml:space="preserve">runs’ params and metrics.</w:t>
+      </w:r>
+    </w:p>
+    <w:p>
+      <w:pPr>
+        <w:pStyle w:val="BodyText"/>
+      </w:pPr>
+      <w:r>
+        <w:t xml:space="preserve">Separately,</w:t>
       </w:r>
       <w:r>
         <w:t xml:space="preserve"> </w:t>
@@ -2617,13 +2616,13 @@
         <w:t xml:space="preserve"> </w:t>
       </w:r>
       <w:r>
-        <w:t xml:space="preserve">in 3.x</w:t>
-      </w:r>
-      <w:r>
-        <w:t xml:space="preserve"> </w:t>
-      </w:r>
-      <w:r>
-        <w:t xml:space="preserve">now records the model as a decoupled</w:t>
+        <w:t xml:space="preserve">in 3.x now records the model as a</w:t>
+      </w:r>
+      <w:r>
+        <w:t xml:space="preserve"> </w:t>
+      </w:r>
+      <w:r>
+        <w:t xml:space="preserve">decoupled</w:t>
       </w:r>
       <w:r>
         <w:t xml:space="preserve"> </w:t>
@@ -2635,13 +2634,13 @@
         <w:t xml:space="preserve"> </w:t>
       </w:r>
       <w:r>
-        <w:t xml:space="preserve">that never appears</w:t>
-      </w:r>
-      <w:r>
-        <w:t xml:space="preserve"> </w:t>
-      </w:r>
-      <w:r>
-        <w:t xml:space="preserve">under the run’s own artifact tree, and the model pipeline’s</w:t>
+        <w:t xml:space="preserve">that never appears under the run’s own artifact</w:t>
+      </w:r>
+      <w:r>
+        <w:t xml:space="preserve"> </w:t>
+      </w:r>
+      <w:r>
+        <w:t xml:space="preserve">tree, and the model pipeline’s</w:t>
       </w:r>
       <w:r>
         <w:t xml:space="preserve"> </w:t>
@@ -2656,13 +2655,13 @@
         <w:t xml:space="preserve"> </w:t>
       </w:r>
       <w:r>
-        <w:t xml:space="preserve">(wrapping the first-party clinical-feature function)</w:t>
-      </w:r>
-      <w:r>
-        <w:t xml:space="preserve"> </w:t>
-      </w:r>
-      <w:r>
-        <w:t xml:space="preserve">is rejected by the new default</w:t>
+        <w:t xml:space="preserve">(wrapping the</w:t>
+      </w:r>
+      <w:r>
+        <w:t xml:space="preserve"> </w:t>
+      </w:r>
+      <w:r>
+        <w:t xml:space="preserve">first-party clinical-feature function) is rejected by the new default</w:t>
       </w:r>
       <w:r>
         <w:t xml:space="preserve"> </w:t>
@@ -2683,25 +2682,19 @@
         <w:t xml:space="preserve"> </w:t>
       </w:r>
       <w:r>
-        <w:t xml:space="preserve">“untrusted</w:t>
-      </w:r>
-      <w:r>
-        <w:t xml:space="preserve"> </w:t>
-      </w:r>
-      <w:r>
-        <w:t xml:space="preserve">type.”</w:t>
-      </w:r>
-      <w:r>
-        <w:t xml:space="preserve"> </w:t>
-      </w:r>
-      <w:r>
-        <w:t xml:space="preserve">Both were resolved together by saving the model to a temp directory</w:t>
-      </w:r>
-      <w:r>
-        <w:t xml:space="preserve"> </w:t>
-      </w:r>
-      <w:r>
-        <w:t xml:space="preserve">with</w:t>
+        <w:t xml:space="preserve">“untrusted type.”</w:t>
+      </w:r>
+      <w:r>
+        <w:t xml:space="preserve"> </w:t>
+      </w:r>
+      <w:r>
+        <w:t xml:space="preserve">Both issues were resolved</w:t>
+      </w:r>
+      <w:r>
+        <w:t xml:space="preserve"> </w:t>
+      </w:r>
+      <w:r>
+        <w:t xml:space="preserve">together by saving the model to a temp directory with</w:t>
       </w:r>
       <w:r>
         <w:t xml:space="preserve"> </w:t>
@@ -2716,13 +2709,13 @@
         <w:t xml:space="preserve"> </w:t>
       </w:r>
       <w:r>
-        <w:t xml:space="preserve">and uploading it as a run</w:t>
-      </w:r>
-      <w:r>
-        <w:t xml:space="preserve"> </w:t>
-      </w:r>
-      <w:r>
-        <w:t xml:space="preserve">artifact explicitly — restoring the classic run-scoped</w:t>
+        <w:t xml:space="preserve">and uploading it as a run artifact</w:t>
+      </w:r>
+      <w:r>
+        <w:t xml:space="preserve"> </w:t>
+      </w:r>
+      <w:r>
+        <w:t xml:space="preserve">directly. This restores the classic run-scoped</w:t>
       </w:r>
       <w:r>
         <w:t xml:space="preserve"> </w:t>
@@ -2737,19 +2730,19 @@
         <w:t xml:space="preserve"> </w:t>
       </w:r>
       <w:r>
-        <w:t xml:space="preserve">folder and</w:t>
-      </w:r>
-      <w:r>
-        <w:t xml:space="preserve"> </w:t>
-      </w:r>
-      <w:r>
-        <w:t xml:space="preserve">keeping the custom transformer loadable, verified end-to-end by reloading</w:t>
-      </w:r>
-      <w:r>
-        <w:t xml:space="preserve"> </w:t>
-      </w:r>
-      <w:r>
-        <w:t xml:space="preserve">each run’s model with</w:t>
+        <w:t xml:space="preserve">folder and keeps</w:t>
+      </w:r>
+      <w:r>
+        <w:t xml:space="preserve"> </w:t>
+      </w:r>
+      <w:r>
+        <w:t xml:space="preserve">the custom transformer loadable, verified end-to-end by reloading each</w:t>
+      </w:r>
+      <w:r>
+        <w:t xml:space="preserve"> </w:t>
+      </w:r>
+      <w:r>
+        <w:t xml:space="preserve">run’s model with</w:t>
       </w:r>
       <w:r>
         <w:t xml:space="preserve"> </w:t>
@@ -2794,13 +2787,13 @@
         <w:pStyle w:val="FirstParagraph"/>
       </w:pPr>
       <w:r>
-        <w:t xml:space="preserve">The best run — selected deterministically as the argmax of test ROC-AUC</w:t>
-      </w:r>
-      <w:r>
-        <w:t xml:space="preserve"> </w:t>
-      </w:r>
-      <w:r>
-        <w:t xml:space="preserve">over the full-grid runs, which the fixed seed makes reproducible — is</w:t>
+        <w:t xml:space="preserve">The best run is selected deterministically as the argmax of test ROC-AUC</w:t>
+      </w:r>
+      <w:r>
+        <w:t xml:space="preserve"> </w:t>
+      </w:r>
+      <w:r>
+        <w:t xml:space="preserve">over the full-grid runs, which the fixed seed makes reproducible. It is</w:t>
       </w:r>
       <w:r>
         <w:t xml:space="preserve"> </w:t>
@@ -2919,13 +2912,13 @@
         <w:pStyle w:val="BodyText"/>
       </w:pPr>
       <w:r>
-        <w:t xml:space="preserve">Reproducibility was also treated as something to verify, not assume: adding</w:t>
-      </w:r>
-      <w:r>
-        <w:t xml:space="preserve"> </w:t>
-      </w:r>
-      <w:r>
-        <w:t xml:space="preserve">scikit-learn, xgboost, mlflow, and joblib to</w:t>
+        <w:t xml:space="preserve">Reproducibility was also treated as something to verify, not assume.</w:t>
+      </w:r>
+      <w:r>
+        <w:t xml:space="preserve"> </w:t>
+      </w:r>
+      <w:r>
+        <w:t xml:space="preserve">Adding scikit-learn, xgboost, mlflow, and joblib to</w:t>
       </w:r>
       <w:r>
         <w:t xml:space="preserve"> </w:t>
@@ -2979,13 +2972,13 @@
         <w:t xml:space="preserve">Requires-Dist: pandas&lt;3</w:t>
       </w:r>
       <w:r>
-        <w:t xml:space="preserve">. Rather than leave that conflict implicit, it was</w:t>
-      </w:r>
-      <w:r>
-        <w:t xml:space="preserve"> </w:t>
-      </w:r>
-      <w:r>
-        <w:t xml:space="preserve">confirmed directly (</w:t>
+        <w:t xml:space="preserve">. That conflict was confirmed directly</w:t>
+      </w:r>
+      <w:r>
+        <w:t xml:space="preserve"> </w:t>
+      </w:r>
+      <w:r>
+        <w:t xml:space="preserve">(</w:t>
       </w:r>
       <w:r>
         <w:rPr>
@@ -3009,19 +3002,19 @@
         <w:t xml:space="preserve">ResolutionImpossible</w:t>
       </w:r>
       <w:r>
-        <w:t xml:space="preserve">) and the full test suite was re-run against the</w:t>
-      </w:r>
-      <w:r>
-        <w:t xml:space="preserve"> </w:t>
-      </w:r>
-      <w:r>
-        <w:t xml:space="preserve">downgraded pin before committing it, so the pinned set is a verified</w:t>
-      </w:r>
-      <w:r>
-        <w:t xml:space="preserve"> </w:t>
-      </w:r>
-      <w:r>
-        <w:t xml:space="preserve">mutually-compatible combination rather than an assumed one.</w:t>
+        <w:t xml:space="preserve">), and the full test suite was re-run against the</w:t>
+      </w:r>
+      <w:r>
+        <w:t xml:space="preserve"> </w:t>
+      </w:r>
+      <w:r>
+        <w:t xml:space="preserve">downgraded pin before committing it. The pinned set is a verified</w:t>
+      </w:r>
+      <w:r>
+        <w:t xml:space="preserve"> </w:t>
+      </w:r>
+      <w:r>
+        <w:t xml:space="preserve">mutually-compatible combination, not an assumed one.</w:t>
       </w:r>
     </w:p>
     <w:bookmarkEnd w:id="34"/>
@@ -3184,31 +3177,31 @@
         <w:t xml:space="preserve">if: always()</w:t>
       </w:r>
       <w:r>
-        <w:t xml:space="preserve">) specifically so logs are available</w:t>
-      </w:r>
-      <w:r>
-        <w:t xml:space="preserve"> </w:t>
-      </w:r>
-      <w:r>
-        <w:t xml:space="preserve">exactly when a run fails and they matter most. Linting runs a single tool,</w:t>
-      </w:r>
-      <w:r>
-        <w:t xml:space="preserve"> </w:t>
-      </w:r>
-      <w:r>
-        <w:t xml:space="preserve">ruff, configured for pycodestyle errors, pyflakes, and import order with a</w:t>
-      </w:r>
-      <w:r>
-        <w:t xml:space="preserve"> </w:t>
-      </w:r>
-      <w:r>
-        <w:t xml:space="preserve">100-character line length; the smoke job deliberately does not run the</w:t>
-      </w:r>
-      <w:r>
-        <w:t xml:space="preserve"> </w:t>
-      </w:r>
-      <w:r>
-        <w:t xml:space="preserve">export step, since the pipeline’s own</w:t>
+        <w:t xml:space="preserve">) so logs are available exactly when</w:t>
+      </w:r>
+      <w:r>
+        <w:t xml:space="preserve"> </w:t>
+      </w:r>
+      <w:r>
+        <w:t xml:space="preserve">a run fails and they matter most. Linting runs a single tool, ruff,</w:t>
+      </w:r>
+      <w:r>
+        <w:t xml:space="preserve"> </w:t>
+      </w:r>
+      <w:r>
+        <w:t xml:space="preserve">configured for pycodestyle errors, pyflakes, and import order with a</w:t>
+      </w:r>
+      <w:r>
+        <w:t xml:space="preserve"> </w:t>
+      </w:r>
+      <w:r>
+        <w:t xml:space="preserve">100-character line length. The smoke job does not run the export step,</w:t>
+      </w:r>
+      <w:r>
+        <w:t xml:space="preserve"> </w:t>
+      </w:r>
+      <w:r>
+        <w:t xml:space="preserve">since the pipeline’s own</w:t>
       </w:r>
       <w:r>
         <w:t xml:space="preserve"> </w:t>
@@ -3223,43 +3216,43 @@
         <w:t xml:space="preserve"> </w:t>
       </w:r>
       <w:r>
-        <w:t xml:space="preserve">logic rejects quick-mode</w:t>
-      </w:r>
-      <w:r>
-        <w:t xml:space="preserve"> </w:t>
-      </w:r>
-      <w:r>
-        <w:t xml:space="preserve">runs by design, and carving out a CI-only bypass would weaken that</w:t>
-      </w:r>
-      <w:r>
-        <w:t xml:space="preserve"> </w:t>
-      </w:r>
-      <w:r>
-        <w:t xml:space="preserve">guarantee rather than test it — export correctness is instead covered by</w:t>
-      </w:r>
-      <w:r>
-        <w:t xml:space="preserve"> </w:t>
-      </w:r>
-      <w:r>
-        <w:t xml:space="preserve">unit tests in the test job. Python is pinned to 3.13 across CI and the</w:t>
-      </w:r>
-      <w:r>
-        <w:t xml:space="preserve"> </w:t>
-      </w:r>
-      <w:r>
-        <w:t xml:space="preserve">serving image specifically because the committed model pickle was built</w:t>
-      </w:r>
-      <w:r>
-        <w:t xml:space="preserve"> </w:t>
-      </w:r>
-      <w:r>
-        <w:t xml:space="preserve">under 3.13.11, and cross-minor-version unpickling is the most realistic</w:t>
-      </w:r>
-      <w:r>
-        <w:t xml:space="preserve"> </w:t>
-      </w:r>
-      <w:r>
-        <w:t xml:space="preserve">way a pipeline like this actually breaks.</w:t>
+        <w:t xml:space="preserve">logic rejects quick-mode runs by</w:t>
+      </w:r>
+      <w:r>
+        <w:t xml:space="preserve"> </w:t>
+      </w:r>
+      <w:r>
+        <w:t xml:space="preserve">design, and carving out a CI-only bypass would weaken that guarantee</w:t>
+      </w:r>
+      <w:r>
+        <w:t xml:space="preserve"> </w:t>
+      </w:r>
+      <w:r>
+        <w:t xml:space="preserve">instead of testing it; export correctness is instead covered by unit</w:t>
+      </w:r>
+      <w:r>
+        <w:t xml:space="preserve"> </w:t>
+      </w:r>
+      <w:r>
+        <w:t xml:space="preserve">tests in the test job. Python is pinned to 3.13 across CI and the serving</w:t>
+      </w:r>
+      <w:r>
+        <w:t xml:space="preserve"> </w:t>
+      </w:r>
+      <w:r>
+        <w:t xml:space="preserve">image because the committed model pickle was built under 3.13.11, and</w:t>
+      </w:r>
+      <w:r>
+        <w:t xml:space="preserve"> </w:t>
+      </w:r>
+      <w:r>
+        <w:t xml:space="preserve">cross-minor-version unpickling is the most realistic way a pipeline like</w:t>
+      </w:r>
+      <w:r>
+        <w:t xml:space="preserve"> </w:t>
+      </w:r>
+      <w:r>
+        <w:t xml:space="preserve">this actually breaks.</w:t>
       </w:r>
     </w:p>
     <w:p>
@@ -3267,37 +3260,37 @@
         <w:pStyle w:val="BodyText"/>
       </w:pPr>
       <w:r>
-        <w:t xml:space="preserve">To demonstrate the gate is real rather than decorative, a deliberately</w:t>
-      </w:r>
-      <w:r>
-        <w:t xml:space="preserve"> </w:t>
-      </w:r>
-      <w:r>
-        <w:t xml:space="preserve">broken commit was pushed to trigger a red run: the test job fails, causing</w:t>
-      </w:r>
-      <w:r>
-        <w:t xml:space="preserve"> </w:t>
-      </w:r>
-      <w:r>
-        <w:t xml:space="preserve">the downstream train-smoke and docker jobs to be skipped (they depend on</w:t>
-      </w:r>
-      <w:r>
-        <w:t xml:space="preserve"> </w:t>
-      </w:r>
-      <w:r>
-        <w:t xml:space="preserve">test), while lint still passes independently; the pipeline reports failure</w:t>
-      </w:r>
-      <w:r>
-        <w:t xml:space="preserve"> </w:t>
-      </w:r>
-      <w:r>
-        <w:t xml:space="preserve">with the failing assertion visible in the logs. The fix was then pushed</w:t>
-      </w:r>
-      <w:r>
-        <w:t xml:space="preserve"> </w:t>
-      </w:r>
-      <w:r>
-        <w:t xml:space="preserve">to restore a green run.</w:t>
+        <w:t xml:space="preserve">To demonstrate the gate is real, not decorative, a deliberately broken</w:t>
+      </w:r>
+      <w:r>
+        <w:t xml:space="preserve"> </w:t>
+      </w:r>
+      <w:r>
+        <w:t xml:space="preserve">commit was pushed to trigger a red run. The test job fails, causing the</w:t>
+      </w:r>
+      <w:r>
+        <w:t xml:space="preserve"> </w:t>
+      </w:r>
+      <w:r>
+        <w:t xml:space="preserve">downstream train-smoke and docker jobs to be skipped (they depend on</w:t>
+      </w:r>
+      <w:r>
+        <w:t xml:space="preserve"> </w:t>
+      </w:r>
+      <w:r>
+        <w:t xml:space="preserve">test), while lint still passes independently. The pipeline reports</w:t>
+      </w:r>
+      <w:r>
+        <w:t xml:space="preserve"> </w:t>
+      </w:r>
+      <w:r>
+        <w:t xml:space="preserve">failure with the failing assertion visible in the logs. The fix was then</w:t>
+      </w:r>
+      <w:r>
+        <w:t xml:space="preserve"> </w:t>
+      </w:r>
+      <w:r>
+        <w:t xml:space="preserve">pushed to restore a green run.</w:t>
       </w:r>
     </w:p>
     <w:p>
@@ -3419,10 +3412,7 @@
         <w:t xml:space="preserve">api/requirements.txt</w:t>
       </w:r>
       <w:r>
-        <w:t xml:space="preserve"> </w:t>
-      </w:r>
-      <w:r>
-        <w:t xml:space="preserve">— FastAPI, uvicorn,</w:t>
+        <w:t xml:space="preserve">: FastAPI, uvicorn,</w:t>
       </w:r>
       <w:r>
         <w:t xml:space="preserve"> </w:t>
@@ -3446,10 +3436,7 @@
         <w:t xml:space="preserve">requirements.txt</w:t>
       </w:r>
       <w:r>
-        <w:t xml:space="preserve"> </w:t>
-      </w:r>
-      <w:r>
-        <w:t xml:space="preserve">— and copies in</w:t>
+        <w:t xml:space="preserve">. It then copies in</w:t>
       </w:r>
       <w:r>
         <w:t xml:space="preserve"> </w:t>
@@ -3485,19 +3472,19 @@
         <w:t xml:space="preserve">api/</w:t>
       </w:r>
       <w:r>
-        <w:t xml:space="preserve">; it</w:t>
-      </w:r>
-      <w:r>
-        <w:t xml:space="preserve"> </w:t>
-      </w:r>
-      <w:r>
-        <w:t xml:space="preserve">deliberately excludes MLflow, XGBoost, and the plotting stack, since the</w:t>
-      </w:r>
-      <w:r>
-        <w:t xml:space="preserve"> </w:t>
-      </w:r>
-      <w:r>
-        <w:t xml:space="preserve">exported joblib pipeline only needs scikit-learn, pandas, and the</w:t>
+        <w:t xml:space="preserve">, and</w:t>
+      </w:r>
+      <w:r>
+        <w:t xml:space="preserve"> </w:t>
+      </w:r>
+      <w:r>
+        <w:t xml:space="preserve">excludes MLflow, XGBoost, and the plotting stack, since the exported</w:t>
+      </w:r>
+      <w:r>
+        <w:t xml:space="preserve"> </w:t>
+      </w:r>
+      <w:r>
+        <w:t xml:space="preserve">joblib pipeline only needs scikit-learn, pandas, and the</w:t>
       </w:r>
       <w:r>
         <w:t xml:space="preserve"> </w:t>
@@ -3512,19 +3499,25 @@
         <w:t xml:space="preserve"> </w:t>
       </w:r>
       <w:r>
-        <w:t xml:space="preserve">package at inference time. This roughly halves the image size relative to</w:t>
-      </w:r>
-      <w:r>
-        <w:t xml:space="preserve"> </w:t>
-      </w:r>
-      <w:r>
-        <w:t xml:space="preserve">installing the full training requirements and shrinks the attack surface.</w:t>
-      </w:r>
-      <w:r>
-        <w:t xml:space="preserve"> </w:t>
-      </w:r>
-      <w:r>
-        <w:t xml:space="preserve">The image runs as a non-root user on a</w:t>
+        <w:t xml:space="preserve">package at</w:t>
+      </w:r>
+      <w:r>
+        <w:t xml:space="preserve"> </w:t>
+      </w:r>
+      <w:r>
+        <w:t xml:space="preserve">inference time. This roughly halves the image size relative to installing</w:t>
+      </w:r>
+      <w:r>
+        <w:t xml:space="preserve"> </w:t>
+      </w:r>
+      <w:r>
+        <w:t xml:space="preserve">the full training requirements and shrinks the attack surface. The image</w:t>
+      </w:r>
+      <w:r>
+        <w:t xml:space="preserve"> </w:t>
+      </w:r>
+      <w:r>
+        <w:t xml:space="preserve">runs as a non-root user on a</w:t>
       </w:r>
       <w:r>
         <w:t xml:space="preserve"> </w:t>
@@ -3539,13 +3532,13 @@
         <w:t xml:space="preserve"> </w:t>
       </w:r>
       <w:r>
-        <w:t xml:space="preserve">base (matching</w:t>
-      </w:r>
-      <w:r>
-        <w:t xml:space="preserve"> </w:t>
-      </w:r>
-      <w:r>
-        <w:t xml:space="preserve">the Python version the committed pickle was built under) with a</w:t>
+        <w:t xml:space="preserve">base (matching the Python</w:t>
+      </w:r>
+      <w:r>
+        <w:t xml:space="preserve"> </w:t>
+      </w:r>
+      <w:r>
+        <w:t xml:space="preserve">version the committed pickle was built under) with a</w:t>
       </w:r>
       <w:r>
         <w:t xml:space="preserve"> </w:t>
@@ -3745,7 +3738,7 @@
         <w:t xml:space="preserve"> </w:t>
       </w:r>
       <w:r>
-        <w:t xml:space="preserve">the API boundary — enums for categorical codes (</w:t>
+        <w:t xml:space="preserve">the API boundary: enums for categorical codes (</w:t>
       </w:r>
       <w:r>
         <w:rPr>
@@ -3814,25 +3807,19 @@
         <w:t xml:space="preserve"> </w:t>
       </w:r>
       <w:r>
-        <w:t xml:space="preserve">0–7), rejecting anything outside</w:t>
-      </w:r>
-      <w:r>
-        <w:t xml:space="preserve"> </w:t>
-      </w:r>
-      <w:r>
-        <w:t xml:space="preserve">those bounds with a structured 422 rather than accepting it. This is</w:t>
-      </w:r>
-      <w:r>
-        <w:t xml:space="preserve"> </w:t>
-      </w:r>
-      <w:r>
-        <w:t xml:space="preserve">deliberately stricter than the pipeline itself needs to be: the fitted</w:t>
-      </w:r>
-      <w:r>
-        <w:t xml:space="preserve"> </w:t>
-      </w:r>
-      <w:r>
-        <w:t xml:space="preserve">pipeline’s</w:t>
+        <w:t xml:space="preserve">0–7). Anything outside those</w:t>
+      </w:r>
+      <w:r>
+        <w:t xml:space="preserve"> </w:t>
+      </w:r>
+      <w:r>
+        <w:t xml:space="preserve">bounds is rejected with a structured 422 instead of being accepted. This</w:t>
+      </w:r>
+      <w:r>
+        <w:t xml:space="preserve"> </w:t>
+      </w:r>
+      <w:r>
+        <w:t xml:space="preserve">is stricter than the pipeline itself needs to be: the fitted pipeline’s</w:t>
       </w:r>
       <w:r>
         <w:t xml:space="preserve"> </w:t>
@@ -3847,37 +3834,37 @@
         <w:t xml:space="preserve"> </w:t>
       </w:r>
       <w:r>
-        <w:t xml:space="preserve">would silently</w:t>
-      </w:r>
-      <w:r>
-        <w:t xml:space="preserve"> </w:t>
-      </w:r>
-      <w:r>
-        <w:t xml:space="preserve">zero-out an unrecognized category code and still return a prediction,</w:t>
-      </w:r>
-      <w:r>
-        <w:t xml:space="preserve"> </w:t>
-      </w:r>
-      <w:r>
-        <w:t xml:space="preserve">which is tolerable for batch scoring but not for a clinical-facing</w:t>
-      </w:r>
-      <w:r>
-        <w:t xml:space="preserve"> </w:t>
-      </w:r>
-      <w:r>
-        <w:t xml:space="preserve">endpoint, where silent garbage-in is worse than an explicit rejection. The</w:t>
-      </w:r>
-      <w:r>
-        <w:t xml:space="preserve"> </w:t>
-      </w:r>
-      <w:r>
-        <w:t xml:space="preserve">pipeline’s own tolerance is kept as a second line of defense underneath the</w:t>
-      </w:r>
-      <w:r>
-        <w:t xml:space="preserve"> </w:t>
-      </w:r>
-      <w:r>
-        <w:t xml:space="preserve">API-level validation.</w:t>
+        <w:t xml:space="preserve">would silently zero-out an</w:t>
+      </w:r>
+      <w:r>
+        <w:t xml:space="preserve"> </w:t>
+      </w:r>
+      <w:r>
+        <w:t xml:space="preserve">unrecognized category code and still return a prediction, which is</w:t>
+      </w:r>
+      <w:r>
+        <w:t xml:space="preserve"> </w:t>
+      </w:r>
+      <w:r>
+        <w:t xml:space="preserve">tolerable for batch scoring but not for a clinical-facing endpoint, where</w:t>
+      </w:r>
+      <w:r>
+        <w:t xml:space="preserve"> </w:t>
+      </w:r>
+      <w:r>
+        <w:t xml:space="preserve">silent garbage-in is worse than an explicit rejection. The pipeline’s own</w:t>
+      </w:r>
+      <w:r>
+        <w:t xml:space="preserve"> </w:t>
+      </w:r>
+      <w:r>
+        <w:t xml:space="preserve">tolerance is kept as a second line of defense underneath the API-level</w:t>
+      </w:r>
+      <w:r>
+        <w:t xml:space="preserve"> </w:t>
+      </w:r>
+      <w:r>
+        <w:t xml:space="preserve">validation.</w:t>
       </w:r>
     </w:p>
     <w:bookmarkEnd w:id="45"/>
@@ -3901,19 +3888,19 @@
         <w:t xml:space="preserve"> </w:t>
       </w:r>
       <w:r>
-        <w:t xml:space="preserve">registry. That plan changed on account-constraint grounds, not preference:</w:t>
-      </w:r>
-      <w:r>
-        <w:t xml:space="preserve"> </w:t>
-      </w:r>
-      <w:r>
-        <w:t xml:space="preserve">the available AWS account cannot create IAM roles and cannot expose public</w:t>
-      </w:r>
-      <w:r>
-        <w:t xml:space="preserve"> </w:t>
-      </w:r>
-      <w:r>
-        <w:t xml:space="preserve">services, being confined to a private VPC with only private subnets, and</w:t>
+        <w:t xml:space="preserve">registry. That plan changed on account-constraint grounds, not preference.</w:t>
+      </w:r>
+      <w:r>
+        <w:t xml:space="preserve"> </w:t>
+      </w:r>
+      <w:r>
+        <w:t xml:space="preserve">The available AWS account cannot create IAM roles and cannot expose public</w:t>
+      </w:r>
+      <w:r>
+        <w:t xml:space="preserve"> </w:t>
+      </w:r>
+      <w:r>
+        <w:t xml:space="preserve">services; it is confined to a private VPC with only private subnets, and</w:t>
       </w:r>
       <w:r>
         <w:t xml:space="preserve"> </w:t>
@@ -3934,85 +3921,85 @@
         <w:t xml:space="preserve"> </w:t>
       </w:r>
       <w:r>
-        <w:t xml:space="preserve">creation — so EKS cluster creation fails outright under those guardrails.</w:t>
-      </w:r>
-      <w:r>
-        <w:t xml:space="preserve"> </w:t>
-      </w:r>
-      <w:r>
-        <w:t xml:space="preserve">Rather than fight the account boundary, the deployment target was pivoted</w:t>
-      </w:r>
-      <w:r>
-        <w:t xml:space="preserve"> </w:t>
-      </w:r>
-      <w:r>
-        <w:t xml:space="preserve">to Docker Desktop’s built-in Kubernetes cluster, a constraint-driven</w:t>
-      </w:r>
-      <w:r>
-        <w:t xml:space="preserve"> </w:t>
-      </w:r>
-      <w:r>
-        <w:t xml:space="preserve">architecture decision explicitly accepted by the assignment FAQ (which</w:t>
-      </w:r>
-      <w:r>
-        <w:t xml:space="preserve"> </w:t>
-      </w:r>
-      <w:r>
-        <w:t xml:space="preserve">allows Minikube/Docker Desktop and local access instructions in place of a</w:t>
-      </w:r>
-      <w:r>
-        <w:t xml:space="preserve"> </w:t>
-      </w:r>
-      <w:r>
-        <w:t xml:space="preserve">public URL) and one that satisfies the rubric fully — Deployment and</w:t>
-      </w:r>
-      <w:r>
-        <w:t xml:space="preserve"> </w:t>
-      </w:r>
-      <w:r>
-        <w:t xml:space="preserve">Service YAML, LoadBalancer exposure, verifiable endpoints — with zero</w:t>
-      </w:r>
-      <w:r>
-        <w:t xml:space="preserve"> </w:t>
-      </w:r>
-      <w:r>
-        <w:t xml:space="preserve">account risk. Two alternatives were weighed and set aside: EKS against</w:t>
-      </w:r>
-      <w:r>
-        <w:t xml:space="preserve"> </w:t>
-      </w:r>
-      <w:r>
-        <w:t xml:space="preserve">pre-existing IAM roles with an internal load balancer, whose feasibility</w:t>
-      </w:r>
-      <w:r>
-        <w:t xml:space="preserve"> </w:t>
-      </w:r>
-      <w:r>
-        <w:t xml:space="preserve">could not be verified inside the restricted account (every step would have</w:t>
-      </w:r>
-      <w:r>
-        <w:t xml:space="preserve"> </w:t>
-      </w:r>
-      <w:r>
-        <w:t xml:space="preserve">to be relayed through a SageMaker terminal with no direct visibility); and</w:t>
-      </w:r>
-      <w:r>
-        <w:t xml:space="preserve"> </w:t>
-      </w:r>
-      <w:r>
-        <w:t xml:space="preserve">ECS in the account’s private subnets, which the account does permit but</w:t>
-      </w:r>
-      <w:r>
-        <w:t xml:space="preserve"> </w:t>
-      </w:r>
-      <w:r>
-        <w:t xml:space="preserve">which produces a task-definition artifact rather than the Kubernetes</w:t>
-      </w:r>
-      <w:r>
-        <w:t xml:space="preserve"> </w:t>
-      </w:r>
-      <w:r>
-        <w:t xml:space="preserve">Deployment/Service YAML the FAQ and rubric expect — a technically working</w:t>
+        <w:t xml:space="preserve">creation, so EKS cluster creation fails outright under those guardrails.</w:t>
+      </w:r>
+      <w:r>
+        <w:t xml:space="preserve"> </w:t>
+      </w:r>
+      <w:r>
+        <w:t xml:space="preserve">Instead of fighting the account boundary, the deployment target was</w:t>
+      </w:r>
+      <w:r>
+        <w:t xml:space="preserve"> </w:t>
+      </w:r>
+      <w:r>
+        <w:t xml:space="preserve">pivoted to Docker Desktop’s built-in Kubernetes cluster. This is a</w:t>
+      </w:r>
+      <w:r>
+        <w:t xml:space="preserve"> </w:t>
+      </w:r>
+      <w:r>
+        <w:t xml:space="preserve">constraint-driven decision explicitly accepted by the assignment FAQ</w:t>
+      </w:r>
+      <w:r>
+        <w:t xml:space="preserve"> </w:t>
+      </w:r>
+      <w:r>
+        <w:t xml:space="preserve">(which allows Minikube/Docker Desktop and local access instructions in</w:t>
+      </w:r>
+      <w:r>
+        <w:t xml:space="preserve"> </w:t>
+      </w:r>
+      <w:r>
+        <w:t xml:space="preserve">place of a public URL), and it satisfies the rubric fully: Deployment and</w:t>
+      </w:r>
+      <w:r>
+        <w:t xml:space="preserve"> </w:t>
+      </w:r>
+      <w:r>
+        <w:t xml:space="preserve">Service YAML, LoadBalancer exposure, verifiable endpoints, all with zero</w:t>
+      </w:r>
+      <w:r>
+        <w:t xml:space="preserve"> </w:t>
+      </w:r>
+      <w:r>
+        <w:t xml:space="preserve">account risk. Two alternatives were weighed and set aside. EKS against</w:t>
+      </w:r>
+      <w:r>
+        <w:t xml:space="preserve"> </w:t>
+      </w:r>
+      <w:r>
+        <w:t xml:space="preserve">pre-existing IAM roles with an internal load balancer had feasibility</w:t>
+      </w:r>
+      <w:r>
+        <w:t xml:space="preserve"> </w:t>
+      </w:r>
+      <w:r>
+        <w:t xml:space="preserve">that could not be verified inside the restricted account, since every</w:t>
+      </w:r>
+      <w:r>
+        <w:t xml:space="preserve"> </w:t>
+      </w:r>
+      <w:r>
+        <w:t xml:space="preserve">step would have to be relayed through a SageMaker terminal with no direct</w:t>
+      </w:r>
+      <w:r>
+        <w:t xml:space="preserve"> </w:t>
+      </w:r>
+      <w:r>
+        <w:t xml:space="preserve">visibility. ECS in the account’s private subnets is permitted, but it</w:t>
+      </w:r>
+      <w:r>
+        <w:t xml:space="preserve"> </w:t>
+      </w:r>
+      <w:r>
+        <w:t xml:space="preserve">produces a task-definition artifact instead of the Kubernetes</w:t>
+      </w:r>
+      <w:r>
+        <w:t xml:space="preserve"> </w:t>
+      </w:r>
+      <w:r>
+        <w:t xml:space="preserve">Deployment/Service YAML the FAQ and rubric expect: a technically working</w:t>
       </w:r>
       <w:r>
         <w:t xml:space="preserve"> </w:t>
@@ -4080,7 +4067,7 @@
         <w:t xml:space="preserve">HEALTHCHECK</w:t>
       </w:r>
       <w:r>
-        <w:t xml:space="preserve">, so the probes are the real gate — with the</w:t>
+        <w:t xml:space="preserve">, so the probes are the real gate; with the</w:t>
       </w:r>
       <w:r>
         <w:t xml:space="preserve"> </w:t>
@@ -4381,7 +4368,7 @@
         <w:pStyle w:val="FirstParagraph"/>
       </w:pPr>
       <w:r>
-        <w:t xml:space="preserve">Every prediction request emits a structured application log line —</w:t>
+        <w:t xml:space="preserve">Every prediction request emits a structured application log line,</w:t>
       </w:r>
       <w:r>
         <w:t xml:space="preserve"> </w:t>
@@ -4393,22 +4380,19 @@
         <w:t xml:space="preserve">heart_disease_api INFO predict prediction=&lt;0|1&gt; probability=&lt;p&gt; latency_ms=&lt;t&gt;</w:t>
       </w:r>
       <w:r>
-        <w:t xml:space="preserve"> </w:t>
-      </w:r>
-      <w:r>
-        <w:t xml:space="preserve">— alongside uvicorn’s own access log entry for the same</w:t>
-      </w:r>
-      <w:r>
-        <w:t xml:space="preserve"> </w:t>
-      </w:r>
-      <w:r>
-        <w:t xml:space="preserve">request, giving both a human-readable audit trail and a stable, greppable</w:t>
-      </w:r>
-      <w:r>
-        <w:t xml:space="preserve"> </w:t>
-      </w:r>
-      <w:r>
-        <w:t xml:space="preserve">field format.</w:t>
+        <w:t xml:space="preserve">, alongside uvicorn’s own access log entry for the same</w:t>
+      </w:r>
+      <w:r>
+        <w:t xml:space="preserve"> </w:t>
+      </w:r>
+      <w:r>
+        <w:t xml:space="preserve">request. Together these give a human-readable audit trail and a stable,</w:t>
+      </w:r>
+      <w:r>
+        <w:t xml:space="preserve"> </w:t>
+      </w:r>
+      <w:r>
+        <w:t xml:space="preserve">greppable field format.</w:t>
       </w:r>
     </w:p>
     <w:p>
@@ -4470,19 +4454,19 @@
         <w:t xml:space="preserve"> </w:t>
       </w:r>
       <w:r>
-        <w:t xml:space="preserve">prediction — surfacing ML-aware signal (the mix of predicted classes over</w:t>
-      </w:r>
-      <w:r>
-        <w:t xml:space="preserve"> </w:t>
-      </w:r>
-      <w:r>
-        <w:t xml:space="preserve">time), not just HTTP plumbing. Prometheus and Grafana are deployed into the</w:t>
-      </w:r>
-      <w:r>
-        <w:t xml:space="preserve"> </w:t>
-      </w:r>
-      <w:r>
-        <w:t xml:space="preserve">same namespace, fully provisioned from ConfigMaps with a single</w:t>
+        <w:t xml:space="preserve">prediction. This surfaces ML-aware signal, the mix of predicted classes</w:t>
+      </w:r>
+      <w:r>
+        <w:t xml:space="preserve"> </w:t>
+      </w:r>
+      <w:r>
+        <w:t xml:space="preserve">over time, not just HTTP plumbing. Prometheus and Grafana are deployed</w:t>
+      </w:r>
+      <w:r>
+        <w:t xml:space="preserve"> </w:t>
+      </w:r>
+      <w:r>
+        <w:t xml:space="preserve">into the same namespace, fully provisioned from ConfigMaps with a single</w:t>
       </w:r>
       <w:r>
         <w:t xml:space="preserve"> </w:t>
@@ -4524,19 +4508,19 @@
         <w:t xml:space="preserve"> </w:t>
       </w:r>
       <w:r>
-        <w:t xml:space="preserve">predictions by risk label — both reachable via their own LoadBalancer</w:t>
-      </w:r>
-      <w:r>
-        <w:t xml:space="preserve"> </w:t>
-      </w:r>
-      <w:r>
-        <w:t xml:space="preserve">Services on 9090 and 3000. Live verification confirmed the Prometheus scrape</w:t>
-      </w:r>
-      <w:r>
-        <w:t xml:space="preserve"> </w:t>
-      </w:r>
-      <w:r>
-        <w:t xml:space="preserve">target</w:t>
+        <w:t xml:space="preserve">predictions by risk label. Both are reachable via their own LoadBalancer</w:t>
+      </w:r>
+      <w:r>
+        <w:t xml:space="preserve"> </w:t>
+      </w:r>
+      <w:r>
+        <w:t xml:space="preserve">Services on 9090 and 3000. Live verification confirmed the Prometheus</w:t>
+      </w:r>
+      <w:r>
+        <w:t xml:space="preserve"> </w:t>
+      </w:r>
+      <w:r>
+        <w:t xml:space="preserve">scrape target</w:t>
       </w:r>
       <w:r>
         <w:t xml:space="preserve"> </w:t>
@@ -4548,13 +4532,19 @@
         <w:t xml:space="preserve">up</w:t>
       </w:r>
       <w:r>
-        <w:t xml:space="preserve">, PromQL queries returning non-zero request-rate and prediction</w:t>
-      </w:r>
-      <w:r>
-        <w:t xml:space="preserve"> </w:t>
-      </w:r>
-      <w:r>
-        <w:t xml:space="preserve">counts, and Grafana’s health and dashboard endpoints both healthy.</w:t>
+        <w:t xml:space="preserve">, PromQL queries returning non-zero request-rate and</w:t>
+      </w:r>
+      <w:r>
+        <w:t xml:space="preserve"> </w:t>
+      </w:r>
+      <w:r>
+        <w:t xml:space="preserve">prediction counts, and Grafana’s health and dashboard endpoints both</w:t>
+      </w:r>
+      <w:r>
+        <w:t xml:space="preserve"> </w:t>
+      </w:r>
+      <w:r>
+        <w:t xml:space="preserve">healthy.</w:t>
       </w:r>
     </w:p>
     <w:p>
@@ -4564,7 +4554,7 @@
       <w:r>
         <w:drawing>
           <wp:inline>
-            <wp:extent cx="5334000" cy="2906197"/>
+            <wp:extent cx="5334000" cy="2805709"/>
             <wp:effectExtent b="0" l="0" r="0" t="0"/>
             <wp:docPr descr="Grafana dashboard" title="" id="54" name="Picture"/>
             <a:graphic>
@@ -4585,7 +4575,7 @@
                   <pic:spPr bwMode="auto">
                     <a:xfrm>
                       <a:off x="0" y="0"/>
-                      <a:ext cx="5334000" cy="2906197"/>
+                      <a:ext cx="5334000" cy="2805709"/>
                     </a:xfrm>
                     <a:prstGeom prst="rect">
                       <a:avLst/>
@@ -4635,7 +4625,7 @@
         <w:t xml:space="preserve"> </w:t>
       </w:r>
       <w:r>
-        <w:t xml:space="preserve">panel: Prometheus reaches the API only through its Service, which</w:t>
+        <w:t xml:space="preserve">panel. Prometheus reaches the API only through its Service, which</w:t>
       </w:r>
       <w:r>
         <w:t xml:space="preserve"> </w:t>
@@ -4647,13 +4637,13 @@
         <w:t xml:space="preserve"> </w:t>
       </w:r>
       <w:r>
-        <w:t xml:space="preserve">alternates between each pod’s independently-accumulated value rather than</w:t>
-      </w:r>
-      <w:r>
-        <w:t xml:space="preserve"> </w:t>
-      </w:r>
-      <w:r>
-        <w:t xml:space="preserve">climbing monotonically — a visible sawtooth rather than a smooth line. A</w:t>
+        <w:t xml:space="preserve">alternates between each pod’s independently-accumulated value instead of</w:t>
+      </w:r>
+      <w:r>
+        <w:t xml:space="preserve"> </w:t>
+      </w:r>
+      <w:r>
+        <w:t xml:space="preserve">climbing monotonically: a visible sawtooth instead of a smooth line. A</w:t>
       </w:r>
       <w:r>
         <w:t xml:space="preserve"> </w:t>
@@ -4686,13 +4676,13 @@
         <w:t xml:space="preserve"> </w:t>
       </w:r>
       <w:r>
-        <w:t xml:space="preserve">pods instead of sampling one at a time; this is accepted here as expected</w:t>
-      </w:r>
-      <w:r>
-        <w:t xml:space="preserve"> </w:t>
-      </w:r>
-      <w:r>
-        <w:t xml:space="preserve">demo behavior rather than a bug, and noted rather than silently left</w:t>
+        <w:t xml:space="preserve">pods instead of sampling one at a time. This is accepted here as expected</w:t>
+      </w:r>
+      <w:r>
+        <w:t xml:space="preserve"> </w:t>
+      </w:r>
+      <w:r>
+        <w:t xml:space="preserve">demo behavior, not a bug, and it is noted here rather than left</w:t>
       </w:r>
       <w:r>
         <w:t xml:space="preserve"> </w:t>
@@ -4718,13 +4708,13 @@
         <w:t xml:space="preserve"> </w:t>
       </w:r>
       <w:r>
-        <w:t xml:space="preserve">For a graded demo this is an acceptable, and arguably correct, trade-off —</w:t>
-      </w:r>
-      <w:r>
-        <w:t xml:space="preserve"> </w:t>
-      </w:r>
-      <w:r>
-        <w:t xml:space="preserve">see the conclusion.</w:t>
+        <w:t xml:space="preserve">For a graded demo this is an acceptable, and arguably correct, trade-off.</w:t>
+      </w:r>
+      <w:r>
+        <w:t xml:space="preserve"> </w:t>
+      </w:r>
+      <w:r>
+        <w:t xml:space="preserve">See the conclusion.</w:t>
       </w:r>
     </w:p>
     <w:bookmarkEnd w:id="56"/>
@@ -4748,55 +4738,55 @@
         <w:t xml:space="preserve"> </w:t>
       </w:r>
       <w:r>
-        <w:t xml:space="preserve">the assignment: a reproducibly fetched and cleaned dataset; feature</w:t>
-      </w:r>
-      <w:r>
-        <w:t xml:space="preserve"> </w:t>
-      </w:r>
-      <w:r>
-        <w:t xml:space="preserve">engineering embedded in a pipeline rather than pre-computed; a tracked,</w:t>
-      </w:r>
-      <w:r>
-        <w:t xml:space="preserve"> </w:t>
-      </w:r>
-      <w:r>
-        <w:t xml:space="preserve">multi-model comparison that reports honest, mixed results rather than a</w:t>
-      </w:r>
-      <w:r>
-        <w:t xml:space="preserve"> </w:t>
-      </w:r>
-      <w:r>
-        <w:t xml:space="preserve">single flattering number; deterministic packaging that lets a fresh clone</w:t>
-      </w:r>
-      <w:r>
-        <w:t xml:space="preserve"> </w:t>
-      </w:r>
-      <w:r>
-        <w:t xml:space="preserve">serve without retraining; a CI/CD gate proven with both a green and a red</w:t>
-      </w:r>
-      <w:r>
-        <w:t xml:space="preserve"> </w:t>
-      </w:r>
-      <w:r>
-        <w:t xml:space="preserve">run; a slim, non-root container; a Kubernetes deployment whose target</w:t>
-      </w:r>
-      <w:r>
-        <w:t xml:space="preserve"> </w:t>
-      </w:r>
-      <w:r>
-        <w:t xml:space="preserve">platform was chosen for a documented account constraint rather than</w:t>
-      </w:r>
-      <w:r>
-        <w:t xml:space="preserve"> </w:t>
-      </w:r>
-      <w:r>
-        <w:t xml:space="preserve">convenience; and a monitoring stack wired into real Prometheus/Grafana</w:t>
-      </w:r>
-      <w:r>
-        <w:t xml:space="preserve"> </w:t>
-      </w:r>
-      <w:r>
-        <w:t xml:space="preserve">rather than a stub JSON endpoint.</w:t>
+        <w:t xml:space="preserve">the assignment. The dataset is fetched and cleaned reproducibly. Feature</w:t>
+      </w:r>
+      <w:r>
+        <w:t xml:space="preserve"> </w:t>
+      </w:r>
+      <w:r>
+        <w:t xml:space="preserve">engineering is embedded in a pipeline instead of pre-computed. A tracked,</w:t>
+      </w:r>
+      <w:r>
+        <w:t xml:space="preserve"> </w:t>
+      </w:r>
+      <w:r>
+        <w:t xml:space="preserve">multi-model comparison reports honest, mixed results instead of a single</w:t>
+      </w:r>
+      <w:r>
+        <w:t xml:space="preserve"> </w:t>
+      </w:r>
+      <w:r>
+        <w:t xml:space="preserve">flattering number. Deterministic packaging lets a fresh clone serve</w:t>
+      </w:r>
+      <w:r>
+        <w:t xml:space="preserve"> </w:t>
+      </w:r>
+      <w:r>
+        <w:t xml:space="preserve">without retraining. A CI/CD gate is proven with both a green and a red</w:t>
+      </w:r>
+      <w:r>
+        <w:t xml:space="preserve"> </w:t>
+      </w:r>
+      <w:r>
+        <w:t xml:space="preserve">run. The container is slim and runs as non-root. The Kubernetes deployment</w:t>
+      </w:r>
+      <w:r>
+        <w:t xml:space="preserve"> </w:t>
+      </w:r>
+      <w:r>
+        <w:t xml:space="preserve">target was chosen for a documented account constraint, not convenience.</w:t>
+      </w:r>
+      <w:r>
+        <w:t xml:space="preserve"> </w:t>
+      </w:r>
+      <w:r>
+        <w:t xml:space="preserve">The monitoring stack is wired into real Prometheus and Grafana instead of</w:t>
+      </w:r>
+      <w:r>
+        <w:t xml:space="preserve"> </w:t>
+      </w:r>
+      <w:r>
+        <w:t xml:space="preserve">a stub JSON endpoint.</w:t>
       </w:r>
     </w:p>
     <w:p>
@@ -4804,37 +4794,37 @@
         <w:pStyle w:val="BodyText"/>
       </w:pPr>
       <w:r>
-        <w:t xml:space="preserve">The ephemeral choices — no EKS cluster left running, no persistent volumes</w:t>
-      </w:r>
-      <w:r>
-        <w:t xml:space="preserve"> </w:t>
-      </w:r>
-      <w:r>
-        <w:t xml:space="preserve">under Prometheus/Grafana, metrics that reset with the pods — are not</w:t>
-      </w:r>
-      <w:r>
-        <w:t xml:space="preserve"> </w:t>
-      </w:r>
-      <w:r>
-        <w:t xml:space="preserve">shortcuts but cost-conscious practice: nothing here needs to survive a</w:t>
-      </w:r>
-      <w:r>
-        <w:t xml:space="preserve"> </w:t>
-      </w:r>
-      <w:r>
-        <w:t xml:space="preserve">demo, and provisioning everything declaratively (namespace, Deployment,</w:t>
-      </w:r>
-      <w:r>
-        <w:t xml:space="preserve"> </w:t>
-      </w:r>
-      <w:r>
-        <w:t xml:space="preserve">Service, and the monitoring ConfigMaps) means the entire stack can be torn</w:t>
-      </w:r>
-      <w:r>
-        <w:t xml:space="preserve"> </w:t>
-      </w:r>
-      <w:r>
-        <w:t xml:space="preserve">down and rebuilt with a couple of</w:t>
+        <w:t xml:space="preserve">The ephemeral choices are deliberate: no EKS cluster is left running, no</w:t>
+      </w:r>
+      <w:r>
+        <w:t xml:space="preserve"> </w:t>
+      </w:r>
+      <w:r>
+        <w:t xml:space="preserve">persistent volumes back Prometheus/Grafana, and metrics reset with the</w:t>
+      </w:r>
+      <w:r>
+        <w:t xml:space="preserve"> </w:t>
+      </w:r>
+      <w:r>
+        <w:t xml:space="preserve">pods. This is cost-conscious practice, not a shortcut. Nothing here needs</w:t>
+      </w:r>
+      <w:r>
+        <w:t xml:space="preserve"> </w:t>
+      </w:r>
+      <w:r>
+        <w:t xml:space="preserve">to survive a demo, and provisioning everything declaratively (namespace,</w:t>
+      </w:r>
+      <w:r>
+        <w:t xml:space="preserve"> </w:t>
+      </w:r>
+      <w:r>
+        <w:t xml:space="preserve">Deployment, Service, and the monitoring ConfigMaps) means the entire stack</w:t>
+      </w:r>
+      <w:r>
+        <w:t xml:space="preserve"> </w:t>
+      </w:r>
+      <w:r>
+        <w:t xml:space="preserve">can be torn down and rebuilt with a couple of</w:t>
       </w:r>
       <w:r>
         <w:t xml:space="preserve"> </w:t>
@@ -4858,19 +4848,13 @@
         <w:t xml:space="preserve"> </w:t>
       </w:r>
       <w:r>
-        <w:t xml:space="preserve">calls</w:t>
-      </w:r>
-      <w:r>
-        <w:t xml:space="preserve"> </w:t>
-      </w:r>
-      <w:r>
-        <w:t xml:space="preserve">whenever it is needed again, which is the property that actually matters</w:t>
-      </w:r>
-      <w:r>
-        <w:t xml:space="preserve"> </w:t>
-      </w:r>
-      <w:r>
-        <w:t xml:space="preserve">for a project graded once and not operated continuously.</w:t>
+        <w:t xml:space="preserve">calls whenever it is needed again. That property, not continuous</w:t>
+      </w:r>
+      <w:r>
+        <w:t xml:space="preserve"> </w:t>
+      </w:r>
+      <w:r>
+        <w:t xml:space="preserve">uptime, is what matters for a project graded once.</w:t>
       </w:r>
     </w:p>
     <w:p>
@@ -4884,49 +4868,49 @@
         <w:t xml:space="preserve"> </w:t>
       </w:r>
       <w:r>
-        <w:t xml:space="preserve">steps follow directly from the trade-offs already documented: promoting</w:t>
-      </w:r>
-      <w:r>
-        <w:t xml:space="preserve"> </w:t>
-      </w:r>
-      <w:r>
-        <w:t xml:space="preserve">the tracked model into MLflow’s Model Registry once more than one model</w:t>
-      </w:r>
-      <w:r>
-        <w:t xml:space="preserve"> </w:t>
-      </w:r>
-      <w:r>
-        <w:t xml:space="preserve">needs to be managed over time, moving the monitoring stack onto persistent</w:t>
-      </w:r>
-      <w:r>
-        <w:t xml:space="preserve"> </w:t>
-      </w:r>
-      <w:r>
-        <w:t xml:space="preserve">storage and a per-pod scrape topology once metrics need to survive a</w:t>
-      </w:r>
-      <w:r>
-        <w:t xml:space="preserve"> </w:t>
-      </w:r>
-      <w:r>
-        <w:t xml:space="preserve">restart, and revisiting EKS once the account constraints that forced the</w:t>
-      </w:r>
-      <w:r>
-        <w:t xml:space="preserve"> </w:t>
-      </w:r>
-      <w:r>
-        <w:t xml:space="preserve">local-Kubernetes pivot are lifted. None of those are required to satisfy</w:t>
-      </w:r>
-      <w:r>
-        <w:t xml:space="preserve"> </w:t>
-      </w:r>
-      <w:r>
-        <w:t xml:space="preserve">the current rubric, but each is a natural, low-friction extension of</w:t>
-      </w:r>
-      <w:r>
-        <w:t xml:space="preserve"> </w:t>
-      </w:r>
-      <w:r>
-        <w:t xml:space="preserve">decisions already made rather than a rearchitecture.</w:t>
+        <w:t xml:space="preserve">steps follow directly from the trade-offs already documented. The tracked</w:t>
+      </w:r>
+      <w:r>
+        <w:t xml:space="preserve"> </w:t>
+      </w:r>
+      <w:r>
+        <w:t xml:space="preserve">model could move into MLflow’s Model Registry once more than one model</w:t>
+      </w:r>
+      <w:r>
+        <w:t xml:space="preserve"> </w:t>
+      </w:r>
+      <w:r>
+        <w:t xml:space="preserve">needs to be managed over time. The monitoring stack could move onto</w:t>
+      </w:r>
+      <w:r>
+        <w:t xml:space="preserve"> </w:t>
+      </w:r>
+      <w:r>
+        <w:t xml:space="preserve">persistent storage with a per-pod scrape topology once metrics need to</w:t>
+      </w:r>
+      <w:r>
+        <w:t xml:space="preserve"> </w:t>
+      </w:r>
+      <w:r>
+        <w:t xml:space="preserve">survive a restart. EKS is worth revisiting once the account constraints</w:t>
+      </w:r>
+      <w:r>
+        <w:t xml:space="preserve"> </w:t>
+      </w:r>
+      <w:r>
+        <w:t xml:space="preserve">that forced the local-Kubernetes pivot are lifted. None of those are</w:t>
+      </w:r>
+      <w:r>
+        <w:t xml:space="preserve"> </w:t>
+      </w:r>
+      <w:r>
+        <w:t xml:space="preserve">required to satisfy the current rubric, but each is a natural,</w:t>
+      </w:r>
+      <w:r>
+        <w:t xml:space="preserve"> </w:t>
+      </w:r>
+      <w:r>
+        <w:t xml:space="preserve">low-friction extension of decisions already made, not a rearchitecture.</w:t>
       </w:r>
     </w:p>
     <w:bookmarkEnd w:id="57"/>

</xml_diff>

<commit_message>
docs: update report document with scrape topology fix narrative
</commit_message>
<xml_diff>
--- a/docs/report/REPORT.docx
+++ b/docs/report/REPORT.docx
@@ -2100,10 +2100,6 @@
       </w:pPr>
       <w:bookmarkStart w:id="1" w:name="_Toc234704868"/>
       <w:r>
-        <w:rPr>
-          <w:rFonts w:ascii="Calibri" w:hAnsi="Calibri"/>
-          <w:color w:val="1A1A2E"/>
-        </w:rPr>
         <w:lastRenderedPageBreak/>
         <w:t>1. Overview &amp; Setup</w:t>
       </w:r>
@@ -2282,10 +2278,6 @@
       </w:pPr>
       <w:bookmarkStart w:id="2" w:name="_Toc234704869"/>
       <w:r>
-        <w:rPr>
-          <w:rFonts w:ascii="Calibri" w:hAnsi="Calibri"/>
-          <w:color w:val="1A1A2E"/>
-        </w:rPr>
         <w:t>Quickstart</w:t>
       </w:r>
       <w:bookmarkEnd w:id="2"/>
@@ -2302,7 +2294,43 @@
           <w:color w:val="1E1E1E"/>
           <w:sz w:val="19"/>
         </w:rPr>
-        <w:t>python -m venv .venv &amp;&amp; .venv/Scripts/activate</w:t>
+        <w:t xml:space="preserve">python -m </w:t>
+      </w:r>
+      <w:proofErr w:type="gramStart"/>
+      <w:r>
+        <w:rPr>
+          <w:rFonts w:ascii="Courier New" w:hAnsi="Courier New"/>
+          <w:color w:val="1E1E1E"/>
+          <w:sz w:val="19"/>
+        </w:rPr>
+        <w:t>venv .venv</w:t>
+      </w:r>
+      <w:proofErr w:type="gramEnd"/>
+      <w:r>
+        <w:rPr>
+          <w:rFonts w:ascii="Courier New" w:hAnsi="Courier New"/>
+          <w:color w:val="1E1E1E"/>
+          <w:sz w:val="19"/>
+        </w:rPr>
+        <w:t xml:space="preserve"> &amp;</w:t>
+      </w:r>
+      <w:proofErr w:type="gramStart"/>
+      <w:r>
+        <w:rPr>
+          <w:rFonts w:ascii="Courier New" w:hAnsi="Courier New"/>
+          <w:color w:val="1E1E1E"/>
+          <w:sz w:val="19"/>
+        </w:rPr>
+        <w:t>&amp; .venv</w:t>
+      </w:r>
+      <w:proofErr w:type="gramEnd"/>
+      <w:r>
+        <w:rPr>
+          <w:rFonts w:ascii="Courier New" w:hAnsi="Courier New"/>
+          <w:color w:val="1E1E1E"/>
+          <w:sz w:val="19"/>
+        </w:rPr>
+        <w:t>/Scripts/activate</w:t>
       </w:r>
     </w:p>
     <w:p>
@@ -2445,10 +2473,6 @@
       </w:pPr>
       <w:bookmarkStart w:id="3" w:name="_Toc234704870"/>
       <w:r>
-        <w:rPr>
-          <w:rFonts w:ascii="Calibri" w:hAnsi="Calibri"/>
-          <w:color w:val="1A1A2E"/>
-        </w:rPr>
         <w:lastRenderedPageBreak/>
         <w:t>2. Data &amp; EDA</w:t>
       </w:r>
@@ -2689,10 +2713,6 @@
       </w:pPr>
       <w:bookmarkStart w:id="4" w:name="_Toc234704871"/>
       <w:r>
-        <w:rPr>
-          <w:rFonts w:ascii="Calibri" w:hAnsi="Calibri"/>
-          <w:color w:val="1A1A2E"/>
-        </w:rPr>
         <w:lastRenderedPageBreak/>
         <w:t>3. Feature Engineering &amp; Models</w:t>
       </w:r>
@@ -2704,10 +2724,6 @@
       </w:pPr>
       <w:bookmarkStart w:id="5" w:name="_Toc234704872"/>
       <w:r>
-        <w:rPr>
-          <w:rFonts w:ascii="Calibri" w:hAnsi="Calibri"/>
-          <w:color w:val="1A1A2E"/>
-        </w:rPr>
         <w:t>Derived Clinical Features</w:t>
       </w:r>
       <w:bookmarkEnd w:id="5"/>
@@ -2778,10 +2794,6 @@
       </w:pPr>
       <w:bookmarkStart w:id="6" w:name="_Toc234704873"/>
       <w:r>
-        <w:rPr>
-          <w:rFonts w:ascii="Calibri" w:hAnsi="Calibri"/>
-          <w:color w:val="1A1A2E"/>
-        </w:rPr>
         <w:t>Preprocessing</w:t>
       </w:r>
       <w:bookmarkEnd w:id="6"/>
@@ -2840,10 +2852,6 @@
       </w:pPr>
       <w:bookmarkStart w:id="7" w:name="_Toc234704874"/>
       <w:r>
-        <w:rPr>
-          <w:rFonts w:ascii="Calibri" w:hAnsi="Calibri"/>
-          <w:color w:val="1A1A2E"/>
-        </w:rPr>
         <w:t>Training Setup</w:t>
       </w:r>
       <w:bookmarkEnd w:id="7"/>
@@ -2866,10 +2874,6 @@
       </w:pPr>
       <w:bookmarkStart w:id="8" w:name="_Toc234704875"/>
       <w:r>
-        <w:rPr>
-          <w:rFonts w:ascii="Calibri" w:hAnsi="Calibri"/>
-          <w:color w:val="1A1A2E"/>
-        </w:rPr>
         <w:t>Results</w:t>
       </w:r>
       <w:bookmarkEnd w:id="8"/>
@@ -4042,10 +4046,6 @@
       </w:pPr>
       <w:bookmarkStart w:id="9" w:name="_Toc234704876"/>
       <w:r>
-        <w:rPr>
-          <w:rFonts w:ascii="Calibri" w:hAnsi="Calibri"/>
-          <w:color w:val="1A1A2E"/>
-        </w:rPr>
         <w:lastRenderedPageBreak/>
         <w:t>4. Experiment Tracking</w:t>
       </w:r>
@@ -4060,7 +4060,23 @@
           <w:rFonts w:ascii="Calibri" w:hAnsi="Calibri"/>
           <w:color w:val="444455"/>
         </w:rPr>
-        <w:t>All six runs are tracked with MLflow using a sqlite:///mlflow.db store for run metadata (params, metrics, tags) with artifacts under ./mlruns. Each run logs:</w:t>
+        <w:t xml:space="preserve">All six runs are tracked with MLflow using a sqlite:///mlflow.db store for run metadata (params, metrics, tags) with artifacts </w:t>
+      </w:r>
+      <w:proofErr w:type="gramStart"/>
+      <w:r>
+        <w:rPr>
+          <w:rFonts w:ascii="Calibri" w:hAnsi="Calibri"/>
+          <w:color w:val="444455"/>
+        </w:rPr>
+        <w:t>under .</w:t>
+      </w:r>
+      <w:proofErr w:type="gramEnd"/>
+      <w:r>
+        <w:rPr>
+          <w:rFonts w:ascii="Calibri" w:hAnsi="Calibri"/>
+          <w:color w:val="444455"/>
+        </w:rPr>
+        <w:t>/mlruns. Each run logs:</w:t>
       </w:r>
     </w:p>
     <w:p>
@@ -4525,10 +4541,6 @@
       </w:pPr>
       <w:bookmarkStart w:id="10" w:name="_Toc234704877"/>
       <w:r>
-        <w:rPr>
-          <w:rFonts w:ascii="Calibri" w:hAnsi="Calibri"/>
-          <w:color w:val="1A1A2E"/>
-        </w:rPr>
         <w:t>MLflow 3.14 Adaptations</w:t>
       </w:r>
       <w:bookmarkEnd w:id="10"/>
@@ -4592,10 +4604,6 @@
       </w:pPr>
       <w:bookmarkStart w:id="11" w:name="_Toc234704878"/>
       <w:r>
-        <w:rPr>
-          <w:rFonts w:ascii="Calibri" w:hAnsi="Calibri"/>
-          <w:color w:val="1A1A2E"/>
-        </w:rPr>
         <w:lastRenderedPageBreak/>
         <w:t>5. Packaging &amp; Reproducibility</w:t>
       </w:r>
@@ -4610,31 +4618,23 @@
           <w:rFonts w:ascii="Calibri" w:hAnsi="Calibri"/>
           <w:color w:val="444455"/>
         </w:rPr>
-        <w:t>The best run (argmax test ROC-AUC over full-grid runs) is exported by python -m ml.models.export to models/ in three formats:</w:t>
-      </w:r>
-    </w:p>
-    <w:p>
-      <w:pPr>
-        <w:pStyle w:val="ListBullet"/>
-      </w:pPr>
+        <w:t xml:space="preserve">The best run (argmax test ROC-AUC over full-grid runs) is exported by python -m </w:t>
+      </w:r>
+      <w:proofErr w:type="gramStart"/>
       <w:r>
         <w:rPr>
           <w:rFonts w:ascii="Calibri" w:hAnsi="Calibri"/>
           <w:color w:val="444455"/>
         </w:rPr>
-        <w:t>heart_disease_pipeline.joblib — canonical serving artifact; loads with scikit-learn + joblib only (no MLflow at inference time)</w:t>
-      </w:r>
-    </w:p>
-    <w:p>
-      <w:pPr>
-        <w:pStyle w:val="ListBullet"/>
-      </w:pPr>
+        <w:t>ml.models</w:t>
+      </w:r>
+      <w:proofErr w:type="gramEnd"/>
       <w:r>
         <w:rPr>
           <w:rFonts w:ascii="Calibri" w:hAnsi="Calibri"/>
           <w:color w:val="444455"/>
         </w:rPr>
-        <w:t>model_metadata.json — source run ID, metrics, package versions, and input schema for provenance without the MLflow store</w:t>
+        <w:t>.export to models/ in three formats:</w:t>
       </w:r>
     </w:p>
     <w:p>
@@ -4646,30 +4646,54 @@
           <w:rFonts w:ascii="Calibri" w:hAnsi="Calibri"/>
           <w:color w:val="444455"/>
         </w:rPr>
-        <w:t>mlflow_model/ — same pipeline in MLflow model format</w:t>
-      </w:r>
-    </w:p>
-    <w:p>
-      <w:pPr>
-        <w:spacing w:before="40" w:after="120"/>
+        <w:t>heart_disease_pipeline.joblib — canonical serving artifact; loads with scikit-learn + joblib only (no MLflow at inference time)</w:t>
+      </w:r>
+    </w:p>
+    <w:p>
+      <w:pPr>
+        <w:pStyle w:val="ListBullet"/>
       </w:pPr>
       <w:r>
         <w:rPr>
           <w:rFonts w:ascii="Calibri" w:hAnsi="Calibri"/>
           <w:color w:val="444455"/>
         </w:rPr>
-        <w:t>All three are committed to git. A grader or fresh clone can serve the model without retraining. Pickle version-fragility is mitigated by pinned requirements and explicit package version recording in the metadata.</w:t>
-      </w:r>
-    </w:p>
-    <w:p>
-      <w:pPr>
-        <w:spacing w:before="40" w:after="120"/>
+        <w:t>model_metadata.json — source run ID, metrics, package versions, and input schema for provenance without the MLflow store</w:t>
+      </w:r>
+    </w:p>
+    <w:p>
+      <w:pPr>
+        <w:pStyle w:val="ListBullet"/>
       </w:pPr>
       <w:r>
         <w:rPr>
           <w:rFonts w:ascii="Calibri" w:hAnsi="Calibri"/>
           <w:color w:val="444455"/>
         </w:rPr>
+        <w:t>mlflow_model/ — same pipeline in MLflow model format</w:t>
+      </w:r>
+    </w:p>
+    <w:p>
+      <w:pPr>
+        <w:spacing w:before="40" w:after="120"/>
+      </w:pPr>
+      <w:r>
+        <w:rPr>
+          <w:rFonts w:ascii="Calibri" w:hAnsi="Calibri"/>
+          <w:color w:val="444455"/>
+        </w:rPr>
+        <w:t>All three are committed to git. A grader or fresh clone can serve the model without retraining. Pickle version-fragility is mitigated by pinned requirements and explicit package version recording in the metadata.</w:t>
+      </w:r>
+    </w:p>
+    <w:p>
+      <w:pPr>
+        <w:spacing w:before="40" w:after="120"/>
+      </w:pPr>
+      <w:r>
+        <w:rPr>
+          <w:rFonts w:ascii="Calibri" w:hAnsi="Calibri"/>
+          <w:color w:val="444455"/>
+        </w:rPr>
         <w:t>Reproducibility was verified, not assumed. Installing MLflow 3.14.0 forced pandas from 3.0.3 → 2.3.3 (MLflow declares Requires-Dist: pandas&lt;3). This conflict was confirmed with pip install --dry-run and the full test suite was re-run against the downgraded pin before committing it.</w:t>
       </w:r>
     </w:p>
@@ -4684,10 +4708,6 @@
       </w:pPr>
       <w:bookmarkStart w:id="12" w:name="_Toc234704879"/>
       <w:r>
-        <w:rPr>
-          <w:rFonts w:ascii="Calibri" w:hAnsi="Calibri"/>
-          <w:color w:val="1A1A2E"/>
-        </w:rPr>
         <w:lastRenderedPageBreak/>
         <w:t>6. CI/CD Pipeline</w:t>
       </w:r>
@@ -5032,10 +5052,6 @@
       </w:pPr>
       <w:bookmarkStart w:id="13" w:name="_Toc234704880"/>
       <w:r>
-        <w:rPr>
-          <w:rFonts w:ascii="Calibri" w:hAnsi="Calibri"/>
-          <w:color w:val="1A1A2E"/>
-        </w:rPr>
         <w:lastRenderedPageBreak/>
         <w:t>7. Containerisation</w:t>
       </w:r>
@@ -5047,10 +5063,6 @@
       </w:pPr>
       <w:bookmarkStart w:id="14" w:name="_Toc234704881"/>
       <w:r>
-        <w:rPr>
-          <w:rFonts w:ascii="Calibri" w:hAnsi="Calibri"/>
-          <w:color w:val="1A1A2E"/>
-        </w:rPr>
         <w:t>Image Design</w:t>
       </w:r>
       <w:bookmarkEnd w:id="14"/>
@@ -5241,10 +5253,6 @@
       </w:pPr>
       <w:bookmarkStart w:id="15" w:name="_Toc234704882"/>
       <w:r>
-        <w:rPr>
-          <w:rFonts w:ascii="Calibri" w:hAnsi="Calibri"/>
-          <w:color w:val="1A1A2E"/>
-        </w:rPr>
         <w:t>Local Proof</w:t>
       </w:r>
       <w:bookmarkEnd w:id="15"/>
@@ -5325,10 +5333,6 @@
       </w:pPr>
       <w:bookmarkStart w:id="16" w:name="_Toc234704883"/>
       <w:r>
-        <w:rPr>
-          <w:rFonts w:ascii="Calibri" w:hAnsi="Calibri"/>
-          <w:color w:val="1A1A2E"/>
-        </w:rPr>
         <w:lastRenderedPageBreak/>
         <w:t>API Input Validation</w:t>
       </w:r>
@@ -5393,10 +5397,6 @@
       </w:pPr>
       <w:bookmarkStart w:id="17" w:name="_Toc234704884"/>
       <w:r>
-        <w:rPr>
-          <w:rFonts w:ascii="Calibri" w:hAnsi="Calibri"/>
-          <w:color w:val="1A1A2E"/>
-        </w:rPr>
         <w:lastRenderedPageBreak/>
         <w:t>8. Deployment</w:t>
       </w:r>
@@ -5408,10 +5408,6 @@
       </w:pPr>
       <w:bookmarkStart w:id="18" w:name="_Toc234704885"/>
       <w:r>
-        <w:rPr>
-          <w:rFonts w:ascii="Calibri" w:hAnsi="Calibri"/>
-          <w:color w:val="1A1A2E"/>
-        </w:rPr>
         <w:t>Kubernetes Manifests</w:t>
       </w:r>
       <w:bookmarkEnd w:id="18"/>
@@ -5470,10 +5466,6 @@
       </w:pPr>
       <w:bookmarkStart w:id="19" w:name="_Toc234704886"/>
       <w:r>
-        <w:rPr>
-          <w:rFonts w:ascii="Calibri" w:hAnsi="Calibri"/>
-          <w:color w:val="1A1A2E"/>
-        </w:rPr>
         <w:t>Verification</w:t>
       </w:r>
       <w:bookmarkEnd w:id="19"/>
@@ -5851,10 +5843,6 @@
       </w:pPr>
       <w:bookmarkStart w:id="20" w:name="_Toc234704887"/>
       <w:r>
-        <w:rPr>
-          <w:rFonts w:ascii="Calibri" w:hAnsi="Calibri"/>
-          <w:color w:val="1A1A2E"/>
-        </w:rPr>
         <w:lastRenderedPageBreak/>
         <w:t>9. Monitoring &amp; Logging</w:t>
       </w:r>
@@ -5866,10 +5854,6 @@
       </w:pPr>
       <w:bookmarkStart w:id="21" w:name="_Toc234704888"/>
       <w:r>
-        <w:rPr>
-          <w:rFonts w:ascii="Calibri" w:hAnsi="Calibri"/>
-          <w:color w:val="1A1A2E"/>
-        </w:rPr>
         <w:t>Structured Logging</w:t>
       </w:r>
       <w:bookmarkEnd w:id="21"/>
@@ -5920,10 +5904,6 @@
       </w:pPr>
       <w:bookmarkStart w:id="22" w:name="_Toc234704889"/>
       <w:r>
-        <w:rPr>
-          <w:rFonts w:ascii="Calibri" w:hAnsi="Calibri"/>
-          <w:color w:val="1A1A2E"/>
-        </w:rPr>
         <w:t>Prometheus Metrics</w:t>
       </w:r>
       <w:bookmarkEnd w:id="22"/>
@@ -5970,10 +5950,6 @@
       </w:pPr>
       <w:bookmarkStart w:id="23" w:name="_Toc234704890"/>
       <w:r>
-        <w:rPr>
-          <w:rFonts w:ascii="Calibri" w:hAnsi="Calibri"/>
-          <w:color w:val="1A1A2E"/>
-        </w:rPr>
         <w:t>Grafana Dashboard</w:t>
       </w:r>
       <w:bookmarkEnd w:id="23"/>
@@ -6169,26 +6145,17 @@
       <w:pPr>
         <w:pStyle w:val="Heading2"/>
       </w:pPr>
-      <w:bookmarkStart w:id="24" w:name="_Toc234704891"/>
-      <w:r>
-        <w:rPr>
-          <w:rFonts w:ascii="Calibri" w:hAnsi="Calibri"/>
-          <w:color w:val="1A1A2E"/>
-        </w:rPr>
-        <w:t>Known Artefact: Counter Sawtooth</w:t>
-      </w:r>
-      <w:bookmarkEnd w:id="24"/>
-    </w:p>
-    <w:p>
-      <w:pPr>
-        <w:spacing w:before="40" w:after="120"/>
-      </w:pPr>
+      <w:r>
+        <w:t>Observability Lesson: Scrape Topology</w:t>
+      </w:r>
+    </w:p>
+    <w:p>
       <w:r>
         <w:rPr>
           <w:rFonts w:ascii="Calibri" w:hAnsi="Calibri"/>
           <w:color w:val="444455"/>
         </w:rPr>
-        <w:t xml:space="preserve">The Grafana 'predictions by class' panel shows a sawtooth pattern rather than a smooth monotonic line. Prometheus scrapes the API through its LoadBalancer Service, which alternates scrapes between the two pods. Each pod accumulates its own counter independently, so Prometheus sees alternating values </w:t>
+        <w:t xml:space="preserve">Watching the dashboard during a longer traffic session exposed a real observability lesson. Prometheus initially scraped the API through its load-balancing Service, so each scrape landed on a different pod and returned that pod's independent counter. The series jumped between two values, Prometheus read every downward jump as a counter reset, and the rate panels inflated far beyond the true request </w:t>
       </w:r>
       <w:r>
         <w:rPr>
@@ -6196,19 +6163,18 @@
           <w:color w:val="444455"/>
         </w:rPr>
         <w:lastRenderedPageBreak/>
-        <w:t>from Pod A and Pod B. A headless Service (clusterIP: None) or per-pod Kubernetes service-discovery annotations would resolve this. This is documented expected demo behaviour, not a bug.</w:t>
-      </w:r>
-    </w:p>
-    <w:p/>
+        <w:t>volume. The fix was to scrape each pod directly: a headless Service plus DNS-based service discovery gives Prometheus one target per pod, per-pod counters stay monotonic, and the summed panels now report true totals. The takeaway is that scrape topology is part of metric correctness, not just plumbing.</w:t>
+      </w:r>
+    </w:p>
     <w:p>
       <w:pPr>
         <w:pStyle w:val="Heading1"/>
       </w:pPr>
-      <w:bookmarkStart w:id="25" w:name="_Toc234704892"/>
+      <w:bookmarkStart w:id="24" w:name="_Toc234704892"/>
       <w:r>
         <w:t>10. Conclusion</w:t>
       </w:r>
-      <w:bookmarkEnd w:id="25"/>
+      <w:bookmarkEnd w:id="24"/>
     </w:p>
     <w:p>
       <w:pPr>
@@ -6336,7 +6302,14 @@
           <w:rFonts w:ascii="Calibri" w:hAnsi="Calibri"/>
           <w:color w:val="444455"/>
         </w:rPr>
-        <w:t>39 unit tests covering data prep, feature engineering, export logic, and API behaviour</w:t>
+        <w:t>39-unit</w:t>
+      </w:r>
+      <w:r>
+        <w:rPr>
+          <w:rFonts w:ascii="Calibri" w:hAnsi="Calibri"/>
+          <w:color w:val="444455"/>
+        </w:rPr>
+        <w:t xml:space="preserve"> tests covering data prep, feature engineering, export logic, and API behaviour</w:t>
       </w:r>
     </w:p>
     <w:sectPr>

</xml_diff>

<commit_message>
Fixing deployment instructions and report
</commit_message>
<xml_diff>
--- a/docs/report/REPORT.docx
+++ b/docs/report/REPORT.docx
@@ -29,7 +29,25 @@
           <w:color w:val="444455"/>
           <w:sz w:val="36"/>
         </w:rPr>
-        <w:t>End-to-End MLOps Pipeline</w:t>
+        <w:t xml:space="preserve">End-to-End </w:t>
+      </w:r>
+      <w:proofErr w:type="spellStart"/>
+      <w:r>
+        <w:rPr>
+          <w:rFonts w:ascii="Calibri" w:hAnsi="Calibri"/>
+          <w:color w:val="444455"/>
+          <w:sz w:val="36"/>
+        </w:rPr>
+        <w:t>MLOps</w:t>
+      </w:r>
+      <w:proofErr w:type="spellEnd"/>
+      <w:r>
+        <w:rPr>
+          <w:rFonts w:ascii="Calibri" w:hAnsi="Calibri"/>
+          <w:color w:val="444455"/>
+          <w:sz w:val="36"/>
+        </w:rPr>
+        <w:t xml:space="preserve"> Pipeline</w:t>
       </w:r>
     </w:p>
     <w:p/>
@@ -58,48 +76,90 @@
     <w:p>
       <w:pPr>
         <w:jc w:val="center"/>
-      </w:pPr>
+        <w:rPr>
+          <w:sz w:val="32"/>
+          <w:szCs w:val="32"/>
+        </w:rPr>
+      </w:pPr>
+      <w:r>
+        <w:rPr>
+          <w:rFonts w:ascii="Calibri" w:hAnsi="Calibri"/>
+          <w:bCs/>
+          <w:sz w:val="24"/>
+        </w:rPr>
+        <w:t>Author</w:t>
+      </w:r>
       <w:r>
         <w:rPr>
           <w:rFonts w:ascii="Calibri" w:hAnsi="Calibri"/>
           <w:b/>
           <w:sz w:val="24"/>
         </w:rPr>
-        <w:t xml:space="preserve">Author: </w:t>
-      </w:r>
-      <w:r>
-        <w:rPr>
-          <w:rFonts w:ascii="Calibri" w:hAnsi="Calibri"/>
-          <w:color w:val="444455"/>
+        <w:t xml:space="preserve">: </w:t>
+      </w:r>
+      <w:r>
+        <w:rPr>
+          <w:rFonts w:ascii="Calibri" w:hAnsi="Calibri"/>
+          <w:b/>
+          <w:bCs/>
+          <w:color w:val="444455"/>
+          <w:sz w:val="36"/>
+          <w:szCs w:val="32"/>
+        </w:rPr>
+        <w:t>Adithya</w:t>
+      </w:r>
+      <w:r>
+        <w:rPr>
+          <w:rFonts w:ascii="Calibri" w:hAnsi="Calibri"/>
+          <w:b/>
+          <w:bCs/>
+          <w:color w:val="444455"/>
+          <w:sz w:val="36"/>
+          <w:szCs w:val="32"/>
+        </w:rPr>
+        <w:t xml:space="preserve"> M Sasi</w:t>
+      </w:r>
+    </w:p>
+    <w:p>
+      <w:pPr>
+        <w:jc w:val="center"/>
+      </w:pPr>
+      <w:r>
+        <w:rPr>
+          <w:rFonts w:ascii="Calibri" w:hAnsi="Calibri"/>
+          <w:bCs/>
           <w:sz w:val="24"/>
         </w:rPr>
-        <w:t>Adithya</w:t>
-      </w:r>
-    </w:p>
-    <w:p>
-      <w:pPr>
-        <w:jc w:val="center"/>
-      </w:pPr>
+        <w:t>Student ID</w:t>
+      </w:r>
       <w:r>
         <w:rPr>
           <w:rFonts w:ascii="Calibri" w:hAnsi="Calibri"/>
           <w:b/>
           <w:sz w:val="24"/>
         </w:rPr>
-        <w:t xml:space="preserve">Student ID: </w:t>
-      </w:r>
-      <w:r>
+        <w:t xml:space="preserve">: </w:t>
+      </w:r>
+      <w:r>
+        <w:rPr>
+          <w:rFonts w:ascii="Calibri" w:hAnsi="Calibri"/>
+          <w:b/>
+          <w:bCs/>
+          <w:color w:val="444455"/>
+          <w:sz w:val="32"/>
+          <w:szCs w:val="28"/>
+        </w:rPr>
+        <w:t>2024AC05785</w:t>
+      </w:r>
+    </w:p>
+    <w:p>
+      <w:pPr>
+        <w:jc w:val="center"/>
         <w:rPr>
           <w:rFonts w:ascii="Calibri" w:hAnsi="Calibri"/>
           <w:color w:val="444455"/>
           <w:sz w:val="24"/>
         </w:rPr>
-        <w:t>2024AC05785</w:t>
-      </w:r>
-    </w:p>
-    <w:p>
-      <w:pPr>
-        <w:jc w:val="center"/>
       </w:pPr>
       <w:r>
         <w:rPr>
@@ -109,21 +169,49 @@
         </w:rPr>
         <w:t xml:space="preserve">Repository: </w:t>
       </w:r>
-      <w:r>
+      <w:hyperlink r:id="rId6" w:history="1">
+        <w:r>
+          <w:rPr>
+            <w:rStyle w:val="Hyperlink"/>
+            <w:rFonts w:ascii="Calibri" w:hAnsi="Calibri"/>
+            <w:sz w:val="24"/>
+          </w:rPr>
+          <w:t>github.com/axle-bits/MLOP</w:t>
+        </w:r>
+        <w:r>
+          <w:rPr>
+            <w:rStyle w:val="Hyperlink"/>
+            <w:rFonts w:ascii="Calibri" w:hAnsi="Calibri"/>
+            <w:sz w:val="24"/>
+          </w:rPr>
+          <w:t>_</w:t>
+        </w:r>
+        <w:r>
+          <w:rPr>
+            <w:rStyle w:val="Hyperlink"/>
+            <w:rFonts w:ascii="Calibri" w:hAnsi="Calibri"/>
+            <w:sz w:val="24"/>
+          </w:rPr>
+          <w:t>Assignment_1</w:t>
+        </w:r>
+      </w:hyperlink>
+    </w:p>
+    <w:p>
+      <w:pPr>
+        <w:jc w:val="center"/>
         <w:rPr>
           <w:rFonts w:ascii="Calibri" w:hAnsi="Calibri"/>
           <w:color w:val="444455"/>
           <w:sz w:val="24"/>
         </w:rPr>
-        <w:t>github.com/axle-bits/MLOP</w:t>
-      </w:r>
+      </w:pPr>
       <w:r>
         <w:rPr>
           <w:rFonts w:ascii="Calibri" w:hAnsi="Calibri"/>
           <w:color w:val="444455"/>
           <w:sz w:val="24"/>
         </w:rPr>
-        <w:t>_</w:t>
+        <w:t>Video link:</w:t>
       </w:r>
       <w:r>
         <w:rPr>
@@ -131,8 +219,120 @@
           <w:color w:val="444455"/>
           <w:sz w:val="24"/>
         </w:rPr>
-        <w:t>Assignment_1</w:t>
-      </w:r>
+        <w:t xml:space="preserve"> </w:t>
+      </w:r>
+      <w:hyperlink r:id="rId7" w:history="1">
+        <w:r>
+          <w:rPr>
+            <w:rStyle w:val="Hyperlink"/>
+            <w:rFonts w:ascii="Calibri" w:hAnsi="Calibri"/>
+            <w:sz w:val="24"/>
+          </w:rPr>
+          <w:t>https://drive.google.com/file/d/12GAzMmTQpw9CY9JLybe19GpTXC_nFxNY/view</w:t>
+        </w:r>
+      </w:hyperlink>
+    </w:p>
+    <w:p>
+      <w:pPr>
+        <w:jc w:val="center"/>
+        <w:rPr>
+          <w:rFonts w:ascii="Calibri" w:hAnsi="Calibri"/>
+          <w:color w:val="444455"/>
+          <w:sz w:val="24"/>
+        </w:rPr>
+      </w:pPr>
+      <w:r>
+        <w:rPr>
+          <w:rFonts w:ascii="Calibri" w:hAnsi="Calibri"/>
+          <w:color w:val="444455"/>
+          <w:sz w:val="24"/>
+        </w:rPr>
+        <w:t xml:space="preserve">HQ video: </w:t>
+      </w:r>
+      <w:hyperlink r:id="rId8" w:history="1">
+        <w:r>
+          <w:rPr>
+            <w:rStyle w:val="Hyperlink"/>
+            <w:rFonts w:ascii="Calibri" w:hAnsi="Calibri"/>
+            <w:sz w:val="24"/>
+          </w:rPr>
+          <w:t>https://drive.google.com/file/d/1jHvD1IelUSfkQ5ww2sir_IIfRbP_ZC-R/view?usp=drive_link</w:t>
+        </w:r>
+      </w:hyperlink>
+    </w:p>
+    <w:p>
+      <w:pPr>
+        <w:jc w:val="center"/>
+        <w:rPr>
+          <w:rFonts w:ascii="Calibri" w:hAnsi="Calibri"/>
+          <w:color w:val="444455"/>
+          <w:sz w:val="24"/>
+        </w:rPr>
+      </w:pPr>
+      <w:proofErr w:type="spellStart"/>
+      <w:r>
+        <w:rPr>
+          <w:rFonts w:ascii="Calibri" w:hAnsi="Calibri"/>
+          <w:color w:val="444455"/>
+          <w:sz w:val="24"/>
+        </w:rPr>
+        <w:t>Youtube</w:t>
+      </w:r>
+      <w:proofErr w:type="spellEnd"/>
+      <w:r>
+        <w:rPr>
+          <w:rFonts w:ascii="Calibri" w:hAnsi="Calibri"/>
+          <w:color w:val="444455"/>
+          <w:sz w:val="24"/>
+        </w:rPr>
+        <w:t xml:space="preserve"> link: </w:t>
+      </w:r>
+      <w:hyperlink r:id="rId9" w:history="1">
+        <w:r>
+          <w:rPr>
+            <w:rStyle w:val="Hyperlink"/>
+            <w:rFonts w:ascii="Calibri" w:hAnsi="Calibri"/>
+            <w:sz w:val="24"/>
+          </w:rPr>
+          <w:t>https://youtu.be/eqm2jqW20_s?si=EdjgnevJ</w:t>
+        </w:r>
+        <w:r>
+          <w:rPr>
+            <w:rStyle w:val="Hyperlink"/>
+            <w:rFonts w:ascii="Calibri" w:hAnsi="Calibri"/>
+            <w:sz w:val="24"/>
+          </w:rPr>
+          <w:t>_</w:t>
+        </w:r>
+        <w:r>
+          <w:rPr>
+            <w:rStyle w:val="Hyperlink"/>
+            <w:rFonts w:ascii="Calibri" w:hAnsi="Calibri"/>
+            <w:sz w:val="24"/>
+          </w:rPr>
+          <w:t>TtwBY9U</w:t>
+        </w:r>
+      </w:hyperlink>
+    </w:p>
+    <w:p>
+      <w:pPr>
+        <w:jc w:val="center"/>
+        <w:rPr>
+          <w:rFonts w:ascii="Calibri" w:hAnsi="Calibri"/>
+          <w:color w:val="444455"/>
+          <w:sz w:val="24"/>
+        </w:rPr>
+      </w:pPr>
+    </w:p>
+    <w:p>
+      <w:pPr>
+        <w:jc w:val="center"/>
+        <w:rPr>
+          <w:rFonts w:ascii="Calibri" w:hAnsi="Calibri"/>
+          <w:color w:val="444455"/>
+          <w:sz w:val="24"/>
+        </w:rPr>
+      </w:pPr>
     </w:p>
     <w:p>
       <w:r>
@@ -143,7 +343,7 @@
       <w:pPr>
         <w:pStyle w:val="Heading1"/>
       </w:pPr>
-      <w:bookmarkStart w:id="0" w:name="_Toc234704867"/>
+      <w:bookmarkStart w:id="0" w:name="_Toc234758990"/>
       <w:r>
         <w:rPr>
           <w:rFonts w:ascii="Calibri" w:hAnsi="Calibri"/>
@@ -178,7 +378,7 @@
       <w:r>
         <w:fldChar w:fldCharType="separate"/>
       </w:r>
-      <w:hyperlink w:anchor="_Toc234704867" w:history="1">
+      <w:hyperlink w:anchor="_Toc234758990" w:history="1">
         <w:r>
           <w:rPr>
             <w:rStyle w:val="Hyperlink"/>
@@ -206,7 +406,7 @@
             <w:noProof/>
             <w:webHidden/>
           </w:rPr>
-          <w:instrText xml:space="preserve"> PAGEREF _Toc234704867 \h </w:instrText>
+          <w:instrText xml:space="preserve"> PAGEREF _Toc234758990 \h </w:instrText>
         </w:r>
         <w:r>
           <w:rPr>
@@ -252,11 +452,10 @@
           <w14:ligatures w14:val="standardContextual"/>
         </w:rPr>
       </w:pPr>
-      <w:hyperlink w:anchor="_Toc234704868" w:history="1">
+      <w:hyperlink w:anchor="_Toc234758991" w:history="1">
         <w:r>
           <w:rPr>
             <w:rStyle w:val="Hyperlink"/>
-            <w:rFonts w:ascii="Calibri" w:hAnsi="Calibri"/>
             <w:noProof/>
           </w:rPr>
           <w:t>1. Overview &amp; Setup</w:t>
@@ -280,7 +479,7 @@
             <w:noProof/>
             <w:webHidden/>
           </w:rPr>
-          <w:instrText xml:space="preserve"> PAGEREF _Toc234704868 \h </w:instrText>
+          <w:instrText xml:space="preserve"> PAGEREF _Toc234758991 \h </w:instrText>
         </w:r>
         <w:r>
           <w:rPr>
@@ -326,11 +525,10 @@
           <w14:ligatures w14:val="standardContextual"/>
         </w:rPr>
       </w:pPr>
-      <w:hyperlink w:anchor="_Toc234704869" w:history="1">
+      <w:hyperlink w:anchor="_Toc234758992" w:history="1">
         <w:r>
           <w:rPr>
             <w:rStyle w:val="Hyperlink"/>
-            <w:rFonts w:ascii="Calibri" w:hAnsi="Calibri"/>
             <w:noProof/>
           </w:rPr>
           <w:t>Quickstart</w:t>
@@ -354,7 +552,7 @@
             <w:noProof/>
             <w:webHidden/>
           </w:rPr>
-          <w:instrText xml:space="preserve"> PAGEREF _Toc234704869 \h </w:instrText>
+          <w:instrText xml:space="preserve"> PAGEREF _Toc234758992 \h </w:instrText>
         </w:r>
         <w:r>
           <w:rPr>
@@ -400,11 +598,10 @@
           <w14:ligatures w14:val="standardContextual"/>
         </w:rPr>
       </w:pPr>
-      <w:hyperlink w:anchor="_Toc234704870" w:history="1">
+      <w:hyperlink w:anchor="_Toc234758993" w:history="1">
         <w:r>
           <w:rPr>
             <w:rStyle w:val="Hyperlink"/>
-            <w:rFonts w:ascii="Calibri" w:hAnsi="Calibri"/>
             <w:noProof/>
           </w:rPr>
           <w:t>2. Data &amp; EDA</w:t>
@@ -428,7 +625,7 @@
             <w:noProof/>
             <w:webHidden/>
           </w:rPr>
-          <w:instrText xml:space="preserve"> PAGEREF _Toc234704870 \h </w:instrText>
+          <w:instrText xml:space="preserve"> PAGEREF _Toc234758993 \h </w:instrText>
         </w:r>
         <w:r>
           <w:rPr>
@@ -474,11 +671,10 @@
           <w14:ligatures w14:val="standardContextual"/>
         </w:rPr>
       </w:pPr>
-      <w:hyperlink w:anchor="_Toc234704871" w:history="1">
+      <w:hyperlink w:anchor="_Toc234758994" w:history="1">
         <w:r>
           <w:rPr>
             <w:rStyle w:val="Hyperlink"/>
-            <w:rFonts w:ascii="Calibri" w:hAnsi="Calibri"/>
             <w:noProof/>
           </w:rPr>
           <w:t>3. Feature Engineering &amp; Models</w:t>
@@ -502,7 +698,7 @@
             <w:noProof/>
             <w:webHidden/>
           </w:rPr>
-          <w:instrText xml:space="preserve"> PAGEREF _Toc234704871 \h </w:instrText>
+          <w:instrText xml:space="preserve"> PAGEREF _Toc234758994 \h </w:instrText>
         </w:r>
         <w:r>
           <w:rPr>
@@ -548,11 +744,10 @@
           <w14:ligatures w14:val="standardContextual"/>
         </w:rPr>
       </w:pPr>
-      <w:hyperlink w:anchor="_Toc234704872" w:history="1">
+      <w:hyperlink w:anchor="_Toc234758995" w:history="1">
         <w:r>
           <w:rPr>
             <w:rStyle w:val="Hyperlink"/>
-            <w:rFonts w:ascii="Calibri" w:hAnsi="Calibri"/>
             <w:noProof/>
           </w:rPr>
           <w:t>Derived Clinical Features</w:t>
@@ -576,7 +771,7 @@
             <w:noProof/>
             <w:webHidden/>
           </w:rPr>
-          <w:instrText xml:space="preserve"> PAGEREF _Toc234704872 \h </w:instrText>
+          <w:instrText xml:space="preserve"> PAGEREF _Toc234758995 \h </w:instrText>
         </w:r>
         <w:r>
           <w:rPr>
@@ -622,11 +817,10 @@
           <w14:ligatures w14:val="standardContextual"/>
         </w:rPr>
       </w:pPr>
-      <w:hyperlink w:anchor="_Toc234704873" w:history="1">
+      <w:hyperlink w:anchor="_Toc234758996" w:history="1">
         <w:r>
           <w:rPr>
             <w:rStyle w:val="Hyperlink"/>
-            <w:rFonts w:ascii="Calibri" w:hAnsi="Calibri"/>
             <w:noProof/>
           </w:rPr>
           <w:t>Preprocessing</w:t>
@@ -650,7 +844,7 @@
             <w:noProof/>
             <w:webHidden/>
           </w:rPr>
-          <w:instrText xml:space="preserve"> PAGEREF _Toc234704873 \h </w:instrText>
+          <w:instrText xml:space="preserve"> PAGEREF _Toc234758996 \h </w:instrText>
         </w:r>
         <w:r>
           <w:rPr>
@@ -696,11 +890,10 @@
           <w14:ligatures w14:val="standardContextual"/>
         </w:rPr>
       </w:pPr>
-      <w:hyperlink w:anchor="_Toc234704874" w:history="1">
+      <w:hyperlink w:anchor="_Toc234758997" w:history="1">
         <w:r>
           <w:rPr>
             <w:rStyle w:val="Hyperlink"/>
-            <w:rFonts w:ascii="Calibri" w:hAnsi="Calibri"/>
             <w:noProof/>
           </w:rPr>
           <w:t>Training Setup</w:t>
@@ -724,7 +917,7 @@
             <w:noProof/>
             <w:webHidden/>
           </w:rPr>
-          <w:instrText xml:space="preserve"> PAGEREF _Toc234704874 \h </w:instrText>
+          <w:instrText xml:space="preserve"> PAGEREF _Toc234758997 \h </w:instrText>
         </w:r>
         <w:r>
           <w:rPr>
@@ -770,11 +963,10 @@
           <w14:ligatures w14:val="standardContextual"/>
         </w:rPr>
       </w:pPr>
-      <w:hyperlink w:anchor="_Toc234704875" w:history="1">
+      <w:hyperlink w:anchor="_Toc234758998" w:history="1">
         <w:r>
           <w:rPr>
             <w:rStyle w:val="Hyperlink"/>
-            <w:rFonts w:ascii="Calibri" w:hAnsi="Calibri"/>
             <w:noProof/>
           </w:rPr>
           <w:t>Results</w:t>
@@ -798,7 +990,7 @@
             <w:noProof/>
             <w:webHidden/>
           </w:rPr>
-          <w:instrText xml:space="preserve"> PAGEREF _Toc234704875 \h </w:instrText>
+          <w:instrText xml:space="preserve"> PAGEREF _Toc234758998 \h </w:instrText>
         </w:r>
         <w:r>
           <w:rPr>
@@ -844,11 +1036,10 @@
           <w14:ligatures w14:val="standardContextual"/>
         </w:rPr>
       </w:pPr>
-      <w:hyperlink w:anchor="_Toc234704876" w:history="1">
+      <w:hyperlink w:anchor="_Toc234758999" w:history="1">
         <w:r>
           <w:rPr>
             <w:rStyle w:val="Hyperlink"/>
-            <w:rFonts w:ascii="Calibri" w:hAnsi="Calibri"/>
             <w:noProof/>
           </w:rPr>
           <w:t>4. Experiment Tracking</w:t>
@@ -872,7 +1063,7 @@
             <w:noProof/>
             <w:webHidden/>
           </w:rPr>
-          <w:instrText xml:space="preserve"> PAGEREF _Toc234704876 \h </w:instrText>
+          <w:instrText xml:space="preserve"> PAGEREF _Toc234758999 \h </w:instrText>
         </w:r>
         <w:r>
           <w:rPr>
@@ -918,11 +1109,10 @@
           <w14:ligatures w14:val="standardContextual"/>
         </w:rPr>
       </w:pPr>
-      <w:hyperlink w:anchor="_Toc234704877" w:history="1">
+      <w:hyperlink w:anchor="_Toc234759000" w:history="1">
         <w:r>
           <w:rPr>
             <w:rStyle w:val="Hyperlink"/>
-            <w:rFonts w:ascii="Calibri" w:hAnsi="Calibri"/>
             <w:noProof/>
           </w:rPr>
           <w:t>MLflow 3.14 Adaptations</w:t>
@@ -946,7 +1136,7 @@
             <w:noProof/>
             <w:webHidden/>
           </w:rPr>
-          <w:instrText xml:space="preserve"> PAGEREF _Toc234704877 \h </w:instrText>
+          <w:instrText xml:space="preserve"> PAGEREF _Toc234759000 \h </w:instrText>
         </w:r>
         <w:r>
           <w:rPr>
@@ -992,11 +1182,10 @@
           <w14:ligatures w14:val="standardContextual"/>
         </w:rPr>
       </w:pPr>
-      <w:hyperlink w:anchor="_Toc234704878" w:history="1">
+      <w:hyperlink w:anchor="_Toc234759001" w:history="1">
         <w:r>
           <w:rPr>
             <w:rStyle w:val="Hyperlink"/>
-            <w:rFonts w:ascii="Calibri" w:hAnsi="Calibri"/>
             <w:noProof/>
           </w:rPr>
           <w:t>5. Packaging &amp; Reproducibility</w:t>
@@ -1020,7 +1209,7 @@
             <w:noProof/>
             <w:webHidden/>
           </w:rPr>
-          <w:instrText xml:space="preserve"> PAGEREF _Toc234704878 \h </w:instrText>
+          <w:instrText xml:space="preserve"> PAGEREF _Toc234759001 \h </w:instrText>
         </w:r>
         <w:r>
           <w:rPr>
@@ -1066,11 +1255,10 @@
           <w14:ligatures w14:val="standardContextual"/>
         </w:rPr>
       </w:pPr>
-      <w:hyperlink w:anchor="_Toc234704879" w:history="1">
+      <w:hyperlink w:anchor="_Toc234759002" w:history="1">
         <w:r>
           <w:rPr>
             <w:rStyle w:val="Hyperlink"/>
-            <w:rFonts w:ascii="Calibri" w:hAnsi="Calibri"/>
             <w:noProof/>
           </w:rPr>
           <w:t>6. CI/CD Pipeline</w:t>
@@ -1094,7 +1282,7 @@
             <w:noProof/>
             <w:webHidden/>
           </w:rPr>
-          <w:instrText xml:space="preserve"> PAGEREF _Toc234704879 \h </w:instrText>
+          <w:instrText xml:space="preserve"> PAGEREF _Toc234759002 \h </w:instrText>
         </w:r>
         <w:r>
           <w:rPr>
@@ -1140,11 +1328,10 @@
           <w14:ligatures w14:val="standardContextual"/>
         </w:rPr>
       </w:pPr>
-      <w:hyperlink w:anchor="_Toc234704880" w:history="1">
+      <w:hyperlink w:anchor="_Toc234759003" w:history="1">
         <w:r>
           <w:rPr>
             <w:rStyle w:val="Hyperlink"/>
-            <w:rFonts w:ascii="Calibri" w:hAnsi="Calibri"/>
             <w:noProof/>
           </w:rPr>
           <w:t>7. Containerisation</w:t>
@@ -1168,7 +1355,7 @@
             <w:noProof/>
             <w:webHidden/>
           </w:rPr>
-          <w:instrText xml:space="preserve"> PAGEREF _Toc234704880 \h </w:instrText>
+          <w:instrText xml:space="preserve"> PAGEREF _Toc234759003 \h </w:instrText>
         </w:r>
         <w:r>
           <w:rPr>
@@ -1214,11 +1401,10 @@
           <w14:ligatures w14:val="standardContextual"/>
         </w:rPr>
       </w:pPr>
-      <w:hyperlink w:anchor="_Toc234704881" w:history="1">
+      <w:hyperlink w:anchor="_Toc234759004" w:history="1">
         <w:r>
           <w:rPr>
             <w:rStyle w:val="Hyperlink"/>
-            <w:rFonts w:ascii="Calibri" w:hAnsi="Calibri"/>
             <w:noProof/>
           </w:rPr>
           <w:t>Image Design</w:t>
@@ -1242,7 +1428,7 @@
             <w:noProof/>
             <w:webHidden/>
           </w:rPr>
-          <w:instrText xml:space="preserve"> PAGEREF _Toc234704881 \h </w:instrText>
+          <w:instrText xml:space="preserve"> PAGEREF _Toc234759004 \h </w:instrText>
         </w:r>
         <w:r>
           <w:rPr>
@@ -1288,11 +1474,10 @@
           <w14:ligatures w14:val="standardContextual"/>
         </w:rPr>
       </w:pPr>
-      <w:hyperlink w:anchor="_Toc234704882" w:history="1">
+      <w:hyperlink w:anchor="_Toc234759005" w:history="1">
         <w:r>
           <w:rPr>
             <w:rStyle w:val="Hyperlink"/>
-            <w:rFonts w:ascii="Calibri" w:hAnsi="Calibri"/>
             <w:noProof/>
           </w:rPr>
           <w:t>Local Proof</w:t>
@@ -1316,7 +1501,7 @@
             <w:noProof/>
             <w:webHidden/>
           </w:rPr>
-          <w:instrText xml:space="preserve"> PAGEREF _Toc234704882 \h </w:instrText>
+          <w:instrText xml:space="preserve"> PAGEREF _Toc234759005 \h </w:instrText>
         </w:r>
         <w:r>
           <w:rPr>
@@ -1362,11 +1547,10 @@
           <w14:ligatures w14:val="standardContextual"/>
         </w:rPr>
       </w:pPr>
-      <w:hyperlink w:anchor="_Toc234704883" w:history="1">
+      <w:hyperlink w:anchor="_Toc234759006" w:history="1">
         <w:r>
           <w:rPr>
             <w:rStyle w:val="Hyperlink"/>
-            <w:rFonts w:ascii="Calibri" w:hAnsi="Calibri"/>
             <w:noProof/>
           </w:rPr>
           <w:t>API Input Validation</w:t>
@@ -1390,7 +1574,7 @@
             <w:noProof/>
             <w:webHidden/>
           </w:rPr>
-          <w:instrText xml:space="preserve"> PAGEREF _Toc234704883 \h </w:instrText>
+          <w:instrText xml:space="preserve"> PAGEREF _Toc234759006 \h </w:instrText>
         </w:r>
         <w:r>
           <w:rPr>
@@ -1436,11 +1620,10 @@
           <w14:ligatures w14:val="standardContextual"/>
         </w:rPr>
       </w:pPr>
-      <w:hyperlink w:anchor="_Toc234704884" w:history="1">
+      <w:hyperlink w:anchor="_Toc234759007" w:history="1">
         <w:r>
           <w:rPr>
             <w:rStyle w:val="Hyperlink"/>
-            <w:rFonts w:ascii="Calibri" w:hAnsi="Calibri"/>
             <w:noProof/>
           </w:rPr>
           <w:t>8. Deployment</w:t>
@@ -1464,7 +1647,7 @@
             <w:noProof/>
             <w:webHidden/>
           </w:rPr>
-          <w:instrText xml:space="preserve"> PAGEREF _Toc234704884 \h </w:instrText>
+          <w:instrText xml:space="preserve"> PAGEREF _Toc234759007 \h </w:instrText>
         </w:r>
         <w:r>
           <w:rPr>
@@ -1510,11 +1693,10 @@
           <w14:ligatures w14:val="standardContextual"/>
         </w:rPr>
       </w:pPr>
-      <w:hyperlink w:anchor="_Toc234704885" w:history="1">
+      <w:hyperlink w:anchor="_Toc234759008" w:history="1">
         <w:r>
           <w:rPr>
             <w:rStyle w:val="Hyperlink"/>
-            <w:rFonts w:ascii="Calibri" w:hAnsi="Calibri"/>
             <w:noProof/>
           </w:rPr>
           <w:t>Kubernetes Manifests</w:t>
@@ -1538,7 +1720,7 @@
             <w:noProof/>
             <w:webHidden/>
           </w:rPr>
-          <w:instrText xml:space="preserve"> PAGEREF _Toc234704885 \h </w:instrText>
+          <w:instrText xml:space="preserve"> PAGEREF _Toc234759008 \h </w:instrText>
         </w:r>
         <w:r>
           <w:rPr>
@@ -1584,11 +1766,10 @@
           <w14:ligatures w14:val="standardContextual"/>
         </w:rPr>
       </w:pPr>
-      <w:hyperlink w:anchor="_Toc234704886" w:history="1">
+      <w:hyperlink w:anchor="_Toc234759009" w:history="1">
         <w:r>
           <w:rPr>
             <w:rStyle w:val="Hyperlink"/>
-            <w:rFonts w:ascii="Calibri" w:hAnsi="Calibri"/>
             <w:noProof/>
           </w:rPr>
           <w:t>Verification</w:t>
@@ -1612,7 +1793,7 @@
             <w:noProof/>
             <w:webHidden/>
           </w:rPr>
-          <w:instrText xml:space="preserve"> PAGEREF _Toc234704886 \h </w:instrText>
+          <w:instrText xml:space="preserve"> PAGEREF _Toc234759009 \h </w:instrText>
         </w:r>
         <w:r>
           <w:rPr>
@@ -1658,11 +1839,10 @@
           <w14:ligatures w14:val="standardContextual"/>
         </w:rPr>
       </w:pPr>
-      <w:hyperlink w:anchor="_Toc234704887" w:history="1">
+      <w:hyperlink w:anchor="_Toc234759010" w:history="1">
         <w:r>
           <w:rPr>
             <w:rStyle w:val="Hyperlink"/>
-            <w:rFonts w:ascii="Calibri" w:hAnsi="Calibri"/>
             <w:noProof/>
           </w:rPr>
           <w:t>9. Monitoring &amp; Logging</w:t>
@@ -1686,7 +1866,7 @@
             <w:noProof/>
             <w:webHidden/>
           </w:rPr>
-          <w:instrText xml:space="preserve"> PAGEREF _Toc234704887 \h </w:instrText>
+          <w:instrText xml:space="preserve"> PAGEREF _Toc234759010 \h </w:instrText>
         </w:r>
         <w:r>
           <w:rPr>
@@ -1732,11 +1912,10 @@
           <w14:ligatures w14:val="standardContextual"/>
         </w:rPr>
       </w:pPr>
-      <w:hyperlink w:anchor="_Toc234704888" w:history="1">
+      <w:hyperlink w:anchor="_Toc234759011" w:history="1">
         <w:r>
           <w:rPr>
             <w:rStyle w:val="Hyperlink"/>
-            <w:rFonts w:ascii="Calibri" w:hAnsi="Calibri"/>
             <w:noProof/>
           </w:rPr>
           <w:t>Structured Logging</w:t>
@@ -1760,7 +1939,7 @@
             <w:noProof/>
             <w:webHidden/>
           </w:rPr>
-          <w:instrText xml:space="preserve"> PAGEREF _Toc234704888 \h </w:instrText>
+          <w:instrText xml:space="preserve"> PAGEREF _Toc234759011 \h </w:instrText>
         </w:r>
         <w:r>
           <w:rPr>
@@ -1806,11 +1985,10 @@
           <w14:ligatures w14:val="standardContextual"/>
         </w:rPr>
       </w:pPr>
-      <w:hyperlink w:anchor="_Toc234704889" w:history="1">
+      <w:hyperlink w:anchor="_Toc234759012" w:history="1">
         <w:r>
           <w:rPr>
             <w:rStyle w:val="Hyperlink"/>
-            <w:rFonts w:ascii="Calibri" w:hAnsi="Calibri"/>
             <w:noProof/>
           </w:rPr>
           <w:t>Prometheus Metrics</w:t>
@@ -1834,7 +2012,7 @@
             <w:noProof/>
             <w:webHidden/>
           </w:rPr>
-          <w:instrText xml:space="preserve"> PAGEREF _Toc234704889 \h </w:instrText>
+          <w:instrText xml:space="preserve"> PAGEREF _Toc234759012 \h </w:instrText>
         </w:r>
         <w:r>
           <w:rPr>
@@ -1880,11 +2058,10 @@
           <w14:ligatures w14:val="standardContextual"/>
         </w:rPr>
       </w:pPr>
-      <w:hyperlink w:anchor="_Toc234704890" w:history="1">
+      <w:hyperlink w:anchor="_Toc234759013" w:history="1">
         <w:r>
           <w:rPr>
             <w:rStyle w:val="Hyperlink"/>
-            <w:rFonts w:ascii="Calibri" w:hAnsi="Calibri"/>
             <w:noProof/>
           </w:rPr>
           <w:t>Grafana Dashboard</w:t>
@@ -1908,7 +2085,7 @@
             <w:noProof/>
             <w:webHidden/>
           </w:rPr>
-          <w:instrText xml:space="preserve"> PAGEREF _Toc234704890 \h </w:instrText>
+          <w:instrText xml:space="preserve"> PAGEREF _Toc234759013 \h </w:instrText>
         </w:r>
         <w:r>
           <w:rPr>
@@ -1954,14 +2131,13 @@
           <w14:ligatures w14:val="standardContextual"/>
         </w:rPr>
       </w:pPr>
-      <w:hyperlink w:anchor="_Toc234704891" w:history="1">
+      <w:hyperlink w:anchor="_Toc234759014" w:history="1">
         <w:r>
           <w:rPr>
             <w:rStyle w:val="Hyperlink"/>
-            <w:rFonts w:ascii="Calibri" w:hAnsi="Calibri"/>
-            <w:noProof/>
-          </w:rPr>
-          <w:t>Known Artefact: Counter Sawtooth</w:t>
+            <w:noProof/>
+          </w:rPr>
+          <w:t>Observability Lesson: Scrape Topology</w:t>
         </w:r>
         <w:r>
           <w:rPr>
@@ -1982,7 +2158,7 @@
             <w:noProof/>
             <w:webHidden/>
           </w:rPr>
-          <w:instrText xml:space="preserve"> PAGEREF _Toc234704891 \h </w:instrText>
+          <w:instrText xml:space="preserve"> PAGEREF _Toc234759014 \h </w:instrText>
         </w:r>
         <w:r>
           <w:rPr>
@@ -2028,7 +2204,7 @@
           <w14:ligatures w14:val="standardContextual"/>
         </w:rPr>
       </w:pPr>
-      <w:hyperlink w:anchor="_Toc234704892" w:history="1">
+      <w:hyperlink w:anchor="_Toc234759015" w:history="1">
         <w:r>
           <w:rPr>
             <w:rStyle w:val="Hyperlink"/>
@@ -2055,7 +2231,7 @@
             <w:noProof/>
             <w:webHidden/>
           </w:rPr>
-          <w:instrText xml:space="preserve"> PAGEREF _Toc234704892 \h </w:instrText>
+          <w:instrText xml:space="preserve"> PAGEREF _Toc234759015 \h </w:instrText>
         </w:r>
         <w:r>
           <w:rPr>
@@ -2098,7 +2274,7 @@
       <w:pPr>
         <w:pStyle w:val="Heading1"/>
       </w:pPr>
-      <w:bookmarkStart w:id="1" w:name="_Toc234704868"/>
+      <w:bookmarkStart w:id="1" w:name="_Toc234758991"/>
       <w:r>
         <w:lastRenderedPageBreak/>
         <w:t>1. Overview &amp; Setup</w:t>
@@ -2114,7 +2290,39 @@
           <w:rFonts w:ascii="Calibri" w:hAnsi="Calibri"/>
           <w:color w:val="444455"/>
         </w:rPr>
-        <w:t>This project builds an end-to-end MLOps pipeline around a binary classifier that predicts heart disease risk from 13 clinical features in the UCI Cleveland dataset. The goal was to evidence every stage of a production ML lifecycle: reproducible data preparation, tracked experimentation, automated testing and CI/CD, containerised serving, Kubernetes deployment, and monitoring. Every non-trivial choice along the way is recorded and justified, not assumed.</w:t>
+        <w:t xml:space="preserve">This project builds an end-to-end </w:t>
+      </w:r>
+      <w:proofErr w:type="spellStart"/>
+      <w:r>
+        <w:rPr>
+          <w:rFonts w:ascii="Calibri" w:hAnsi="Calibri"/>
+          <w:color w:val="444455"/>
+        </w:rPr>
+        <w:t>MLOps</w:t>
+      </w:r>
+      <w:proofErr w:type="spellEnd"/>
+      <w:r>
+        <w:rPr>
+          <w:rFonts w:ascii="Calibri" w:hAnsi="Calibri"/>
+          <w:color w:val="444455"/>
+        </w:rPr>
+        <w:t xml:space="preserve"> pipeline around a binary classifier that predicts heart disease risk from 13 clinical features in the UCI Cleveland dataset. The goal was to evidence every stage of a production ML lifecycle: reproducible data preparation, tracked experimentation, automated testing and CI/CD, </w:t>
+      </w:r>
+      <w:proofErr w:type="spellStart"/>
+      <w:r>
+        <w:rPr>
+          <w:rFonts w:ascii="Calibri" w:hAnsi="Calibri"/>
+          <w:color w:val="444455"/>
+        </w:rPr>
+        <w:t>containerised</w:t>
+      </w:r>
+      <w:proofErr w:type="spellEnd"/>
+      <w:r>
+        <w:rPr>
+          <w:rFonts w:ascii="Calibri" w:hAnsi="Calibri"/>
+          <w:color w:val="444455"/>
+        </w:rPr>
+        <w:t xml:space="preserve"> serving, Kubernetes deployment, and monitoring. Every non-trivial choice along the way is recorded and justified, not assumed.</w:t>
       </w:r>
     </w:p>
     <w:p>
@@ -2126,7 +2334,23 @@
           <w:rFonts w:ascii="Calibri" w:hAnsi="Calibri"/>
           <w:color w:val="444455"/>
         </w:rPr>
-        <w:t>The repository is organised around a stage-oriented layout that maps 1:1 onto CI/CD stages:</w:t>
+        <w:t xml:space="preserve">The repository is </w:t>
+      </w:r>
+      <w:proofErr w:type="spellStart"/>
+      <w:r>
+        <w:rPr>
+          <w:rFonts w:ascii="Calibri" w:hAnsi="Calibri"/>
+          <w:color w:val="444455"/>
+        </w:rPr>
+        <w:t>organised</w:t>
+      </w:r>
+      <w:proofErr w:type="spellEnd"/>
+      <w:r>
+        <w:rPr>
+          <w:rFonts w:ascii="Calibri" w:hAnsi="Calibri"/>
+          <w:color w:val="444455"/>
+        </w:rPr>
+        <w:t xml:space="preserve"> around a stage-oriented layout that maps 1:1 onto CI/CD stages:</w:t>
       </w:r>
     </w:p>
     <w:p>
@@ -2145,12 +2369,53 @@
       <w:pPr>
         <w:pStyle w:val="ListBullet"/>
       </w:pPr>
-      <w:r>
-        <w:rPr>
-          <w:rFonts w:ascii="Calibri" w:hAnsi="Calibri"/>
-          <w:color w:val="444455"/>
-        </w:rPr>
-        <w:t>api/  — FastAPI serving code and Pydantic schemas</w:t>
+      <w:proofErr w:type="spellStart"/>
+      <w:r>
+        <w:rPr>
+          <w:rFonts w:ascii="Calibri" w:hAnsi="Calibri"/>
+          <w:color w:val="444455"/>
+        </w:rPr>
+        <w:t>api</w:t>
+      </w:r>
+      <w:proofErr w:type="spellEnd"/>
+      <w:r>
+        <w:rPr>
+          <w:rFonts w:ascii="Calibri" w:hAnsi="Calibri"/>
+          <w:color w:val="444455"/>
+        </w:rPr>
+        <w:t xml:space="preserve">/  — </w:t>
+      </w:r>
+      <w:proofErr w:type="spellStart"/>
+      <w:r>
+        <w:rPr>
+          <w:rFonts w:ascii="Calibri" w:hAnsi="Calibri"/>
+          <w:color w:val="444455"/>
+        </w:rPr>
+        <w:t>FastAPI</w:t>
+      </w:r>
+      <w:proofErr w:type="spellEnd"/>
+      <w:r>
+        <w:rPr>
+          <w:rFonts w:ascii="Calibri" w:hAnsi="Calibri"/>
+          <w:color w:val="444455"/>
+        </w:rPr>
+        <w:t xml:space="preserve"> serving code and </w:t>
+      </w:r>
+      <w:proofErr w:type="spellStart"/>
+      <w:r>
+        <w:rPr>
+          <w:rFonts w:ascii="Calibri" w:hAnsi="Calibri"/>
+          <w:color w:val="444455"/>
+        </w:rPr>
+        <w:t>Pydantic</w:t>
+      </w:r>
+      <w:proofErr w:type="spellEnd"/>
+      <w:r>
+        <w:rPr>
+          <w:rFonts w:ascii="Calibri" w:hAnsi="Calibri"/>
+          <w:color w:val="444455"/>
+        </w:rPr>
+        <w:t xml:space="preserve"> schemas</w:t>
       </w:r>
     </w:p>
     <w:p>
@@ -2162,7 +2427,23 @@
           <w:rFonts w:ascii="Calibri" w:hAnsi="Calibri"/>
           <w:color w:val="444455"/>
         </w:rPr>
-        <w:t>infra/  — Dockerfile and Kubernetes manifests</w:t>
+        <w:t xml:space="preserve">infra/  — </w:t>
+      </w:r>
+      <w:proofErr w:type="spellStart"/>
+      <w:r>
+        <w:rPr>
+          <w:rFonts w:ascii="Calibri" w:hAnsi="Calibri"/>
+          <w:color w:val="444455"/>
+        </w:rPr>
+        <w:t>Dockerfile</w:t>
+      </w:r>
+      <w:proofErr w:type="spellEnd"/>
+      <w:r>
+        <w:rPr>
+          <w:rFonts w:ascii="Calibri" w:hAnsi="Calibri"/>
+          <w:color w:val="444455"/>
+        </w:rPr>
+        <w:t xml:space="preserve"> and Kubernetes manifests</w:t>
       </w:r>
     </w:p>
     <w:p>
@@ -2174,7 +2455,23 @@
           <w:rFonts w:ascii="Calibri" w:hAnsi="Calibri"/>
           <w:color w:val="444455"/>
         </w:rPr>
-        <w:t>tests/  — 39 pytest unit and integration tests</w:t>
+        <w:t xml:space="preserve">tests/  — 39 </w:t>
+      </w:r>
+      <w:proofErr w:type="spellStart"/>
+      <w:r>
+        <w:rPr>
+          <w:rFonts w:ascii="Calibri" w:hAnsi="Calibri"/>
+          <w:color w:val="444455"/>
+        </w:rPr>
+        <w:t>pytest</w:t>
+      </w:r>
+      <w:proofErr w:type="spellEnd"/>
+      <w:r>
+        <w:rPr>
+          <w:rFonts w:ascii="Calibri" w:hAnsi="Calibri"/>
+          <w:color w:val="444455"/>
+        </w:rPr>
+        <w:t xml:space="preserve"> unit and integration tests</w:t>
       </w:r>
     </w:p>
     <w:p>
@@ -2186,7 +2483,23 @@
           <w:rFonts w:ascii="Calibri" w:hAnsi="Calibri"/>
           <w:color w:val="444455"/>
         </w:rPr>
-        <w:t>notebooks/  — jupytext-paired EDA and model-comparison notebooks</w:t>
+        <w:t xml:space="preserve">notebooks/  — </w:t>
+      </w:r>
+      <w:proofErr w:type="spellStart"/>
+      <w:r>
+        <w:rPr>
+          <w:rFonts w:ascii="Calibri" w:hAnsi="Calibri"/>
+          <w:color w:val="444455"/>
+        </w:rPr>
+        <w:t>jupytext</w:t>
+      </w:r>
+      <w:proofErr w:type="spellEnd"/>
+      <w:r>
+        <w:rPr>
+          <w:rFonts w:ascii="Calibri" w:hAnsi="Calibri"/>
+          <w:color w:val="444455"/>
+        </w:rPr>
+        <w:t>-paired EDA and model-comparison notebooks</w:t>
       </w:r>
     </w:p>
     <w:p>
@@ -2238,7 +2551,7 @@
                     <pic:cNvPicPr/>
                   </pic:nvPicPr>
                   <pic:blipFill>
-                    <a:blip r:embed="rId6"/>
+                    <a:blip r:embed="rId10"/>
                     <a:stretch>
                       <a:fillRect/>
                     </a:stretch>
@@ -2276,11 +2589,13 @@
       <w:pPr>
         <w:pStyle w:val="Heading2"/>
       </w:pPr>
-      <w:bookmarkStart w:id="2" w:name="_Toc234704869"/>
+      <w:bookmarkStart w:id="2" w:name="_Toc234758992"/>
+      <w:proofErr w:type="spellStart"/>
       <w:r>
         <w:t>Quickstart</w:t>
       </w:r>
       <w:bookmarkEnd w:id="2"/>
+      <w:proofErr w:type="spellEnd"/>
     </w:p>
     <w:p>
       <w:pPr>
@@ -2296,6 +2611,7 @@
         </w:rPr>
         <w:t xml:space="preserve">python -m </w:t>
       </w:r>
+      <w:proofErr w:type="spellStart"/>
       <w:proofErr w:type="gramStart"/>
       <w:r>
         <w:rPr>
@@ -2303,26 +2619,27 @@
           <w:color w:val="1E1E1E"/>
           <w:sz w:val="19"/>
         </w:rPr>
-        <w:t>venv .venv</w:t>
-      </w:r>
-      <w:proofErr w:type="gramEnd"/>
+        <w:t>venv</w:t>
+      </w:r>
+      <w:proofErr w:type="spellEnd"/>
       <w:r>
         <w:rPr>
           <w:rFonts w:ascii="Courier New" w:hAnsi="Courier New"/>
           <w:color w:val="1E1E1E"/>
           <w:sz w:val="19"/>
         </w:rPr>
-        <w:t xml:space="preserve"> &amp;</w:t>
-      </w:r>
-      <w:proofErr w:type="gramStart"/>
+        <w:t xml:space="preserve"> .</w:t>
+      </w:r>
+      <w:proofErr w:type="spellStart"/>
       <w:r>
         <w:rPr>
           <w:rFonts w:ascii="Courier New" w:hAnsi="Courier New"/>
           <w:color w:val="1E1E1E"/>
           <w:sz w:val="19"/>
         </w:rPr>
-        <w:t>&amp; .venv</w:t>
-      </w:r>
+        <w:t>venv</w:t>
+      </w:r>
+      <w:proofErr w:type="spellEnd"/>
       <w:proofErr w:type="gramEnd"/>
       <w:r>
         <w:rPr>
@@ -2330,6 +2647,34 @@
           <w:color w:val="1E1E1E"/>
           <w:sz w:val="19"/>
         </w:rPr>
+        <w:t xml:space="preserve"> &amp;</w:t>
+      </w:r>
+      <w:proofErr w:type="gramStart"/>
+      <w:r>
+        <w:rPr>
+          <w:rFonts w:ascii="Courier New" w:hAnsi="Courier New"/>
+          <w:color w:val="1E1E1E"/>
+          <w:sz w:val="19"/>
+        </w:rPr>
+        <w:t>&amp; .</w:t>
+      </w:r>
+      <w:proofErr w:type="spellStart"/>
+      <w:r>
+        <w:rPr>
+          <w:rFonts w:ascii="Courier New" w:hAnsi="Courier New"/>
+          <w:color w:val="1E1E1E"/>
+          <w:sz w:val="19"/>
+        </w:rPr>
+        <w:t>venv</w:t>
+      </w:r>
+      <w:proofErr w:type="spellEnd"/>
+      <w:proofErr w:type="gramEnd"/>
+      <w:r>
+        <w:rPr>
+          <w:rFonts w:ascii="Courier New" w:hAnsi="Courier New"/>
+          <w:color w:val="1E1E1E"/>
+          <w:sz w:val="19"/>
+        </w:rPr>
         <w:t>/Scripts/activate</w:t>
       </w:r>
     </w:p>
@@ -2373,8 +2718,18 @@
           <w:color w:val="1E1E1E"/>
           <w:sz w:val="19"/>
         </w:rPr>
-        <w:t>python -m ml.models.train</w:t>
-      </w:r>
+        <w:t xml:space="preserve">python -m </w:t>
+      </w:r>
+      <w:proofErr w:type="spellStart"/>
+      <w:r>
+        <w:rPr>
+          <w:rFonts w:ascii="Courier New" w:hAnsi="Courier New"/>
+          <w:color w:val="1E1E1E"/>
+          <w:sz w:val="19"/>
+        </w:rPr>
+        <w:t>ml.models.train</w:t>
+      </w:r>
+      <w:proofErr w:type="spellEnd"/>
     </w:p>
     <w:p>
       <w:pPr>
@@ -2382,13 +2737,41 @@
         <w:spacing w:after="0"/>
         <w:ind w:left="283"/>
       </w:pPr>
+      <w:proofErr w:type="spellStart"/>
       <w:r>
         <w:rPr>
           <w:rFonts w:ascii="Courier New" w:hAnsi="Courier New"/>
           <w:color w:val="1E1E1E"/>
           <w:sz w:val="19"/>
         </w:rPr>
-        <w:t>uvicorn api.main:app --reload --port 8000</w:t>
+        <w:t>uvicorn</w:t>
+      </w:r>
+      <w:proofErr w:type="spellEnd"/>
+      <w:r>
+        <w:rPr>
+          <w:rFonts w:ascii="Courier New" w:hAnsi="Courier New"/>
+          <w:color w:val="1E1E1E"/>
+          <w:sz w:val="19"/>
+        </w:rPr>
+        <w:t xml:space="preserve"> </w:t>
+      </w:r>
+      <w:proofErr w:type="spellStart"/>
+      <w:r>
+        <w:rPr>
+          <w:rFonts w:ascii="Courier New" w:hAnsi="Courier New"/>
+          <w:color w:val="1E1E1E"/>
+          <w:sz w:val="19"/>
+        </w:rPr>
+        <w:t>api.main:app</w:t>
+      </w:r>
+      <w:proofErr w:type="spellEnd"/>
+      <w:r>
+        <w:rPr>
+          <w:rFonts w:ascii="Courier New" w:hAnsi="Courier New"/>
+          <w:color w:val="1E1E1E"/>
+          <w:sz w:val="19"/>
+        </w:rPr>
+        <w:t xml:space="preserve"> --reload --port 8000</w:t>
       </w:r>
     </w:p>
     <w:p/>
@@ -2401,7 +2784,23 @@
           <w:rFonts w:ascii="Calibri" w:hAnsi="Calibri"/>
           <w:color w:val="444455"/>
         </w:rPr>
-        <w:t>Or run containerised and on Kubernetes:</w:t>
+        <w:t xml:space="preserve">Or run </w:t>
+      </w:r>
+      <w:proofErr w:type="spellStart"/>
+      <w:r>
+        <w:rPr>
+          <w:rFonts w:ascii="Calibri" w:hAnsi="Calibri"/>
+          <w:color w:val="444455"/>
+        </w:rPr>
+        <w:t>containerised</w:t>
+      </w:r>
+      <w:proofErr w:type="spellEnd"/>
+      <w:r>
+        <w:rPr>
+          <w:rFonts w:ascii="Calibri" w:hAnsi="Calibri"/>
+          <w:color w:val="444455"/>
+        </w:rPr>
+        <w:t xml:space="preserve"> and on Kubernetes:</w:t>
       </w:r>
     </w:p>
     <w:p>
@@ -2416,7 +2815,43 @@
           <w:color w:val="1E1E1E"/>
           <w:sz w:val="19"/>
         </w:rPr>
-        <w:t>docker build -t heart-disease-api -f infra/Dockerfile .</w:t>
+        <w:t>docker build -t heart-disease-</w:t>
+      </w:r>
+      <w:proofErr w:type="spellStart"/>
+      <w:r>
+        <w:rPr>
+          <w:rFonts w:ascii="Courier New" w:hAnsi="Courier New"/>
+          <w:color w:val="1E1E1E"/>
+          <w:sz w:val="19"/>
+        </w:rPr>
+        <w:t>api</w:t>
+      </w:r>
+      <w:proofErr w:type="spellEnd"/>
+      <w:r>
+        <w:rPr>
+          <w:rFonts w:ascii="Courier New" w:hAnsi="Courier New"/>
+          <w:color w:val="1E1E1E"/>
+          <w:sz w:val="19"/>
+        </w:rPr>
+        <w:t xml:space="preserve"> -f infra/</w:t>
+      </w:r>
+      <w:proofErr w:type="spellStart"/>
+      <w:r>
+        <w:rPr>
+          <w:rFonts w:ascii="Courier New" w:hAnsi="Courier New"/>
+          <w:color w:val="1E1E1E"/>
+          <w:sz w:val="19"/>
+        </w:rPr>
+        <w:t>Dockerfile</w:t>
+      </w:r>
+      <w:proofErr w:type="spellEnd"/>
+      <w:r>
+        <w:rPr>
+          <w:rFonts w:ascii="Courier New" w:hAnsi="Courier New"/>
+          <w:color w:val="1E1E1E"/>
+          <w:sz w:val="19"/>
+        </w:rPr>
+        <w:t xml:space="preserve"> .</w:t>
       </w:r>
     </w:p>
     <w:p>
@@ -2431,8 +2866,18 @@
           <w:color w:val="1E1E1E"/>
           <w:sz w:val="19"/>
         </w:rPr>
-        <w:t>docker run -d -p 8000:8000 heart-disease-api</w:t>
-      </w:r>
+        <w:t>docker run -d -p 8000:8000 heart-disease-</w:t>
+      </w:r>
+      <w:proofErr w:type="spellStart"/>
+      <w:r>
+        <w:rPr>
+          <w:rFonts w:ascii="Courier New" w:hAnsi="Courier New"/>
+          <w:color w:val="1E1E1E"/>
+          <w:sz w:val="19"/>
+        </w:rPr>
+        <w:t>api</w:t>
+      </w:r>
+      <w:proofErr w:type="spellEnd"/>
     </w:p>
     <w:p>
       <w:pPr>
@@ -2440,13 +2885,23 @@
         <w:spacing w:after="0"/>
         <w:ind w:left="283"/>
       </w:pPr>
+      <w:proofErr w:type="spellStart"/>
       <w:r>
         <w:rPr>
           <w:rFonts w:ascii="Courier New" w:hAnsi="Courier New"/>
           <w:color w:val="1E1E1E"/>
           <w:sz w:val="19"/>
         </w:rPr>
-        <w:t>kubectl apply -f infra/k8s/</w:t>
+        <w:t>kubectl</w:t>
+      </w:r>
+      <w:proofErr w:type="spellEnd"/>
+      <w:r>
+        <w:rPr>
+          <w:rFonts w:ascii="Courier New" w:hAnsi="Courier New"/>
+          <w:color w:val="1E1E1E"/>
+          <w:sz w:val="19"/>
+        </w:rPr>
+        <w:t xml:space="preserve"> apply -f infra/k8s/</w:t>
       </w:r>
     </w:p>
     <w:p/>
@@ -2459,7 +2914,23 @@
           <w:rFonts w:ascii="Calibri" w:hAnsi="Calibri"/>
           <w:color w:val="444455"/>
         </w:rPr>
-        <w:t>Run the test suite with pytest and the lint gate with ruff check . before touching anything else, to confirm the committed pipeline is clean. The remaining sections follow the same order as the assignment's nine tasks.</w:t>
+        <w:t xml:space="preserve">Run the test suite with </w:t>
+      </w:r>
+      <w:proofErr w:type="spellStart"/>
+      <w:r>
+        <w:rPr>
+          <w:rFonts w:ascii="Calibri" w:hAnsi="Calibri"/>
+          <w:color w:val="444455"/>
+        </w:rPr>
+        <w:t>pytest</w:t>
+      </w:r>
+      <w:proofErr w:type="spellEnd"/>
+      <w:r>
+        <w:rPr>
+          <w:rFonts w:ascii="Calibri" w:hAnsi="Calibri"/>
+          <w:color w:val="444455"/>
+        </w:rPr>
+        <w:t xml:space="preserve"> and the lint gate with ruff check . before touching anything else, to confirm the committed pipeline is clean. The remaining sections follow the same order as the assignment's nine tasks.</w:t>
       </w:r>
     </w:p>
     <w:p>
@@ -2471,7 +2942,7 @@
       <w:pPr>
         <w:pStyle w:val="Heading1"/>
       </w:pPr>
-      <w:bookmarkStart w:id="3" w:name="_Toc234704870"/>
+      <w:bookmarkStart w:id="3" w:name="_Toc234758993"/>
       <w:r>
         <w:lastRenderedPageBreak/>
         <w:t>2. Data &amp; EDA</w:t>
@@ -2487,7 +2958,23 @@
           <w:rFonts w:ascii="Calibri" w:hAnsi="Calibri"/>
           <w:color w:val="444455"/>
         </w:rPr>
-        <w:t>The dataset is the classic Cleveland subset of the UCI Heart Disease repository, fetched programmatically via ucimlrepo (id=45). This returns exactly 303 rows × 13 features and matches the assignment's dataset link. The combined four-site dataset (~920 rows) was rejected because it is not what id=45 serves.</w:t>
+        <w:t xml:space="preserve">The dataset is the classic Cleveland subset of the UCI Heart Disease repository, fetched programmatically via </w:t>
+      </w:r>
+      <w:proofErr w:type="spellStart"/>
+      <w:r>
+        <w:rPr>
+          <w:rFonts w:ascii="Calibri" w:hAnsi="Calibri"/>
+          <w:color w:val="444455"/>
+        </w:rPr>
+        <w:t>ucimlrepo</w:t>
+      </w:r>
+      <w:proofErr w:type="spellEnd"/>
+      <w:r>
+        <w:rPr>
+          <w:rFonts w:ascii="Calibri" w:hAnsi="Calibri"/>
+          <w:color w:val="444455"/>
+        </w:rPr>
+        <w:t xml:space="preserve"> (id=45). This returns exactly 303 rows × 13 features and matches the assignment's dataset link. The combined four-site dataset (~920 rows) was rejected because it is not what id=45 serves.</w:t>
       </w:r>
     </w:p>
     <w:p>
@@ -2499,7 +2986,39 @@
           <w:rFonts w:ascii="Calibri" w:hAnsi="Calibri"/>
           <w:color w:val="444455"/>
         </w:rPr>
-        <w:t>The raw multi-class target num (0–4, distribution 164/55/36/35/13) was binarised to 0 (no disease) vs 1 (disease present), the established 0-vs-rest convention. Six rows (2% of data) with missing ca (4 rows) or thal (2 rows) values were dropped rather than imputed — both are categorical clinical measurements where imputation would invent clinical facts. This leaves 297 rows with a class balance of 160 no-disease vs 137 disease cases.</w:t>
+        <w:t xml:space="preserve">The raw multi-class target num (0–4, distribution 164/55/36/35/13) was </w:t>
+      </w:r>
+      <w:proofErr w:type="spellStart"/>
+      <w:r>
+        <w:rPr>
+          <w:rFonts w:ascii="Calibri" w:hAnsi="Calibri"/>
+          <w:color w:val="444455"/>
+        </w:rPr>
+        <w:t>binarised</w:t>
+      </w:r>
+      <w:proofErr w:type="spellEnd"/>
+      <w:r>
+        <w:rPr>
+          <w:rFonts w:ascii="Calibri" w:hAnsi="Calibri"/>
+          <w:color w:val="444455"/>
+        </w:rPr>
+        <w:t xml:space="preserve"> to 0 (no disease) vs 1 (disease present), the established 0-vs-rest convention. Six rows (2% of data) with missing ca (4 rows) or </w:t>
+      </w:r>
+      <w:proofErr w:type="spellStart"/>
+      <w:r>
+        <w:rPr>
+          <w:rFonts w:ascii="Calibri" w:hAnsi="Calibri"/>
+          <w:color w:val="444455"/>
+        </w:rPr>
+        <w:t>thal</w:t>
+      </w:r>
+      <w:proofErr w:type="spellEnd"/>
+      <w:r>
+        <w:rPr>
+          <w:rFonts w:ascii="Calibri" w:hAnsi="Calibri"/>
+          <w:color w:val="444455"/>
+        </w:rPr>
+        <w:t xml:space="preserve"> (2 rows) values were dropped rather than imputed — both are categorical clinical measurements where imputation would invent clinical facts. This leaves 297 rows with a class balance of 160 no-disease vs 137 disease cases.</w:t>
       </w:r>
     </w:p>
     <w:p>
@@ -2526,7 +3045,7 @@
                     <pic:cNvPicPr/>
                   </pic:nvPicPr>
                   <pic:blipFill>
-                    <a:blip r:embed="rId7"/>
+                    <a:blip r:embed="rId11"/>
                     <a:stretch>
                       <a:fillRect/>
                     </a:stretch>
@@ -2585,7 +3104,7 @@
                     <pic:cNvPicPr/>
                   </pic:nvPicPr>
                   <pic:blipFill>
-                    <a:blip r:embed="rId8"/>
+                    <a:blip r:embed="rId12"/>
                     <a:stretch>
                       <a:fillRect/>
                     </a:stretch>
@@ -2644,7 +3163,7 @@
                     <pic:cNvPicPr/>
                   </pic:nvPicPr>
                   <pic:blipFill>
-                    <a:blip r:embed="rId9"/>
+                    <a:blip r:embed="rId13"/>
                     <a:stretch>
                       <a:fillRect/>
                     </a:stretch>
@@ -2687,7 +3206,39 @@
           <w:rFonts w:ascii="Calibri" w:hAnsi="Calibri"/>
           <w:color w:val="444455"/>
         </w:rPr>
-        <w:t>Key EDA findings: disease prevalence is higher in males (56%) vs females (26%). Patients with asymptomatic chest pain and exercise-induced angina show 87% prevalence — the strongest subgroup signal. ST-depression (oldpeak, r=+0.42) and maximum heart rate (thalach, r=−0.42) are the strongest continuous correlates of the target.</w:t>
+        <w:t>Key EDA findings: disease prevalence is higher in males (56%) vs females (26%). Patients with asymptomatic chest pain and exercise-induced angina show 87% prevalence — the strongest subgroup signal. ST-depression (</w:t>
+      </w:r>
+      <w:proofErr w:type="spellStart"/>
+      <w:r>
+        <w:rPr>
+          <w:rFonts w:ascii="Calibri" w:hAnsi="Calibri"/>
+          <w:color w:val="444455"/>
+        </w:rPr>
+        <w:t>oldpeak</w:t>
+      </w:r>
+      <w:proofErr w:type="spellEnd"/>
+      <w:r>
+        <w:rPr>
+          <w:rFonts w:ascii="Calibri" w:hAnsi="Calibri"/>
+          <w:color w:val="444455"/>
+        </w:rPr>
+        <w:t>, r=+0.42) and maximum heart rate (</w:t>
+      </w:r>
+      <w:proofErr w:type="spellStart"/>
+      <w:r>
+        <w:rPr>
+          <w:rFonts w:ascii="Calibri" w:hAnsi="Calibri"/>
+          <w:color w:val="444455"/>
+        </w:rPr>
+        <w:t>thalach</w:t>
+      </w:r>
+      <w:proofErr w:type="spellEnd"/>
+      <w:r>
+        <w:rPr>
+          <w:rFonts w:ascii="Calibri" w:hAnsi="Calibri"/>
+          <w:color w:val="444455"/>
+        </w:rPr>
+        <w:t>, r=−0.42) are the strongest continuous correlates of the target.</w:t>
       </w:r>
     </w:p>
     <w:p>
@@ -2711,7 +3262,7 @@
       <w:pPr>
         <w:pStyle w:val="Heading1"/>
       </w:pPr>
-      <w:bookmarkStart w:id="4" w:name="_Toc234704871"/>
+      <w:bookmarkStart w:id="4" w:name="_Toc234758994"/>
       <w:r>
         <w:lastRenderedPageBreak/>
         <w:t>3. Feature Engineering &amp; Models</w:t>
@@ -2722,7 +3273,7 @@
       <w:pPr>
         <w:pStyle w:val="Heading2"/>
       </w:pPr>
-      <w:bookmarkStart w:id="5" w:name="_Toc234704872"/>
+      <w:bookmarkStart w:id="5" w:name="_Toc234758995"/>
       <w:r>
         <w:t>Derived Clinical Features</w:t>
       </w:r>
@@ -2737,7 +3288,23 @@
           <w:rFonts w:ascii="Calibri" w:hAnsi="Calibri"/>
           <w:color w:val="444455"/>
         </w:rPr>
-        <w:t>Three clinically motivated features are computed inside the scikit-learn Pipeline (via FunctionTransformer), not pre-computed into the cleaned CSV:</w:t>
+        <w:t xml:space="preserve">Three clinically motivated features are computed inside the scikit-learn Pipeline (via </w:t>
+      </w:r>
+      <w:proofErr w:type="spellStart"/>
+      <w:r>
+        <w:rPr>
+          <w:rFonts w:ascii="Calibri" w:hAnsi="Calibri"/>
+          <w:color w:val="444455"/>
+        </w:rPr>
+        <w:t>FunctionTransformer</w:t>
+      </w:r>
+      <w:proofErr w:type="spellEnd"/>
+      <w:r>
+        <w:rPr>
+          <w:rFonts w:ascii="Calibri" w:hAnsi="Calibri"/>
+          <w:color w:val="444455"/>
+        </w:rPr>
+        <w:t>), not pre-computed into the cleaned CSV:</w:t>
       </w:r>
     </w:p>
     <w:p>
@@ -2749,7 +3316,39 @@
           <w:rFonts w:ascii="Calibri" w:hAnsi="Calibri"/>
           <w:color w:val="444455"/>
         </w:rPr>
-        <w:t>Rate-pressure product: trestbps × thalach — index of myocardial oxygen demand</w:t>
+        <w:t xml:space="preserve">Rate-pressure product: </w:t>
+      </w:r>
+      <w:proofErr w:type="spellStart"/>
+      <w:r>
+        <w:rPr>
+          <w:rFonts w:ascii="Calibri" w:hAnsi="Calibri"/>
+          <w:color w:val="444455"/>
+        </w:rPr>
+        <w:t>trestbps</w:t>
+      </w:r>
+      <w:proofErr w:type="spellEnd"/>
+      <w:r>
+        <w:rPr>
+          <w:rFonts w:ascii="Calibri" w:hAnsi="Calibri"/>
+          <w:color w:val="444455"/>
+        </w:rPr>
+        <w:t xml:space="preserve"> × </w:t>
+      </w:r>
+      <w:proofErr w:type="spellStart"/>
+      <w:r>
+        <w:rPr>
+          <w:rFonts w:ascii="Calibri" w:hAnsi="Calibri"/>
+          <w:color w:val="444455"/>
+        </w:rPr>
+        <w:t>thalach</w:t>
+      </w:r>
+      <w:proofErr w:type="spellEnd"/>
+      <w:r>
+        <w:rPr>
+          <w:rFonts w:ascii="Calibri" w:hAnsi="Calibri"/>
+          <w:color w:val="444455"/>
+        </w:rPr>
+        <w:t xml:space="preserve"> — index of myocardial oxygen demand</w:t>
       </w:r>
     </w:p>
     <w:p>
@@ -2761,19 +3360,44 @@
           <w:rFonts w:ascii="Calibri" w:hAnsi="Calibri"/>
           <w:color w:val="444455"/>
         </w:rPr>
-        <w:t>Heart-rate reserve: 220 − age − thalach — unused chronotropic capacity</w:t>
+        <w:t xml:space="preserve">Heart-rate reserve: 220 − age − </w:t>
+      </w:r>
+      <w:proofErr w:type="spellStart"/>
+      <w:r>
+        <w:rPr>
+          <w:rFonts w:ascii="Calibri" w:hAnsi="Calibri"/>
+          <w:color w:val="444455"/>
+        </w:rPr>
+        <w:t>thalach</w:t>
+      </w:r>
+      <w:proofErr w:type="spellEnd"/>
+      <w:r>
+        <w:rPr>
+          <w:rFonts w:ascii="Calibri" w:hAnsi="Calibri"/>
+          <w:color w:val="444455"/>
+        </w:rPr>
+        <w:t xml:space="preserve"> — unused chronotropic capacity</w:t>
       </w:r>
     </w:p>
     <w:p>
       <w:pPr>
         <w:pStyle w:val="ListBullet"/>
       </w:pPr>
-      <w:r>
-        <w:rPr>
-          <w:rFonts w:ascii="Calibri" w:hAnsi="Calibri"/>
-          <w:color w:val="444455"/>
-        </w:rPr>
-        <w:t>oldpeak × slope interaction — ST-depression magnitude × slope pattern</w:t>
+      <w:proofErr w:type="spellStart"/>
+      <w:r>
+        <w:rPr>
+          <w:rFonts w:ascii="Calibri" w:hAnsi="Calibri"/>
+          <w:color w:val="444455"/>
+        </w:rPr>
+        <w:t>oldpeak</w:t>
+      </w:r>
+      <w:proofErr w:type="spellEnd"/>
+      <w:r>
+        <w:rPr>
+          <w:rFonts w:ascii="Calibri" w:hAnsi="Calibri"/>
+          <w:color w:val="444455"/>
+        </w:rPr>
+        <w:t xml:space="preserve"> × slope interaction — ST-depression magnitude × slope pattern</w:t>
       </w:r>
     </w:p>
     <w:p>
@@ -2785,14 +3409,30 @@
           <w:rFonts w:ascii="Calibri" w:hAnsi="Calibri"/>
           <w:color w:val="444455"/>
         </w:rPr>
-        <w:t>Computing features inside the pipeline guarantees identical transformation at training and inference. A fourth candidate (pulse pressure) was rejected: the dataset carries only systolic BP (trestbps) with no diastolic column.</w:t>
+        <w:t>Computing features inside the pipeline guarantees identical transformation at training and inference. A fourth candidate (pulse pressure) was rejected: the dataset carries only systolic BP (</w:t>
+      </w:r>
+      <w:proofErr w:type="spellStart"/>
+      <w:r>
+        <w:rPr>
+          <w:rFonts w:ascii="Calibri" w:hAnsi="Calibri"/>
+          <w:color w:val="444455"/>
+        </w:rPr>
+        <w:t>trestbps</w:t>
+      </w:r>
+      <w:proofErr w:type="spellEnd"/>
+      <w:r>
+        <w:rPr>
+          <w:rFonts w:ascii="Calibri" w:hAnsi="Calibri"/>
+          <w:color w:val="444455"/>
+        </w:rPr>
+        <w:t>) with no diastolic column.</w:t>
       </w:r>
     </w:p>
     <w:p>
       <w:pPr>
         <w:pStyle w:val="Heading2"/>
       </w:pPr>
-      <w:bookmarkStart w:id="6" w:name="_Toc234704873"/>
+      <w:bookmarkStart w:id="6" w:name="_Toc234758996"/>
       <w:r>
         <w:t>Preprocessing</w:t>
       </w:r>
@@ -2807,32 +3447,123 @@
           <w:rFonts w:ascii="Calibri" w:hAnsi="Calibri"/>
           <w:color w:val="444455"/>
         </w:rPr>
-        <w:t>The ColumnTransformer applies three strategies:</w:t>
+        <w:t xml:space="preserve">The </w:t>
+      </w:r>
+      <w:proofErr w:type="spellStart"/>
+      <w:r>
+        <w:rPr>
+          <w:rFonts w:ascii="Calibri" w:hAnsi="Calibri"/>
+          <w:color w:val="444455"/>
+        </w:rPr>
+        <w:t>ColumnTransformer</w:t>
+      </w:r>
+      <w:proofErr w:type="spellEnd"/>
+      <w:r>
+        <w:rPr>
+          <w:rFonts w:ascii="Calibri" w:hAnsi="Calibri"/>
+          <w:color w:val="444455"/>
+        </w:rPr>
+        <w:t xml:space="preserve"> applies three strategies:</w:t>
       </w:r>
     </w:p>
     <w:p>
       <w:pPr>
         <w:pStyle w:val="ListBullet"/>
       </w:pPr>
-      <w:r>
-        <w:rPr>
-          <w:rFonts w:ascii="Calibri" w:hAnsi="Calibri"/>
-          <w:color w:val="444455"/>
-        </w:rPr>
-        <w:t>StandardScaler → 5 continuous features + ca (ordinal vessel count 0–3) + 3 derived features</w:t>
+      <w:proofErr w:type="spellStart"/>
+      <w:r>
+        <w:rPr>
+          <w:rFonts w:ascii="Calibri" w:hAnsi="Calibri"/>
+          <w:color w:val="444455"/>
+        </w:rPr>
+        <w:t>StandardScaler</w:t>
+      </w:r>
+      <w:proofErr w:type="spellEnd"/>
+      <w:r>
+        <w:rPr>
+          <w:rFonts w:ascii="Calibri" w:hAnsi="Calibri"/>
+          <w:color w:val="444455"/>
+        </w:rPr>
+        <w:t xml:space="preserve"> → 5 continuous features + ca (ordinal vessel count 0–3) + 3 derived features</w:t>
       </w:r>
     </w:p>
     <w:p>
       <w:pPr>
         <w:pStyle w:val="ListBullet"/>
       </w:pPr>
-      <w:r>
-        <w:rPr>
-          <w:rFonts w:ascii="Calibri" w:hAnsi="Calibri"/>
-          <w:color w:val="444455"/>
-        </w:rPr>
-        <w:t>OneHotEncoder(handle_unknown='ignore') → nominal categoricals: cp, restecg, slope, thal</w:t>
-      </w:r>
+      <w:proofErr w:type="spellStart"/>
+      <w:r>
+        <w:rPr>
+          <w:rFonts w:ascii="Calibri" w:hAnsi="Calibri"/>
+          <w:color w:val="444455"/>
+        </w:rPr>
+        <w:t>OneHotEncoder</w:t>
+      </w:r>
+      <w:proofErr w:type="spellEnd"/>
+      <w:r>
+        <w:rPr>
+          <w:rFonts w:ascii="Calibri" w:hAnsi="Calibri"/>
+          <w:color w:val="444455"/>
+        </w:rPr>
+        <w:t>(</w:t>
+      </w:r>
+      <w:proofErr w:type="spellStart"/>
+      <w:r>
+        <w:rPr>
+          <w:rFonts w:ascii="Calibri" w:hAnsi="Calibri"/>
+          <w:color w:val="444455"/>
+        </w:rPr>
+        <w:t>handle_unknown</w:t>
+      </w:r>
+      <w:proofErr w:type="spellEnd"/>
+      <w:r>
+        <w:rPr>
+          <w:rFonts w:ascii="Calibri" w:hAnsi="Calibri"/>
+          <w:color w:val="444455"/>
+        </w:rPr>
+        <w:t xml:space="preserve">='ignore') → nominal </w:t>
+      </w:r>
+      <w:proofErr w:type="spellStart"/>
+      <w:r>
+        <w:rPr>
+          <w:rFonts w:ascii="Calibri" w:hAnsi="Calibri"/>
+          <w:color w:val="444455"/>
+        </w:rPr>
+        <w:t>categoricals</w:t>
+      </w:r>
+      <w:proofErr w:type="spellEnd"/>
+      <w:r>
+        <w:rPr>
+          <w:rFonts w:ascii="Calibri" w:hAnsi="Calibri"/>
+          <w:color w:val="444455"/>
+        </w:rPr>
+        <w:t xml:space="preserve">: cp, </w:t>
+      </w:r>
+      <w:proofErr w:type="spellStart"/>
+      <w:r>
+        <w:rPr>
+          <w:rFonts w:ascii="Calibri" w:hAnsi="Calibri"/>
+          <w:color w:val="444455"/>
+        </w:rPr>
+        <w:t>restecg</w:t>
+      </w:r>
+      <w:proofErr w:type="spellEnd"/>
+      <w:r>
+        <w:rPr>
+          <w:rFonts w:ascii="Calibri" w:hAnsi="Calibri"/>
+          <w:color w:val="444455"/>
+        </w:rPr>
+        <w:t xml:space="preserve">, slope, </w:t>
+      </w:r>
+      <w:proofErr w:type="spellStart"/>
+      <w:r>
+        <w:rPr>
+          <w:rFonts w:ascii="Calibri" w:hAnsi="Calibri"/>
+          <w:color w:val="444455"/>
+        </w:rPr>
+        <w:t>thal</w:t>
+      </w:r>
+      <w:proofErr w:type="spellEnd"/>
     </w:p>
     <w:p>
       <w:pPr>
@@ -2843,14 +3574,39 @@
           <w:rFonts w:ascii="Calibri" w:hAnsi="Calibri"/>
           <w:color w:val="444455"/>
         </w:rPr>
-        <w:t>Passthrough → binary flags: sex, fbs, exang</w:t>
-      </w:r>
+        <w:t xml:space="preserve">Passthrough → binary flags: sex, </w:t>
+      </w:r>
+      <w:proofErr w:type="spellStart"/>
+      <w:r>
+        <w:rPr>
+          <w:rFonts w:ascii="Calibri" w:hAnsi="Calibri"/>
+          <w:color w:val="444455"/>
+        </w:rPr>
+        <w:t>fbs</w:t>
+      </w:r>
+      <w:proofErr w:type="spellEnd"/>
+      <w:r>
+        <w:rPr>
+          <w:rFonts w:ascii="Calibri" w:hAnsi="Calibri"/>
+          <w:color w:val="444455"/>
+        </w:rPr>
+        <w:t xml:space="preserve">, </w:t>
+      </w:r>
+      <w:proofErr w:type="spellStart"/>
+      <w:r>
+        <w:rPr>
+          <w:rFonts w:ascii="Calibri" w:hAnsi="Calibri"/>
+          <w:color w:val="444455"/>
+        </w:rPr>
+        <w:t>exang</w:t>
+      </w:r>
+      <w:proofErr w:type="spellEnd"/>
     </w:p>
     <w:p>
       <w:pPr>
         <w:pStyle w:val="Heading2"/>
       </w:pPr>
-      <w:bookmarkStart w:id="7" w:name="_Toc234704874"/>
+      <w:bookmarkStart w:id="7" w:name="_Toc234758997"/>
       <w:r>
         <w:t>Training Setup</w:t>
       </w:r>
@@ -2865,14 +3621,78 @@
           <w:rFonts w:ascii="Calibri" w:hAnsi="Calibri"/>
           <w:color w:val="444455"/>
         </w:rPr>
-        <w:t>Three model families (Logistic Regression, Random Forest, XGBoost) × 2 feature sets (raw / raw + clinical) = 6 tracked runs. Every run used GridSearchCV over StratifiedKFold (5 folds, shuffle=True), scoring ROC-AUC, tuned on an 80/20 stratified split. random_state=785 (derived from student ID 2024AC05785) is shared across all runs.</w:t>
+        <w:t xml:space="preserve">Three model families (Logistic Regression, Random Forest, </w:t>
+      </w:r>
+      <w:proofErr w:type="spellStart"/>
+      <w:r>
+        <w:rPr>
+          <w:rFonts w:ascii="Calibri" w:hAnsi="Calibri"/>
+          <w:color w:val="444455"/>
+        </w:rPr>
+        <w:t>XGBoost</w:t>
+      </w:r>
+      <w:proofErr w:type="spellEnd"/>
+      <w:r>
+        <w:rPr>
+          <w:rFonts w:ascii="Calibri" w:hAnsi="Calibri"/>
+          <w:color w:val="444455"/>
+        </w:rPr>
+        <w:t xml:space="preserve">) × 2 feature sets (raw / raw + clinical) = 6 tracked runs. Every run used </w:t>
+      </w:r>
+      <w:proofErr w:type="spellStart"/>
+      <w:r>
+        <w:rPr>
+          <w:rFonts w:ascii="Calibri" w:hAnsi="Calibri"/>
+          <w:color w:val="444455"/>
+        </w:rPr>
+        <w:t>GridSearchCV</w:t>
+      </w:r>
+      <w:proofErr w:type="spellEnd"/>
+      <w:r>
+        <w:rPr>
+          <w:rFonts w:ascii="Calibri" w:hAnsi="Calibri"/>
+          <w:color w:val="444455"/>
+        </w:rPr>
+        <w:t xml:space="preserve"> over </w:t>
+      </w:r>
+      <w:proofErr w:type="spellStart"/>
+      <w:r>
+        <w:rPr>
+          <w:rFonts w:ascii="Calibri" w:hAnsi="Calibri"/>
+          <w:color w:val="444455"/>
+        </w:rPr>
+        <w:t>StratifiedKFold</w:t>
+      </w:r>
+      <w:proofErr w:type="spellEnd"/>
+      <w:r>
+        <w:rPr>
+          <w:rFonts w:ascii="Calibri" w:hAnsi="Calibri"/>
+          <w:color w:val="444455"/>
+        </w:rPr>
+        <w:t xml:space="preserve"> (5 folds, shuffle=True), scoring ROC-AUC, tuned on an 80/20 stratified split. </w:t>
+      </w:r>
+      <w:proofErr w:type="spellStart"/>
+      <w:r>
+        <w:rPr>
+          <w:rFonts w:ascii="Calibri" w:hAnsi="Calibri"/>
+          <w:color w:val="444455"/>
+        </w:rPr>
+        <w:t>random_state</w:t>
+      </w:r>
+      <w:proofErr w:type="spellEnd"/>
+      <w:r>
+        <w:rPr>
+          <w:rFonts w:ascii="Calibri" w:hAnsi="Calibri"/>
+          <w:color w:val="444455"/>
+        </w:rPr>
+        <w:t>=785 (derived from student ID 2024AC05785) is shared across all runs.</w:t>
       </w:r>
     </w:p>
     <w:p>
       <w:pPr>
         <w:pStyle w:val="Heading2"/>
       </w:pPr>
-      <w:bookmarkStart w:id="8" w:name="_Toc234704875"/>
+      <w:bookmarkStart w:id="8" w:name="_Toc234758998"/>
       <w:r>
         <w:t>Results</w:t>
       </w:r>
@@ -3625,6 +4445,7 @@
             <w:tcW w:w="1170" w:type="dxa"/>
           </w:tcPr>
           <w:p>
+            <w:proofErr w:type="spellStart"/>
             <w:r>
               <w:rPr>
                 <w:rFonts w:ascii="Calibri" w:hAnsi="Calibri"/>
@@ -3632,6 +4453,7 @@
               </w:rPr>
               <w:t>XGBoost</w:t>
             </w:r>
+            <w:proofErr w:type="spellEnd"/>
           </w:p>
         </w:tc>
         <w:tc>
@@ -3760,6 +4582,7 @@
             <w:tcW w:w="1170" w:type="dxa"/>
           </w:tcPr>
           <w:p>
+            <w:proofErr w:type="spellStart"/>
             <w:r>
               <w:rPr>
                 <w:rFonts w:ascii="Calibri" w:hAnsi="Calibri"/>
@@ -3767,6 +4590,7 @@
               </w:rPr>
               <w:t>XGBoost</w:t>
             </w:r>
+            <w:proofErr w:type="spellEnd"/>
           </w:p>
         </w:tc>
         <w:tc>
@@ -4001,7 +4825,7 @@
                     <pic:cNvPicPr/>
                   </pic:nvPicPr>
                   <pic:blipFill>
-                    <a:blip r:embed="rId10"/>
+                    <a:blip r:embed="rId14"/>
                     <a:stretch>
                       <a:fillRect/>
                     </a:stretch>
@@ -4044,7 +4868,7 @@
       <w:pPr>
         <w:pStyle w:val="Heading1"/>
       </w:pPr>
-      <w:bookmarkStart w:id="9" w:name="_Toc234704876"/>
+      <w:bookmarkStart w:id="9" w:name="_Toc234758999"/>
       <w:r>
         <w:lastRenderedPageBreak/>
         <w:t>4. Experiment Tracking</w:t>
@@ -4060,7 +4884,23 @@
           <w:rFonts w:ascii="Calibri" w:hAnsi="Calibri"/>
           <w:color w:val="444455"/>
         </w:rPr>
-        <w:t xml:space="preserve">All six runs are tracked with MLflow using a sqlite:///mlflow.db store for run metadata (params, metrics, tags) with artifacts </w:t>
+        <w:t xml:space="preserve">All six runs are tracked with </w:t>
+      </w:r>
+      <w:proofErr w:type="spellStart"/>
+      <w:r>
+        <w:rPr>
+          <w:rFonts w:ascii="Calibri" w:hAnsi="Calibri"/>
+          <w:color w:val="444455"/>
+        </w:rPr>
+        <w:t>MLflow</w:t>
+      </w:r>
+      <w:proofErr w:type="spellEnd"/>
+      <w:r>
+        <w:rPr>
+          <w:rFonts w:ascii="Calibri" w:hAnsi="Calibri"/>
+          <w:color w:val="444455"/>
+        </w:rPr>
+        <w:t xml:space="preserve"> using a sqlite:///mlflow.db store for run metadata (params, metrics, tags) with artifacts </w:t>
       </w:r>
       <w:proofErr w:type="gramStart"/>
       <w:r>
@@ -4076,7 +4916,23 @@
           <w:rFonts w:ascii="Calibri" w:hAnsi="Calibri"/>
           <w:color w:val="444455"/>
         </w:rPr>
-        <w:t>/mlruns. Each run logs:</w:t>
+        <w:t>/</w:t>
+      </w:r>
+      <w:proofErr w:type="spellStart"/>
+      <w:r>
+        <w:rPr>
+          <w:rFonts w:ascii="Calibri" w:hAnsi="Calibri"/>
+          <w:color w:val="444455"/>
+        </w:rPr>
+        <w:t>mlruns</w:t>
+      </w:r>
+      <w:proofErr w:type="spellEnd"/>
+      <w:r>
+        <w:rPr>
+          <w:rFonts w:ascii="Calibri" w:hAnsi="Calibri"/>
+          <w:color w:val="444455"/>
+        </w:rPr>
+        <w:t>. Each run logs:</w:t>
       </w:r>
     </w:p>
     <w:p>
@@ -4088,7 +4944,39 @@
           <w:rFonts w:ascii="Calibri" w:hAnsi="Calibri"/>
           <w:color w:val="444455"/>
         </w:rPr>
-        <w:t>Hyperparameters (best GridSearchCV params, seed, CV fold count, quick_mode flag)</w:t>
+        <w:t xml:space="preserve">Hyperparameters (best </w:t>
+      </w:r>
+      <w:proofErr w:type="spellStart"/>
+      <w:r>
+        <w:rPr>
+          <w:rFonts w:ascii="Calibri" w:hAnsi="Calibri"/>
+          <w:color w:val="444455"/>
+        </w:rPr>
+        <w:t>GridSearchCV</w:t>
+      </w:r>
+      <w:proofErr w:type="spellEnd"/>
+      <w:r>
+        <w:rPr>
+          <w:rFonts w:ascii="Calibri" w:hAnsi="Calibri"/>
+          <w:color w:val="444455"/>
+        </w:rPr>
+        <w:t xml:space="preserve"> params, seed, CV fold count, </w:t>
+      </w:r>
+      <w:proofErr w:type="spellStart"/>
+      <w:r>
+        <w:rPr>
+          <w:rFonts w:ascii="Calibri" w:hAnsi="Calibri"/>
+          <w:color w:val="444455"/>
+        </w:rPr>
+        <w:t>quick_mode</w:t>
+      </w:r>
+      <w:proofErr w:type="spellEnd"/>
+      <w:r>
+        <w:rPr>
+          <w:rFonts w:ascii="Calibri" w:hAnsi="Calibri"/>
+          <w:color w:val="444455"/>
+        </w:rPr>
+        <w:t xml:space="preserve"> flag)</w:t>
       </w:r>
     </w:p>
     <w:p>
@@ -4124,7 +5012,55 @@
           <w:rFonts w:ascii="Calibri" w:hAnsi="Calibri"/>
           <w:color w:val="444455"/>
         </w:rPr>
-        <w:t>The fitted pipeline in MLflow model format (cloudpickle serialisation)</w:t>
+        <w:t xml:space="preserve">The fitted pipeline in </w:t>
+      </w:r>
+      <w:proofErr w:type="spellStart"/>
+      <w:r>
+        <w:rPr>
+          <w:rFonts w:ascii="Calibri" w:hAnsi="Calibri"/>
+          <w:color w:val="444455"/>
+        </w:rPr>
+        <w:t>MLflow</w:t>
+      </w:r>
+      <w:proofErr w:type="spellEnd"/>
+      <w:r>
+        <w:rPr>
+          <w:rFonts w:ascii="Calibri" w:hAnsi="Calibri"/>
+          <w:color w:val="444455"/>
+        </w:rPr>
+        <w:t xml:space="preserve"> model format (</w:t>
+      </w:r>
+      <w:proofErr w:type="spellStart"/>
+      <w:r>
+        <w:rPr>
+          <w:rFonts w:ascii="Calibri" w:hAnsi="Calibri"/>
+          <w:color w:val="444455"/>
+        </w:rPr>
+        <w:t>cloudpickle</w:t>
+      </w:r>
+      <w:proofErr w:type="spellEnd"/>
+      <w:r>
+        <w:rPr>
+          <w:rFonts w:ascii="Calibri" w:hAnsi="Calibri"/>
+          <w:color w:val="444455"/>
+        </w:rPr>
+        <w:t xml:space="preserve"> </w:t>
+      </w:r>
+      <w:proofErr w:type="spellStart"/>
+      <w:r>
+        <w:rPr>
+          <w:rFonts w:ascii="Calibri" w:hAnsi="Calibri"/>
+          <w:color w:val="444455"/>
+        </w:rPr>
+        <w:t>serialisation</w:t>
+      </w:r>
+      <w:proofErr w:type="spellEnd"/>
+      <w:r>
+        <w:rPr>
+          <w:rFonts w:ascii="Calibri" w:hAnsi="Calibri"/>
+          <w:color w:val="444455"/>
+        </w:rPr>
+        <w:t>)</w:t>
       </w:r>
     </w:p>
     <w:p>
@@ -4151,7 +5087,7 @@
                     <pic:cNvPicPr/>
                   </pic:nvPicPr>
                   <pic:blipFill>
-                    <a:blip r:embed="rId11"/>
+                    <a:blip r:embed="rId15"/>
                     <a:stretch>
                       <a:fillRect/>
                     </a:stretch>
@@ -4182,7 +5118,25 @@
           <w:color w:val="777777"/>
           <w:sz w:val="19"/>
         </w:rPr>
-        <w:t>Figure 6 — MLflow experiment list</w:t>
+        <w:t xml:space="preserve">Figure 6 — </w:t>
+      </w:r>
+      <w:proofErr w:type="spellStart"/>
+      <w:r>
+        <w:rPr>
+          <w:i/>
+          <w:color w:val="777777"/>
+          <w:sz w:val="19"/>
+        </w:rPr>
+        <w:t>MLflow</w:t>
+      </w:r>
+      <w:proofErr w:type="spellEnd"/>
+      <w:r>
+        <w:rPr>
+          <w:i/>
+          <w:color w:val="777777"/>
+          <w:sz w:val="19"/>
+        </w:rPr>
+        <w:t xml:space="preserve"> experiment list</w:t>
       </w:r>
     </w:p>
     <w:p>
@@ -4209,7 +5163,7 @@
                     <pic:cNvPicPr/>
                   </pic:nvPicPr>
                   <pic:blipFill>
-                    <a:blip r:embed="rId12"/>
+                    <a:blip r:embed="rId16"/>
                     <a:stretch>
                       <a:fillRect/>
                     </a:stretch>
@@ -4240,7 +5194,25 @@
           <w:color w:val="777777"/>
           <w:sz w:val="19"/>
         </w:rPr>
-        <w:t>Figure 7 — All six runs in the MLflow runs table</w:t>
+        <w:t xml:space="preserve">Figure 7 — All six runs in the </w:t>
+      </w:r>
+      <w:proofErr w:type="spellStart"/>
+      <w:r>
+        <w:rPr>
+          <w:i/>
+          <w:color w:val="777777"/>
+          <w:sz w:val="19"/>
+        </w:rPr>
+        <w:t>MLflow</w:t>
+      </w:r>
+      <w:proofErr w:type="spellEnd"/>
+      <w:r>
+        <w:rPr>
+          <w:i/>
+          <w:color w:val="777777"/>
+          <w:sz w:val="19"/>
+        </w:rPr>
+        <w:t xml:space="preserve"> runs table</w:t>
       </w:r>
     </w:p>
     <w:p>
@@ -4267,7 +5239,7 @@
                     <pic:cNvPicPr/>
                   </pic:nvPicPr>
                   <pic:blipFill>
-                    <a:blip r:embed="rId13"/>
+                    <a:blip r:embed="rId17"/>
                     <a:stretch>
                       <a:fillRect/>
                     </a:stretch>
@@ -4326,7 +5298,7 @@
                     <pic:cNvPicPr/>
                   </pic:nvPicPr>
                   <pic:blipFill>
-                    <a:blip r:embed="rId14"/>
+                    <a:blip r:embed="rId18"/>
                     <a:stretch>
                       <a:fillRect/>
                     </a:stretch>
@@ -4384,7 +5356,7 @@
                     <pic:cNvPicPr/>
                   </pic:nvPicPr>
                   <pic:blipFill>
-                    <a:blip r:embed="rId15"/>
+                    <a:blip r:embed="rId19"/>
                     <a:stretch>
                       <a:fillRect/>
                     </a:stretch>
@@ -4443,7 +5415,7 @@
                     <pic:cNvPicPr/>
                   </pic:nvPicPr>
                   <pic:blipFill>
-                    <a:blip r:embed="rId16"/>
+                    <a:blip r:embed="rId20"/>
                     <a:stretch>
                       <a:fillRect/>
                     </a:stretch>
@@ -4501,7 +5473,7 @@
                     <pic:cNvPicPr/>
                   </pic:nvPicPr>
                   <pic:blipFill>
-                    <a:blip r:embed="rId17"/>
+                    <a:blip r:embed="rId21"/>
                     <a:stretch>
                       <a:fillRect/>
                     </a:stretch>
@@ -4539,9 +5511,14 @@
       <w:pPr>
         <w:pStyle w:val="Heading2"/>
       </w:pPr>
-      <w:bookmarkStart w:id="10" w:name="_Toc234704877"/>
-      <w:r>
-        <w:t>MLflow 3.14 Adaptations</w:t>
+      <w:bookmarkStart w:id="10" w:name="_Toc234759000"/>
+      <w:proofErr w:type="spellStart"/>
+      <w:r>
+        <w:t>MLflow</w:t>
+      </w:r>
+      <w:proofErr w:type="spellEnd"/>
+      <w:r>
+        <w:t xml:space="preserve"> 3.14 Adaptations</w:t>
       </w:r>
       <w:bookmarkEnd w:id="10"/>
     </w:p>
@@ -4554,7 +5531,23 @@
           <w:rFonts w:ascii="Calibri" w:hAnsi="Calibri"/>
           <w:color w:val="444455"/>
         </w:rPr>
-        <w:t>Three deviations from a literal transcription of the assignment brief were required by the pinned MLflow 3.14.0:</w:t>
+        <w:t xml:space="preserve">Three deviations from a literal transcription of the assignment brief were required by the pinned </w:t>
+      </w:r>
+      <w:proofErr w:type="spellStart"/>
+      <w:r>
+        <w:rPr>
+          <w:rFonts w:ascii="Calibri" w:hAnsi="Calibri"/>
+          <w:color w:val="444455"/>
+        </w:rPr>
+        <w:t>MLflow</w:t>
+      </w:r>
+      <w:proofErr w:type="spellEnd"/>
+      <w:r>
+        <w:rPr>
+          <w:rFonts w:ascii="Calibri" w:hAnsi="Calibri"/>
+          <w:color w:val="444455"/>
+        </w:rPr>
+        <w:t xml:space="preserve"> 3.14.0:</w:t>
       </w:r>
     </w:p>
     <w:p>
@@ -4566,31 +5559,209 @@
           <w:rFonts w:ascii="Calibri" w:hAnsi="Calibri"/>
           <w:color w:val="444455"/>
         </w:rPr>
-        <w:t>File store deprecation: MLflow 3.x raises on any file:// tracking URI unless MLFLOW_ALLOW_FILE_STORE=true is set. Fix: point at sqlite:///mlflow.db for metadata.</w:t>
+        <w:t xml:space="preserve">File store deprecation: </w:t>
+      </w:r>
+      <w:proofErr w:type="spellStart"/>
+      <w:r>
+        <w:rPr>
+          <w:rFonts w:ascii="Calibri" w:hAnsi="Calibri"/>
+          <w:color w:val="444455"/>
+        </w:rPr>
+        <w:t>MLflow</w:t>
+      </w:r>
+      <w:proofErr w:type="spellEnd"/>
+      <w:r>
+        <w:rPr>
+          <w:rFonts w:ascii="Calibri" w:hAnsi="Calibri"/>
+          <w:color w:val="444455"/>
+        </w:rPr>
+        <w:t xml:space="preserve"> 3.x raises on any file:// tracking URI unless MLFLOW_ALLOW_FILE_STORE=true is set. Fix: point at sqlite:///mlflow.db for metadata.</w:t>
       </w:r>
     </w:p>
     <w:p>
       <w:pPr>
         <w:pStyle w:val="ListBullet"/>
       </w:pPr>
-      <w:r>
-        <w:rPr>
-          <w:rFonts w:ascii="Calibri" w:hAnsi="Calibri"/>
-          <w:color w:val="444455"/>
-        </w:rPr>
-        <w:t>log_model() changed: mlflow.sklearn.log_model() now records the model as a decoupled LoggedModel entity outside the run's artifact tree. Fix: save_model() to a temp dir + log_artifacts() to restore the classic runs:/&lt;id&gt;/model path.</w:t>
+      <w:proofErr w:type="spellStart"/>
+      <w:r>
+        <w:rPr>
+          <w:rFonts w:ascii="Calibri" w:hAnsi="Calibri"/>
+          <w:color w:val="444455"/>
+        </w:rPr>
+        <w:t>log_model</w:t>
+      </w:r>
+      <w:proofErr w:type="spellEnd"/>
+      <w:r>
+        <w:rPr>
+          <w:rFonts w:ascii="Calibri" w:hAnsi="Calibri"/>
+          <w:color w:val="444455"/>
+        </w:rPr>
+        <w:t xml:space="preserve">() changed: </w:t>
+      </w:r>
+      <w:proofErr w:type="spellStart"/>
+      <w:r>
+        <w:rPr>
+          <w:rFonts w:ascii="Calibri" w:hAnsi="Calibri"/>
+          <w:color w:val="444455"/>
+        </w:rPr>
+        <w:t>mlflow.sklearn.log_model</w:t>
+      </w:r>
+      <w:proofErr w:type="spellEnd"/>
+      <w:r>
+        <w:rPr>
+          <w:rFonts w:ascii="Calibri" w:hAnsi="Calibri"/>
+          <w:color w:val="444455"/>
+        </w:rPr>
+        <w:t xml:space="preserve">() now records the model as a decoupled </w:t>
+      </w:r>
+      <w:proofErr w:type="spellStart"/>
+      <w:r>
+        <w:rPr>
+          <w:rFonts w:ascii="Calibri" w:hAnsi="Calibri"/>
+          <w:color w:val="444455"/>
+        </w:rPr>
+        <w:t>LoggedModel</w:t>
+      </w:r>
+      <w:proofErr w:type="spellEnd"/>
+      <w:r>
+        <w:rPr>
+          <w:rFonts w:ascii="Calibri" w:hAnsi="Calibri"/>
+          <w:color w:val="444455"/>
+        </w:rPr>
+        <w:t xml:space="preserve"> entity outside the run's artifact tree. Fix: </w:t>
+      </w:r>
+      <w:proofErr w:type="spellStart"/>
+      <w:r>
+        <w:rPr>
+          <w:rFonts w:ascii="Calibri" w:hAnsi="Calibri"/>
+          <w:color w:val="444455"/>
+        </w:rPr>
+        <w:t>save_model</w:t>
+      </w:r>
+      <w:proofErr w:type="spellEnd"/>
+      <w:r>
+        <w:rPr>
+          <w:rFonts w:ascii="Calibri" w:hAnsi="Calibri"/>
+          <w:color w:val="444455"/>
+        </w:rPr>
+        <w:t xml:space="preserve">() to a temp </w:t>
+      </w:r>
+      <w:proofErr w:type="spellStart"/>
+      <w:r>
+        <w:rPr>
+          <w:rFonts w:ascii="Calibri" w:hAnsi="Calibri"/>
+          <w:color w:val="444455"/>
+        </w:rPr>
+        <w:t>dir</w:t>
+      </w:r>
+      <w:proofErr w:type="spellEnd"/>
+      <w:r>
+        <w:rPr>
+          <w:rFonts w:ascii="Calibri" w:hAnsi="Calibri"/>
+          <w:color w:val="444455"/>
+        </w:rPr>
+        <w:t xml:space="preserve"> + </w:t>
+      </w:r>
+      <w:proofErr w:type="spellStart"/>
+      <w:r>
+        <w:rPr>
+          <w:rFonts w:ascii="Calibri" w:hAnsi="Calibri"/>
+          <w:color w:val="444455"/>
+        </w:rPr>
+        <w:t>log_artifacts</w:t>
+      </w:r>
+      <w:proofErr w:type="spellEnd"/>
+      <w:r>
+        <w:rPr>
+          <w:rFonts w:ascii="Calibri" w:hAnsi="Calibri"/>
+          <w:color w:val="444455"/>
+        </w:rPr>
+        <w:t>() to restore the classic runs:/&lt;id&gt;/model path.</w:t>
       </w:r>
     </w:p>
     <w:p>
       <w:pPr>
         <w:pStyle w:val="ListBullet"/>
       </w:pPr>
-      <w:r>
-        <w:rPr>
-          <w:rFonts w:ascii="Calibri" w:hAnsi="Calibri"/>
-          <w:color w:val="444455"/>
-        </w:rPr>
-        <w:t>skops serialisation: the FunctionTransformer wrapping add_clinical_features is rejected as an 'untrusted type'. Fix: serialization_format=SERIALIZATION_FORMAT_CLOUDPICKLE.</w:t>
+      <w:proofErr w:type="spellStart"/>
+      <w:r>
+        <w:rPr>
+          <w:rFonts w:ascii="Calibri" w:hAnsi="Calibri"/>
+          <w:color w:val="444455"/>
+        </w:rPr>
+        <w:t>skops</w:t>
+      </w:r>
+      <w:proofErr w:type="spellEnd"/>
+      <w:r>
+        <w:rPr>
+          <w:rFonts w:ascii="Calibri" w:hAnsi="Calibri"/>
+          <w:color w:val="444455"/>
+        </w:rPr>
+        <w:t xml:space="preserve"> </w:t>
+      </w:r>
+      <w:proofErr w:type="spellStart"/>
+      <w:r>
+        <w:rPr>
+          <w:rFonts w:ascii="Calibri" w:hAnsi="Calibri"/>
+          <w:color w:val="444455"/>
+        </w:rPr>
+        <w:t>serialisation</w:t>
+      </w:r>
+      <w:proofErr w:type="spellEnd"/>
+      <w:r>
+        <w:rPr>
+          <w:rFonts w:ascii="Calibri" w:hAnsi="Calibri"/>
+          <w:color w:val="444455"/>
+        </w:rPr>
+        <w:t xml:space="preserve">: the </w:t>
+      </w:r>
+      <w:proofErr w:type="spellStart"/>
+      <w:r>
+        <w:rPr>
+          <w:rFonts w:ascii="Calibri" w:hAnsi="Calibri"/>
+          <w:color w:val="444455"/>
+        </w:rPr>
+        <w:t>FunctionTransformer</w:t>
+      </w:r>
+      <w:proofErr w:type="spellEnd"/>
+      <w:r>
+        <w:rPr>
+          <w:rFonts w:ascii="Calibri" w:hAnsi="Calibri"/>
+          <w:color w:val="444455"/>
+        </w:rPr>
+        <w:t xml:space="preserve"> wrapping </w:t>
+      </w:r>
+      <w:proofErr w:type="spellStart"/>
+      <w:r>
+        <w:rPr>
+          <w:rFonts w:ascii="Calibri" w:hAnsi="Calibri"/>
+          <w:color w:val="444455"/>
+        </w:rPr>
+        <w:t>add_clinical_features</w:t>
+      </w:r>
+      <w:proofErr w:type="spellEnd"/>
+      <w:r>
+        <w:rPr>
+          <w:rFonts w:ascii="Calibri" w:hAnsi="Calibri"/>
+          <w:color w:val="444455"/>
+        </w:rPr>
+        <w:t xml:space="preserve"> is rejected as an 'untrusted type'. Fix: </w:t>
+      </w:r>
+      <w:proofErr w:type="spellStart"/>
+      <w:r>
+        <w:rPr>
+          <w:rFonts w:ascii="Calibri" w:hAnsi="Calibri"/>
+          <w:color w:val="444455"/>
+        </w:rPr>
+        <w:t>serialization_format</w:t>
+      </w:r>
+      <w:proofErr w:type="spellEnd"/>
+      <w:r>
+        <w:rPr>
+          <w:rFonts w:ascii="Calibri" w:hAnsi="Calibri"/>
+          <w:color w:val="444455"/>
+        </w:rPr>
+        <w:t>=SERIALIZATION_FORMAT_CLOUDPICKLE.</w:t>
       </w:r>
     </w:p>
     <w:p>
@@ -4602,7 +5773,7 @@
       <w:pPr>
         <w:pStyle w:val="Heading1"/>
       </w:pPr>
-      <w:bookmarkStart w:id="11" w:name="_Toc234704878"/>
+      <w:bookmarkStart w:id="11" w:name="_Toc234759001"/>
       <w:r>
         <w:lastRenderedPageBreak/>
         <w:t>5. Packaging &amp; Reproducibility</w:t>
@@ -4620,6 +5791,7 @@
         </w:rPr>
         <w:t xml:space="preserve">The best run (argmax test ROC-AUC over full-grid runs) is exported by python -m </w:t>
       </w:r>
+      <w:proofErr w:type="spellStart"/>
       <w:proofErr w:type="gramStart"/>
       <w:r>
         <w:rPr>
@@ -4634,43 +5806,142 @@
           <w:rFonts w:ascii="Calibri" w:hAnsi="Calibri"/>
           <w:color w:val="444455"/>
         </w:rPr>
-        <w:t>.export to models/ in three formats:</w:t>
+        <w:t>.export</w:t>
+      </w:r>
+      <w:proofErr w:type="spellEnd"/>
+      <w:r>
+        <w:rPr>
+          <w:rFonts w:ascii="Calibri" w:hAnsi="Calibri"/>
+          <w:color w:val="444455"/>
+        </w:rPr>
+        <w:t xml:space="preserve"> to models/ in three formats:</w:t>
       </w:r>
     </w:p>
     <w:p>
       <w:pPr>
         <w:pStyle w:val="ListBullet"/>
       </w:pPr>
-      <w:r>
-        <w:rPr>
-          <w:rFonts w:ascii="Calibri" w:hAnsi="Calibri"/>
-          <w:color w:val="444455"/>
-        </w:rPr>
-        <w:t>heart_disease_pipeline.joblib — canonical serving artifact; loads with scikit-learn + joblib only (no MLflow at inference time)</w:t>
+      <w:proofErr w:type="spellStart"/>
+      <w:r>
+        <w:rPr>
+          <w:rFonts w:ascii="Calibri" w:hAnsi="Calibri"/>
+          <w:color w:val="444455"/>
+        </w:rPr>
+        <w:t>heart_disease_pipeline.joblib</w:t>
+      </w:r>
+      <w:proofErr w:type="spellEnd"/>
+      <w:r>
+        <w:rPr>
+          <w:rFonts w:ascii="Calibri" w:hAnsi="Calibri"/>
+          <w:color w:val="444455"/>
+        </w:rPr>
+        <w:t xml:space="preserve"> — canonical serving artifact; loads with scikit-learn + </w:t>
+      </w:r>
+      <w:proofErr w:type="spellStart"/>
+      <w:r>
+        <w:rPr>
+          <w:rFonts w:ascii="Calibri" w:hAnsi="Calibri"/>
+          <w:color w:val="444455"/>
+        </w:rPr>
+        <w:t>joblib</w:t>
+      </w:r>
+      <w:proofErr w:type="spellEnd"/>
+      <w:r>
+        <w:rPr>
+          <w:rFonts w:ascii="Calibri" w:hAnsi="Calibri"/>
+          <w:color w:val="444455"/>
+        </w:rPr>
+        <w:t xml:space="preserve"> only (no </w:t>
+      </w:r>
+      <w:proofErr w:type="spellStart"/>
+      <w:r>
+        <w:rPr>
+          <w:rFonts w:ascii="Calibri" w:hAnsi="Calibri"/>
+          <w:color w:val="444455"/>
+        </w:rPr>
+        <w:t>MLflow</w:t>
+      </w:r>
+      <w:proofErr w:type="spellEnd"/>
+      <w:r>
+        <w:rPr>
+          <w:rFonts w:ascii="Calibri" w:hAnsi="Calibri"/>
+          <w:color w:val="444455"/>
+        </w:rPr>
+        <w:t xml:space="preserve"> at inference time)</w:t>
       </w:r>
     </w:p>
     <w:p>
       <w:pPr>
         <w:pStyle w:val="ListBullet"/>
       </w:pPr>
-      <w:r>
-        <w:rPr>
-          <w:rFonts w:ascii="Calibri" w:hAnsi="Calibri"/>
-          <w:color w:val="444455"/>
-        </w:rPr>
-        <w:t>model_metadata.json — source run ID, metrics, package versions, and input schema for provenance without the MLflow store</w:t>
+      <w:proofErr w:type="spellStart"/>
+      <w:r>
+        <w:rPr>
+          <w:rFonts w:ascii="Calibri" w:hAnsi="Calibri"/>
+          <w:color w:val="444455"/>
+        </w:rPr>
+        <w:t>model_metadata.json</w:t>
+      </w:r>
+      <w:proofErr w:type="spellEnd"/>
+      <w:r>
+        <w:rPr>
+          <w:rFonts w:ascii="Calibri" w:hAnsi="Calibri"/>
+          <w:color w:val="444455"/>
+        </w:rPr>
+        <w:t xml:space="preserve"> — source run ID, metrics, package versions, and input schema for provenance without the </w:t>
+      </w:r>
+      <w:proofErr w:type="spellStart"/>
+      <w:r>
+        <w:rPr>
+          <w:rFonts w:ascii="Calibri" w:hAnsi="Calibri"/>
+          <w:color w:val="444455"/>
+        </w:rPr>
+        <w:t>MLflow</w:t>
+      </w:r>
+      <w:proofErr w:type="spellEnd"/>
+      <w:r>
+        <w:rPr>
+          <w:rFonts w:ascii="Calibri" w:hAnsi="Calibri"/>
+          <w:color w:val="444455"/>
+        </w:rPr>
+        <w:t xml:space="preserve"> store</w:t>
       </w:r>
     </w:p>
     <w:p>
       <w:pPr>
         <w:pStyle w:val="ListBullet"/>
       </w:pPr>
-      <w:r>
-        <w:rPr>
-          <w:rFonts w:ascii="Calibri" w:hAnsi="Calibri"/>
-          <w:color w:val="444455"/>
-        </w:rPr>
-        <w:t>mlflow_model/ — same pipeline in MLflow model format</w:t>
+      <w:proofErr w:type="spellStart"/>
+      <w:r>
+        <w:rPr>
+          <w:rFonts w:ascii="Calibri" w:hAnsi="Calibri"/>
+          <w:color w:val="444455"/>
+        </w:rPr>
+        <w:t>mlflow_model</w:t>
+      </w:r>
+      <w:proofErr w:type="spellEnd"/>
+      <w:r>
+        <w:rPr>
+          <w:rFonts w:ascii="Calibri" w:hAnsi="Calibri"/>
+          <w:color w:val="444455"/>
+        </w:rPr>
+        <w:t xml:space="preserve">/ — same pipeline in </w:t>
+      </w:r>
+      <w:proofErr w:type="spellStart"/>
+      <w:r>
+        <w:rPr>
+          <w:rFonts w:ascii="Calibri" w:hAnsi="Calibri"/>
+          <w:color w:val="444455"/>
+        </w:rPr>
+        <w:t>MLflow</w:t>
+      </w:r>
+      <w:proofErr w:type="spellEnd"/>
+      <w:r>
+        <w:rPr>
+          <w:rFonts w:ascii="Calibri" w:hAnsi="Calibri"/>
+          <w:color w:val="444455"/>
+        </w:rPr>
+        <w:t xml:space="preserve"> model format</w:t>
       </w:r>
     </w:p>
     <w:p>
@@ -4694,7 +5965,55 @@
           <w:rFonts w:ascii="Calibri" w:hAnsi="Calibri"/>
           <w:color w:val="444455"/>
         </w:rPr>
-        <w:t>Reproducibility was verified, not assumed. Installing MLflow 3.14.0 forced pandas from 3.0.3 → 2.3.3 (MLflow declares Requires-Dist: pandas&lt;3). This conflict was confirmed with pip install --dry-run and the full test suite was re-run against the downgraded pin before committing it.</w:t>
+        <w:t xml:space="preserve">Reproducibility was verified, not assumed. Installing </w:t>
+      </w:r>
+      <w:proofErr w:type="spellStart"/>
+      <w:r>
+        <w:rPr>
+          <w:rFonts w:ascii="Calibri" w:hAnsi="Calibri"/>
+          <w:color w:val="444455"/>
+        </w:rPr>
+        <w:t>MLflow</w:t>
+      </w:r>
+      <w:proofErr w:type="spellEnd"/>
+      <w:r>
+        <w:rPr>
+          <w:rFonts w:ascii="Calibri" w:hAnsi="Calibri"/>
+          <w:color w:val="444455"/>
+        </w:rPr>
+        <w:t xml:space="preserve"> 3.14.0 forced pandas from 3.0.3 → 2.3.3 (</w:t>
+      </w:r>
+      <w:proofErr w:type="spellStart"/>
+      <w:r>
+        <w:rPr>
+          <w:rFonts w:ascii="Calibri" w:hAnsi="Calibri"/>
+          <w:color w:val="444455"/>
+        </w:rPr>
+        <w:t>MLflow</w:t>
+      </w:r>
+      <w:proofErr w:type="spellEnd"/>
+      <w:r>
+        <w:rPr>
+          <w:rFonts w:ascii="Calibri" w:hAnsi="Calibri"/>
+          <w:color w:val="444455"/>
+        </w:rPr>
+        <w:t xml:space="preserve"> declares Requires-</w:t>
+      </w:r>
+      <w:proofErr w:type="spellStart"/>
+      <w:r>
+        <w:rPr>
+          <w:rFonts w:ascii="Calibri" w:hAnsi="Calibri"/>
+          <w:color w:val="444455"/>
+        </w:rPr>
+        <w:t>Dist</w:t>
+      </w:r>
+      <w:proofErr w:type="spellEnd"/>
+      <w:r>
+        <w:rPr>
+          <w:rFonts w:ascii="Calibri" w:hAnsi="Calibri"/>
+          <w:color w:val="444455"/>
+        </w:rPr>
+        <w:t>: pandas&lt;3). This conflict was confirmed with pip install --dry-run and the full test suite was re-run against the downgraded pin before committing it.</w:t>
       </w:r>
     </w:p>
     <w:p>
@@ -4706,7 +6025,7 @@
       <w:pPr>
         <w:pStyle w:val="Heading1"/>
       </w:pPr>
-      <w:bookmarkStart w:id="12" w:name="_Toc234704879"/>
+      <w:bookmarkStart w:id="12" w:name="_Toc234759002"/>
       <w:r>
         <w:lastRenderedPageBreak/>
         <w:t>6. CI/CD Pipeline</w:t>
@@ -4722,7 +6041,39 @@
           <w:rFonts w:ascii="Calibri" w:hAnsi="Calibri"/>
           <w:color w:val="444455"/>
         </w:rPr>
-        <w:t>The GitHub Actions pipeline (.github/workflows/ci.yml) runs four jobs on every push and pull request. lint and test run in parallel; train-smoke and docker depend on test passing:</w:t>
+        <w:t>The GitHub Actions pipeline (.</w:t>
+      </w:r>
+      <w:proofErr w:type="spellStart"/>
+      <w:r>
+        <w:rPr>
+          <w:rFonts w:ascii="Calibri" w:hAnsi="Calibri"/>
+          <w:color w:val="444455"/>
+        </w:rPr>
+        <w:t>github</w:t>
+      </w:r>
+      <w:proofErr w:type="spellEnd"/>
+      <w:r>
+        <w:rPr>
+          <w:rFonts w:ascii="Calibri" w:hAnsi="Calibri"/>
+          <w:color w:val="444455"/>
+        </w:rPr>
+        <w:t>/workflows/</w:t>
+      </w:r>
+      <w:proofErr w:type="spellStart"/>
+      <w:r>
+        <w:rPr>
+          <w:rFonts w:ascii="Calibri" w:hAnsi="Calibri"/>
+          <w:color w:val="444455"/>
+        </w:rPr>
+        <w:t>ci.yml</w:t>
+      </w:r>
+      <w:proofErr w:type="spellEnd"/>
+      <w:r>
+        <w:rPr>
+          <w:rFonts w:ascii="Calibri" w:hAnsi="Calibri"/>
+          <w:color w:val="444455"/>
+        </w:rPr>
+        <w:t>) runs four jobs on every push and pull request. lint and test run in parallel; train-smoke and docker depend on test passing:</w:t>
       </w:r>
     </w:p>
     <w:tbl>
@@ -4800,7 +6151,39 @@
                 <w:rFonts w:ascii="Calibri" w:hAnsi="Calibri"/>
                 <w:sz w:val="20"/>
               </w:rPr>
-              <w:t>ruff check . — pycodestyle errors (E), pyflakes (F), import order (I). Fails on any finding.</w:t>
+              <w:t xml:space="preserve">ruff check . — </w:t>
+            </w:r>
+            <w:proofErr w:type="spellStart"/>
+            <w:r>
+              <w:rPr>
+                <w:rFonts w:ascii="Calibri" w:hAnsi="Calibri"/>
+                <w:sz w:val="20"/>
+              </w:rPr>
+              <w:t>pycodestyle</w:t>
+            </w:r>
+            <w:proofErr w:type="spellEnd"/>
+            <w:r>
+              <w:rPr>
+                <w:rFonts w:ascii="Calibri" w:hAnsi="Calibri"/>
+                <w:sz w:val="20"/>
+              </w:rPr>
+              <w:t xml:space="preserve"> errors (E), </w:t>
+            </w:r>
+            <w:proofErr w:type="spellStart"/>
+            <w:r>
+              <w:rPr>
+                <w:rFonts w:ascii="Calibri" w:hAnsi="Calibri"/>
+                <w:sz w:val="20"/>
+              </w:rPr>
+              <w:t>pyflakes</w:t>
+            </w:r>
+            <w:proofErr w:type="spellEnd"/>
+            <w:r>
+              <w:rPr>
+                <w:rFonts w:ascii="Calibri" w:hAnsi="Calibri"/>
+                <w:sz w:val="20"/>
+              </w:rPr>
+              <w:t xml:space="preserve"> (F), import order (I). Fails on any finding.</w:t>
             </w:r>
           </w:p>
         </w:tc>
@@ -4831,7 +6214,23 @@
                 <w:rFonts w:ascii="Calibri" w:hAnsi="Calibri"/>
                 <w:sz w:val="20"/>
               </w:rPr>
-              <w:t>Full pytest suite (39 tests). JUnit XML uploaded as artifact even on failure (if: always()).</w:t>
+              <w:t xml:space="preserve">Full </w:t>
+            </w:r>
+            <w:proofErr w:type="spellStart"/>
+            <w:r>
+              <w:rPr>
+                <w:rFonts w:ascii="Calibri" w:hAnsi="Calibri"/>
+                <w:sz w:val="20"/>
+              </w:rPr>
+              <w:t>pytest</w:t>
+            </w:r>
+            <w:proofErr w:type="spellEnd"/>
+            <w:r>
+              <w:rPr>
+                <w:rFonts w:ascii="Calibri" w:hAnsi="Calibri"/>
+                <w:sz w:val="20"/>
+              </w:rPr>
+              <w:t xml:space="preserve"> suite (39 tests). JUnit XML uploaded as artifact even on failure (if: always()).</w:t>
             </w:r>
           </w:p>
         </w:tc>
@@ -4862,7 +6261,39 @@
                 <w:rFonts w:ascii="Calibri" w:hAnsi="Calibri"/>
                 <w:sz w:val="20"/>
               </w:rPr>
-              <w:t>python -m ml.models.train --quick — all 6 model/feature combinations with quick grids. Training log + MLflow DB uploaded as artifacts.</w:t>
+              <w:t xml:space="preserve">python -m </w:t>
+            </w:r>
+            <w:proofErr w:type="spellStart"/>
+            <w:r>
+              <w:rPr>
+                <w:rFonts w:ascii="Calibri" w:hAnsi="Calibri"/>
+                <w:sz w:val="20"/>
+              </w:rPr>
+              <w:t>ml.models.train</w:t>
+            </w:r>
+            <w:proofErr w:type="spellEnd"/>
+            <w:r>
+              <w:rPr>
+                <w:rFonts w:ascii="Calibri" w:hAnsi="Calibri"/>
+                <w:sz w:val="20"/>
+              </w:rPr>
+              <w:t xml:space="preserve"> --quick — all 6 model/feature combinations with quick grids. Training log + </w:t>
+            </w:r>
+            <w:proofErr w:type="spellStart"/>
+            <w:r>
+              <w:rPr>
+                <w:rFonts w:ascii="Calibri" w:hAnsi="Calibri"/>
+                <w:sz w:val="20"/>
+              </w:rPr>
+              <w:t>MLflow</w:t>
+            </w:r>
+            <w:proofErr w:type="spellEnd"/>
+            <w:r>
+              <w:rPr>
+                <w:rFonts w:ascii="Calibri" w:hAnsi="Calibri"/>
+                <w:sz w:val="20"/>
+              </w:rPr>
+              <w:t xml:space="preserve"> DB uploaded as artifacts.</w:t>
             </w:r>
           </w:p>
         </w:tc>
@@ -4909,7 +6340,23 @@
           <w:rFonts w:ascii="Calibri" w:hAnsi="Calibri"/>
           <w:color w:val="444455"/>
         </w:rPr>
-        <w:t>Python is pinned to 3.13 across all CI jobs because the committed model pickle was built under 3.13.11 — cross-minor-version unpickling is the most realistic breakage vector. The smoke job does not run export: pick_best() rejects quick-mode runs by design, and carving out a CI-only bypass would weaken that guarantee; export correctness is covered by unit tests in the test job.</w:t>
+        <w:t xml:space="preserve">Python is pinned to 3.13 across all CI jobs because the committed model pickle was built under 3.13.11 — cross-minor-version unpickling is the most realistic breakage vector. The smoke job does not run export: </w:t>
+      </w:r>
+      <w:proofErr w:type="spellStart"/>
+      <w:r>
+        <w:rPr>
+          <w:rFonts w:ascii="Calibri" w:hAnsi="Calibri"/>
+          <w:color w:val="444455"/>
+        </w:rPr>
+        <w:t>pick_best</w:t>
+      </w:r>
+      <w:proofErr w:type="spellEnd"/>
+      <w:r>
+        <w:rPr>
+          <w:rFonts w:ascii="Calibri" w:hAnsi="Calibri"/>
+          <w:color w:val="444455"/>
+        </w:rPr>
+        <w:t>() rejects quick-mode runs by design, and carving out a CI-only bypass would weaken that guarantee; export correctness is covered by unit tests in the test job.</w:t>
       </w:r>
     </w:p>
     <w:p>
@@ -4948,7 +6395,7 @@
                     <pic:cNvPicPr/>
                   </pic:nvPicPr>
                   <pic:blipFill>
-                    <a:blip r:embed="rId18"/>
+                    <a:blip r:embed="rId22"/>
                     <a:stretch>
                       <a:fillRect/>
                     </a:stretch>
@@ -5007,7 +6454,7 @@
                     <pic:cNvPicPr/>
                   </pic:nvPicPr>
                   <pic:blipFill>
-                    <a:blip r:embed="rId19"/>
+                    <a:blip r:embed="rId23"/>
                     <a:stretch>
                       <a:fillRect/>
                     </a:stretch>
@@ -5050,18 +6497,23 @@
       <w:pPr>
         <w:pStyle w:val="Heading1"/>
       </w:pPr>
-      <w:bookmarkStart w:id="13" w:name="_Toc234704880"/>
+      <w:bookmarkStart w:id="13" w:name="_Toc234759003"/>
       <w:r>
         <w:lastRenderedPageBreak/>
-        <w:t>7. Containerisation</w:t>
+        <w:t xml:space="preserve">7. </w:t>
+      </w:r>
+      <w:proofErr w:type="spellStart"/>
+      <w:r>
+        <w:t>Containerisation</w:t>
       </w:r>
       <w:bookmarkEnd w:id="13"/>
+      <w:proofErr w:type="spellEnd"/>
     </w:p>
     <w:p>
       <w:pPr>
         <w:pStyle w:val="Heading2"/>
       </w:pPr>
-      <w:bookmarkStart w:id="14" w:name="_Toc234704881"/>
+      <w:bookmarkStart w:id="14" w:name="_Toc234759004"/>
       <w:r>
         <w:t>Image Design</w:t>
       </w:r>
@@ -5076,31 +6528,65 @@
           <w:rFonts w:ascii="Calibri" w:hAnsi="Calibri"/>
           <w:color w:val="444455"/>
         </w:rPr>
-        <w:t>The serving image installs only api/requirements.txt — eight pins:</w:t>
+        <w:t xml:space="preserve">The serving image installs only </w:t>
+      </w:r>
+      <w:proofErr w:type="spellStart"/>
+      <w:r>
+        <w:rPr>
+          <w:rFonts w:ascii="Calibri" w:hAnsi="Calibri"/>
+          <w:color w:val="444455"/>
+        </w:rPr>
+        <w:t>api</w:t>
+      </w:r>
+      <w:proofErr w:type="spellEnd"/>
+      <w:r>
+        <w:rPr>
+          <w:rFonts w:ascii="Calibri" w:hAnsi="Calibri"/>
+          <w:color w:val="444455"/>
+        </w:rPr>
+        <w:t>/requirements.txt — eight pins:</w:t>
       </w:r>
     </w:p>
     <w:p>
       <w:pPr>
         <w:pStyle w:val="ListBullet"/>
       </w:pPr>
-      <w:r>
-        <w:rPr>
-          <w:rFonts w:ascii="Calibri" w:hAnsi="Calibri"/>
-          <w:color w:val="444455"/>
-        </w:rPr>
-        <w:t>fastapi==0.139.0</w:t>
+      <w:proofErr w:type="spellStart"/>
+      <w:r>
+        <w:rPr>
+          <w:rFonts w:ascii="Calibri" w:hAnsi="Calibri"/>
+          <w:color w:val="444455"/>
+        </w:rPr>
+        <w:t>fastapi</w:t>
+      </w:r>
+      <w:proofErr w:type="spellEnd"/>
+      <w:r>
+        <w:rPr>
+          <w:rFonts w:ascii="Calibri" w:hAnsi="Calibri"/>
+          <w:color w:val="444455"/>
+        </w:rPr>
+        <w:t>==0.139.0</w:t>
       </w:r>
     </w:p>
     <w:p>
       <w:pPr>
         <w:pStyle w:val="ListBullet"/>
       </w:pPr>
-      <w:r>
-        <w:rPr>
-          <w:rFonts w:ascii="Calibri" w:hAnsi="Calibri"/>
-          <w:color w:val="444455"/>
-        </w:rPr>
-        <w:t>uvicorn==0.49.0</w:t>
+      <w:proofErr w:type="spellStart"/>
+      <w:r>
+        <w:rPr>
+          <w:rFonts w:ascii="Calibri" w:hAnsi="Calibri"/>
+          <w:color w:val="444455"/>
+        </w:rPr>
+        <w:t>uvicorn</w:t>
+      </w:r>
+      <w:proofErr w:type="spellEnd"/>
+      <w:r>
+        <w:rPr>
+          <w:rFonts w:ascii="Calibri" w:hAnsi="Calibri"/>
+          <w:color w:val="444455"/>
+        </w:rPr>
+        <w:t>==0.49.0</w:t>
       </w:r>
     </w:p>
     <w:p>
@@ -5131,60 +6617,137 @@
       <w:pPr>
         <w:pStyle w:val="ListBullet"/>
       </w:pPr>
-      <w:r>
-        <w:rPr>
-          <w:rFonts w:ascii="Calibri" w:hAnsi="Calibri"/>
-          <w:color w:val="444455"/>
-        </w:rPr>
-        <w:t>numpy==2.5.0</w:t>
+      <w:proofErr w:type="spellStart"/>
+      <w:r>
+        <w:rPr>
+          <w:rFonts w:ascii="Calibri" w:hAnsi="Calibri"/>
+          <w:color w:val="444455"/>
+        </w:rPr>
+        <w:t>numpy</w:t>
+      </w:r>
+      <w:proofErr w:type="spellEnd"/>
+      <w:r>
+        <w:rPr>
+          <w:rFonts w:ascii="Calibri" w:hAnsi="Calibri"/>
+          <w:color w:val="444455"/>
+        </w:rPr>
+        <w:t>==2.5.0</w:t>
       </w:r>
     </w:p>
     <w:p>
       <w:pPr>
         <w:pStyle w:val="ListBullet"/>
       </w:pPr>
-      <w:r>
-        <w:rPr>
-          <w:rFonts w:ascii="Calibri" w:hAnsi="Calibri"/>
-          <w:color w:val="444455"/>
-        </w:rPr>
-        <w:t>joblib==1.5.3</w:t>
+      <w:proofErr w:type="spellStart"/>
+      <w:r>
+        <w:rPr>
+          <w:rFonts w:ascii="Calibri" w:hAnsi="Calibri"/>
+          <w:color w:val="444455"/>
+        </w:rPr>
+        <w:t>joblib</w:t>
+      </w:r>
+      <w:proofErr w:type="spellEnd"/>
+      <w:r>
+        <w:rPr>
+          <w:rFonts w:ascii="Calibri" w:hAnsi="Calibri"/>
+          <w:color w:val="444455"/>
+        </w:rPr>
+        <w:t>==1.5.3</w:t>
       </w:r>
     </w:p>
     <w:p>
       <w:pPr>
         <w:pStyle w:val="ListBullet"/>
       </w:pPr>
-      <w:r>
-        <w:rPr>
-          <w:rFonts w:ascii="Calibri" w:hAnsi="Calibri"/>
-          <w:color w:val="444455"/>
-        </w:rPr>
-        <w:t>prometheus_client==0.25.0</w:t>
+      <w:proofErr w:type="spellStart"/>
+      <w:r>
+        <w:rPr>
+          <w:rFonts w:ascii="Calibri" w:hAnsi="Calibri"/>
+          <w:color w:val="444455"/>
+        </w:rPr>
+        <w:t>prometheus_client</w:t>
+      </w:r>
+      <w:proofErr w:type="spellEnd"/>
+      <w:r>
+        <w:rPr>
+          <w:rFonts w:ascii="Calibri" w:hAnsi="Calibri"/>
+          <w:color w:val="444455"/>
+        </w:rPr>
+        <w:t>==0.25.0</w:t>
       </w:r>
     </w:p>
     <w:p>
       <w:pPr>
         <w:pStyle w:val="ListBullet"/>
       </w:pPr>
-      <w:r>
-        <w:rPr>
-          <w:rFonts w:ascii="Calibri" w:hAnsi="Calibri"/>
-          <w:color w:val="444455"/>
-        </w:rPr>
-        <w:t>prometheus-fastapi-instrumentator==8.0.2</w:t>
+      <w:proofErr w:type="spellStart"/>
+      <w:r>
+        <w:rPr>
+          <w:rFonts w:ascii="Calibri" w:hAnsi="Calibri"/>
+          <w:color w:val="444455"/>
+        </w:rPr>
+        <w:t>prometheus-fastapi-instrumentator</w:t>
+      </w:r>
+      <w:proofErr w:type="spellEnd"/>
+      <w:r>
+        <w:rPr>
+          <w:rFonts w:ascii="Calibri" w:hAnsi="Calibri"/>
+          <w:color w:val="444455"/>
+        </w:rPr>
+        <w:t>==8.0.2</w:t>
       </w:r>
     </w:p>
     <w:p>
       <w:pPr>
         <w:spacing w:before="40" w:after="120"/>
       </w:pPr>
-      <w:r>
-        <w:rPr>
-          <w:rFonts w:ascii="Calibri" w:hAnsi="Calibri"/>
-          <w:color w:val="444455"/>
-        </w:rPr>
-        <w:t>MLflow, XGBoost, and the plotting stack are excluded — the exported joblib pipeline needs only scikit-learn, pandas, and the ml package at inference time. This roughly halves image size vs installing full training requirements and shrinks the attack surface.</w:t>
+      <w:proofErr w:type="spellStart"/>
+      <w:r>
+        <w:rPr>
+          <w:rFonts w:ascii="Calibri" w:hAnsi="Calibri"/>
+          <w:color w:val="444455"/>
+        </w:rPr>
+        <w:t>MLflow</w:t>
+      </w:r>
+      <w:proofErr w:type="spellEnd"/>
+      <w:r>
+        <w:rPr>
+          <w:rFonts w:ascii="Calibri" w:hAnsi="Calibri"/>
+          <w:color w:val="444455"/>
+        </w:rPr>
+        <w:t xml:space="preserve">, </w:t>
+      </w:r>
+      <w:proofErr w:type="spellStart"/>
+      <w:r>
+        <w:rPr>
+          <w:rFonts w:ascii="Calibri" w:hAnsi="Calibri"/>
+          <w:color w:val="444455"/>
+        </w:rPr>
+        <w:t>XGBoost</w:t>
+      </w:r>
+      <w:proofErr w:type="spellEnd"/>
+      <w:r>
+        <w:rPr>
+          <w:rFonts w:ascii="Calibri" w:hAnsi="Calibri"/>
+          <w:color w:val="444455"/>
+        </w:rPr>
+        <w:t xml:space="preserve">, and the plotting stack are excluded — the exported </w:t>
+      </w:r>
+      <w:proofErr w:type="spellStart"/>
+      <w:r>
+        <w:rPr>
+          <w:rFonts w:ascii="Calibri" w:hAnsi="Calibri"/>
+          <w:color w:val="444455"/>
+        </w:rPr>
+        <w:t>joblib</w:t>
+      </w:r>
+      <w:proofErr w:type="spellEnd"/>
+      <w:r>
+        <w:rPr>
+          <w:rFonts w:ascii="Calibri" w:hAnsi="Calibri"/>
+          <w:color w:val="444455"/>
+        </w:rPr>
+        <w:t xml:space="preserve"> pipeline needs only scikit-learn, pandas, and the ml package at inference time. This roughly halves image size vs installing full training requirements and shrinks the attack surface.</w:t>
       </w:r>
     </w:p>
     <w:p>
@@ -5220,7 +6783,23 @@
           <w:rFonts w:ascii="Calibri" w:hAnsi="Calibri"/>
           <w:color w:val="444455"/>
         </w:rPr>
-        <w:t>Non-root user (appuser) — principle of least privilege</w:t>
+        <w:t>Non-root user (</w:t>
+      </w:r>
+      <w:proofErr w:type="spellStart"/>
+      <w:r>
+        <w:rPr>
+          <w:rFonts w:ascii="Calibri" w:hAnsi="Calibri"/>
+          <w:color w:val="444455"/>
+        </w:rPr>
+        <w:t>appuser</w:t>
+      </w:r>
+      <w:proofErr w:type="spellEnd"/>
+      <w:r>
+        <w:rPr>
+          <w:rFonts w:ascii="Calibri" w:hAnsi="Calibri"/>
+          <w:color w:val="444455"/>
+        </w:rPr>
+        <w:t>) — principle of least privilege</w:t>
       </w:r>
     </w:p>
     <w:p>
@@ -5239,19 +6818,44 @@
       <w:pPr>
         <w:pStyle w:val="ListBullet"/>
       </w:pPr>
-      <w:r>
-        <w:rPr>
-          <w:rFonts w:ascii="Calibri" w:hAnsi="Calibri"/>
-          <w:color w:val="444455"/>
-        </w:rPr>
-        <w:t>Dockerfile layers ordered: requirements → ml/ → models/ → api/ (cache-optimal)</w:t>
+      <w:proofErr w:type="spellStart"/>
+      <w:r>
+        <w:rPr>
+          <w:rFonts w:ascii="Calibri" w:hAnsi="Calibri"/>
+          <w:color w:val="444455"/>
+        </w:rPr>
+        <w:t>Dockerfile</w:t>
+      </w:r>
+      <w:proofErr w:type="spellEnd"/>
+      <w:r>
+        <w:rPr>
+          <w:rFonts w:ascii="Calibri" w:hAnsi="Calibri"/>
+          <w:color w:val="444455"/>
+        </w:rPr>
+        <w:t xml:space="preserve"> layers ordered: requirements → ml/ → models/ → </w:t>
+      </w:r>
+      <w:proofErr w:type="spellStart"/>
+      <w:r>
+        <w:rPr>
+          <w:rFonts w:ascii="Calibri" w:hAnsi="Calibri"/>
+          <w:color w:val="444455"/>
+        </w:rPr>
+        <w:t>api</w:t>
+      </w:r>
+      <w:proofErr w:type="spellEnd"/>
+      <w:r>
+        <w:rPr>
+          <w:rFonts w:ascii="Calibri" w:hAnsi="Calibri"/>
+          <w:color w:val="444455"/>
+        </w:rPr>
+        <w:t>/ (cache-optimal)</w:t>
       </w:r>
     </w:p>
     <w:p>
       <w:pPr>
         <w:pStyle w:val="Heading2"/>
       </w:pPr>
-      <w:bookmarkStart w:id="15" w:name="_Toc234704882"/>
+      <w:bookmarkStart w:id="15" w:name="_Toc234759005"/>
       <w:r>
         <w:t>Local Proof</w:t>
       </w:r>
@@ -5266,7 +6870,39 @@
           <w:rFonts w:ascii="Calibri" w:hAnsi="Calibri"/>
           <w:color w:val="444455"/>
         </w:rPr>
-        <w:t>The image was built and run with docker run -d -p 8000:8000 heart-disease-api. /health returned {"status":"ok","model_loaded":true} and a /predict call on the sample request returned probability 0.3326, confirmed against the container logs.</w:t>
+        <w:t>The image was built and run with docker run -d -p 8000:8000 heart-disease-</w:t>
+      </w:r>
+      <w:proofErr w:type="spellStart"/>
+      <w:r>
+        <w:rPr>
+          <w:rFonts w:ascii="Calibri" w:hAnsi="Calibri"/>
+          <w:color w:val="444455"/>
+        </w:rPr>
+        <w:t>api</w:t>
+      </w:r>
+      <w:proofErr w:type="spellEnd"/>
+      <w:r>
+        <w:rPr>
+          <w:rFonts w:ascii="Calibri" w:hAnsi="Calibri"/>
+          <w:color w:val="444455"/>
+        </w:rPr>
+        <w:t>. /health returned {"</w:t>
+      </w:r>
+      <w:proofErr w:type="spellStart"/>
+      <w:r>
+        <w:rPr>
+          <w:rFonts w:ascii="Calibri" w:hAnsi="Calibri"/>
+          <w:color w:val="444455"/>
+        </w:rPr>
+        <w:t>status":"ok","model_loaded":true</w:t>
+      </w:r>
+      <w:proofErr w:type="spellEnd"/>
+      <w:r>
+        <w:rPr>
+          <w:rFonts w:ascii="Calibri" w:hAnsi="Calibri"/>
+          <w:color w:val="444455"/>
+        </w:rPr>
+        <w:t>} and a /predict call on the sample request returned probability 0.3326, confirmed against the container logs.</w:t>
       </w:r>
     </w:p>
     <w:p>
@@ -5293,7 +6929,7 @@
                     <pic:cNvPicPr/>
                   </pic:nvPicPr>
                   <pic:blipFill>
-                    <a:blip r:embed="rId20"/>
+                    <a:blip r:embed="rId24"/>
                     <a:stretch>
                       <a:fillRect/>
                     </a:stretch>
@@ -5331,7 +6967,7 @@
       <w:pPr>
         <w:pStyle w:val="Heading2"/>
       </w:pPr>
-      <w:bookmarkStart w:id="16" w:name="_Toc234704883"/>
+      <w:bookmarkStart w:id="16" w:name="_Toc234759006"/>
       <w:r>
         <w:lastRenderedPageBreak/>
         <w:t>API Input Validation</w:t>
@@ -5359,7 +6995,71 @@
           <w:rFonts w:ascii="Calibri" w:hAnsi="Calibri"/>
           <w:color w:val="444455"/>
         </w:rPr>
-        <w:t>Categorical codes as strict enums: cp ∈ {1,2,3,4}, thal ∈ {3,6,7}, ca ∈ {0,1,2,3}, sex/fbs/exang ∈ {0,1}</w:t>
+        <w:t xml:space="preserve">Categorical codes as strict </w:t>
+      </w:r>
+      <w:proofErr w:type="spellStart"/>
+      <w:r>
+        <w:rPr>
+          <w:rFonts w:ascii="Calibri" w:hAnsi="Calibri"/>
+          <w:color w:val="444455"/>
+        </w:rPr>
+        <w:t>enums</w:t>
+      </w:r>
+      <w:proofErr w:type="spellEnd"/>
+      <w:r>
+        <w:rPr>
+          <w:rFonts w:ascii="Calibri" w:hAnsi="Calibri"/>
+          <w:color w:val="444455"/>
+        </w:rPr>
+        <w:t xml:space="preserve">: cp ∈ {1,2,3,4}, </w:t>
+      </w:r>
+      <w:proofErr w:type="spellStart"/>
+      <w:r>
+        <w:rPr>
+          <w:rFonts w:ascii="Calibri" w:hAnsi="Calibri"/>
+          <w:color w:val="444455"/>
+        </w:rPr>
+        <w:t>thal</w:t>
+      </w:r>
+      <w:proofErr w:type="spellEnd"/>
+      <w:r>
+        <w:rPr>
+          <w:rFonts w:ascii="Calibri" w:hAnsi="Calibri"/>
+          <w:color w:val="444455"/>
+        </w:rPr>
+        <w:t xml:space="preserve"> ∈ {3,6,7}, ca ∈ {0,1,2,3}, sex/</w:t>
+      </w:r>
+      <w:proofErr w:type="spellStart"/>
+      <w:r>
+        <w:rPr>
+          <w:rFonts w:ascii="Calibri" w:hAnsi="Calibri"/>
+          <w:color w:val="444455"/>
+        </w:rPr>
+        <w:t>fbs</w:t>
+      </w:r>
+      <w:proofErr w:type="spellEnd"/>
+      <w:r>
+        <w:rPr>
+          <w:rFonts w:ascii="Calibri" w:hAnsi="Calibri"/>
+          <w:color w:val="444455"/>
+        </w:rPr>
+        <w:t>/</w:t>
+      </w:r>
+      <w:proofErr w:type="spellStart"/>
+      <w:r>
+        <w:rPr>
+          <w:rFonts w:ascii="Calibri" w:hAnsi="Calibri"/>
+          <w:color w:val="444455"/>
+        </w:rPr>
+        <w:t>exang</w:t>
+      </w:r>
+      <w:proofErr w:type="spellEnd"/>
+      <w:r>
+        <w:rPr>
+          <w:rFonts w:ascii="Calibri" w:hAnsi="Calibri"/>
+          <w:color w:val="444455"/>
+        </w:rPr>
+        <w:t xml:space="preserve"> ∈ {0,1}</w:t>
       </w:r>
     </w:p>
     <w:p>
@@ -5371,7 +7071,71 @@
           <w:rFonts w:ascii="Calibri" w:hAnsi="Calibri"/>
           <w:color w:val="444455"/>
         </w:rPr>
-        <w:t>Bounded continuous ranges: age [18,100], trestbps [80,220], chol [100,600], thalach [60,220], oldpeak [0,7]</w:t>
+        <w:t xml:space="preserve">Bounded continuous ranges: age [18,100], </w:t>
+      </w:r>
+      <w:proofErr w:type="spellStart"/>
+      <w:r>
+        <w:rPr>
+          <w:rFonts w:ascii="Calibri" w:hAnsi="Calibri"/>
+          <w:color w:val="444455"/>
+        </w:rPr>
+        <w:t>trestbps</w:t>
+      </w:r>
+      <w:proofErr w:type="spellEnd"/>
+      <w:r>
+        <w:rPr>
+          <w:rFonts w:ascii="Calibri" w:hAnsi="Calibri"/>
+          <w:color w:val="444455"/>
+        </w:rPr>
+        <w:t xml:space="preserve"> [80,220], </w:t>
+      </w:r>
+      <w:proofErr w:type="spellStart"/>
+      <w:r>
+        <w:rPr>
+          <w:rFonts w:ascii="Calibri" w:hAnsi="Calibri"/>
+          <w:color w:val="444455"/>
+        </w:rPr>
+        <w:t>chol</w:t>
+      </w:r>
+      <w:proofErr w:type="spellEnd"/>
+      <w:r>
+        <w:rPr>
+          <w:rFonts w:ascii="Calibri" w:hAnsi="Calibri"/>
+          <w:color w:val="444455"/>
+        </w:rPr>
+        <w:t xml:space="preserve"> [100,600], </w:t>
+      </w:r>
+      <w:proofErr w:type="spellStart"/>
+      <w:r>
+        <w:rPr>
+          <w:rFonts w:ascii="Calibri" w:hAnsi="Calibri"/>
+          <w:color w:val="444455"/>
+        </w:rPr>
+        <w:t>thalach</w:t>
+      </w:r>
+      <w:proofErr w:type="spellEnd"/>
+      <w:r>
+        <w:rPr>
+          <w:rFonts w:ascii="Calibri" w:hAnsi="Calibri"/>
+          <w:color w:val="444455"/>
+        </w:rPr>
+        <w:t xml:space="preserve"> [60,220], </w:t>
+      </w:r>
+      <w:proofErr w:type="spellStart"/>
+      <w:r>
+        <w:rPr>
+          <w:rFonts w:ascii="Calibri" w:hAnsi="Calibri"/>
+          <w:color w:val="444455"/>
+        </w:rPr>
+        <w:t>oldpeak</w:t>
+      </w:r>
+      <w:proofErr w:type="spellEnd"/>
+      <w:r>
+        <w:rPr>
+          <w:rFonts w:ascii="Calibri" w:hAnsi="Calibri"/>
+          <w:color w:val="444455"/>
+        </w:rPr>
+        <w:t xml:space="preserve"> [0,7]</w:t>
       </w:r>
     </w:p>
     <w:p>
@@ -5383,7 +7147,23 @@
           <w:rFonts w:ascii="Calibri" w:hAnsi="Calibri"/>
           <w:color w:val="444455"/>
         </w:rPr>
-        <w:t>Invalid input → HTTP 422 Unprocessable Entity (never a silent wrong prediction)</w:t>
+        <w:t xml:space="preserve">Invalid input → HTTP 422 </w:t>
+      </w:r>
+      <w:proofErr w:type="spellStart"/>
+      <w:r>
+        <w:rPr>
+          <w:rFonts w:ascii="Calibri" w:hAnsi="Calibri"/>
+          <w:color w:val="444455"/>
+        </w:rPr>
+        <w:t>Unprocessable</w:t>
+      </w:r>
+      <w:proofErr w:type="spellEnd"/>
+      <w:r>
+        <w:rPr>
+          <w:rFonts w:ascii="Calibri" w:hAnsi="Calibri"/>
+          <w:color w:val="444455"/>
+        </w:rPr>
+        <w:t xml:space="preserve"> Entity (never a silent wrong prediction)</w:t>
       </w:r>
     </w:p>
     <w:p>
@@ -5395,7 +7175,7 @@
       <w:pPr>
         <w:pStyle w:val="Heading1"/>
       </w:pPr>
-      <w:bookmarkStart w:id="17" w:name="_Toc234704884"/>
+      <w:bookmarkStart w:id="17" w:name="_Toc234759007"/>
       <w:r>
         <w:lastRenderedPageBreak/>
         <w:t>8. Deployment</w:t>
@@ -5406,7 +7186,7 @@
       <w:pPr>
         <w:pStyle w:val="Heading2"/>
       </w:pPr>
-      <w:bookmarkStart w:id="18" w:name="_Toc234704885"/>
+      <w:bookmarkStart w:id="18" w:name="_Toc234759008"/>
       <w:r>
         <w:t>Kubernetes Manifests</w:t>
       </w:r>
@@ -5440,31 +7220,113 @@
       <w:pPr>
         <w:pStyle w:val="ListBullet"/>
       </w:pPr>
-      <w:r>
-        <w:rPr>
-          <w:rFonts w:ascii="Calibri" w:hAnsi="Calibri"/>
-          <w:color w:val="444455"/>
-        </w:rPr>
-        <w:t>deployment.yaml — 2-replica Deployment; imagePullPolicy: IfNotPresent (local image store); readiness + liveness probes on /health; CPU 100m–500m, memory 256Mi–512Mi per pod</w:t>
+      <w:proofErr w:type="spellStart"/>
+      <w:r>
+        <w:rPr>
+          <w:rFonts w:ascii="Calibri" w:hAnsi="Calibri"/>
+          <w:color w:val="444455"/>
+        </w:rPr>
+        <w:t>deployment.yaml</w:t>
+      </w:r>
+      <w:proofErr w:type="spellEnd"/>
+      <w:r>
+        <w:rPr>
+          <w:rFonts w:ascii="Calibri" w:hAnsi="Calibri"/>
+          <w:color w:val="444455"/>
+        </w:rPr>
+        <w:t xml:space="preserve"> — 2-replica Deployment; </w:t>
+      </w:r>
+      <w:proofErr w:type="spellStart"/>
+      <w:r>
+        <w:rPr>
+          <w:rFonts w:ascii="Calibri" w:hAnsi="Calibri"/>
+          <w:color w:val="444455"/>
+        </w:rPr>
+        <w:t>imagePullPolicy</w:t>
+      </w:r>
+      <w:proofErr w:type="spellEnd"/>
+      <w:r>
+        <w:rPr>
+          <w:rFonts w:ascii="Calibri" w:hAnsi="Calibri"/>
+          <w:color w:val="444455"/>
+        </w:rPr>
+        <w:t xml:space="preserve">: </w:t>
+      </w:r>
+      <w:proofErr w:type="spellStart"/>
+      <w:r>
+        <w:rPr>
+          <w:rFonts w:ascii="Calibri" w:hAnsi="Calibri"/>
+          <w:color w:val="444455"/>
+        </w:rPr>
+        <w:t>IfNotPresent</w:t>
+      </w:r>
+      <w:proofErr w:type="spellEnd"/>
+      <w:r>
+        <w:rPr>
+          <w:rFonts w:ascii="Calibri" w:hAnsi="Calibri"/>
+          <w:color w:val="444455"/>
+        </w:rPr>
+        <w:t xml:space="preserve"> (local image store); readiness + liveness probes on /health; CPU 100m–500m, memory 256Mi–512Mi per pod</w:t>
       </w:r>
     </w:p>
     <w:p>
       <w:pPr>
         <w:pStyle w:val="ListBullet"/>
       </w:pPr>
-      <w:r>
-        <w:rPr>
-          <w:rFonts w:ascii="Calibri" w:hAnsi="Calibri"/>
-          <w:color w:val="444455"/>
-        </w:rPr>
-        <w:t>service.yaml — LoadBalancer Service; port 80 → containerPort 8000</w:t>
+      <w:proofErr w:type="spellStart"/>
+      <w:r>
+        <w:rPr>
+          <w:rFonts w:ascii="Calibri" w:hAnsi="Calibri"/>
+          <w:color w:val="444455"/>
+        </w:rPr>
+        <w:t>service.yaml</w:t>
+      </w:r>
+      <w:proofErr w:type="spellEnd"/>
+      <w:r>
+        <w:rPr>
+          <w:rFonts w:ascii="Calibri" w:hAnsi="Calibri"/>
+          <w:color w:val="444455"/>
+        </w:rPr>
+        <w:t xml:space="preserve"> — </w:t>
+      </w:r>
+      <w:proofErr w:type="spellStart"/>
+      <w:r>
+        <w:rPr>
+          <w:rFonts w:ascii="Calibri" w:hAnsi="Calibri"/>
+          <w:color w:val="444455"/>
+        </w:rPr>
+        <w:t>LoadBalancer</w:t>
+      </w:r>
+      <w:proofErr w:type="spellEnd"/>
+      <w:r>
+        <w:rPr>
+          <w:rFonts w:ascii="Calibri" w:hAnsi="Calibri"/>
+          <w:color w:val="444455"/>
+        </w:rPr>
+        <w:t xml:space="preserve"> Service; port 80 → </w:t>
+      </w:r>
+      <w:proofErr w:type="spellStart"/>
+      <w:r>
+        <w:rPr>
+          <w:rFonts w:ascii="Calibri" w:hAnsi="Calibri"/>
+          <w:color w:val="444455"/>
+        </w:rPr>
+        <w:t>containerPort</w:t>
+      </w:r>
+      <w:proofErr w:type="spellEnd"/>
+      <w:r>
+        <w:rPr>
+          <w:rFonts w:ascii="Calibri" w:hAnsi="Calibri"/>
+          <w:color w:val="444455"/>
+        </w:rPr>
+        <w:t xml:space="preserve"> 8000</w:t>
       </w:r>
     </w:p>
     <w:p>
       <w:pPr>
         <w:pStyle w:val="Heading2"/>
       </w:pPr>
-      <w:bookmarkStart w:id="19" w:name="_Toc234704886"/>
+      <w:bookmarkStart w:id="19" w:name="_Toc234759009"/>
       <w:r>
         <w:t>Verification</w:t>
       </w:r>
@@ -5479,7 +7341,23 @@
           <w:rFonts w:ascii="Calibri" w:hAnsi="Calibri"/>
           <w:color w:val="444455"/>
         </w:rPr>
-        <w:t>On a live 2-node cluster (desktop-control-plane + desktop-worker, v1.36.1): both nodes Ready, both pods Running with READY 1/1. curl /health and a /predict call both succeeded through the LoadBalancer. A rolling-restart demo issued six consecutive health-check requests during the restart — all returned 200 — confirming zero-downtime rollout.</w:t>
+        <w:t xml:space="preserve">On a live 2-node cluster (desktop-control-plane + desktop-worker, v1.36.1): both nodes Ready, both pods Running with READY 1/1. curl /health and a /predict call both succeeded through the </w:t>
+      </w:r>
+      <w:proofErr w:type="spellStart"/>
+      <w:r>
+        <w:rPr>
+          <w:rFonts w:ascii="Calibri" w:hAnsi="Calibri"/>
+          <w:color w:val="444455"/>
+        </w:rPr>
+        <w:t>LoadBalancer</w:t>
+      </w:r>
+      <w:proofErr w:type="spellEnd"/>
+      <w:r>
+        <w:rPr>
+          <w:rFonts w:ascii="Calibri" w:hAnsi="Calibri"/>
+          <w:color w:val="444455"/>
+        </w:rPr>
+        <w:t>. A rolling-restart demo issued six consecutive health-check requests during the restart — all returned 200 — confirming zero-downtime rollout.</w:t>
       </w:r>
     </w:p>
     <w:p>
@@ -5506,7 +7384,7 @@
                     <pic:cNvPicPr/>
                   </pic:nvPicPr>
                   <pic:blipFill>
-                    <a:blip r:embed="rId21"/>
+                    <a:blip r:embed="rId25"/>
                     <a:stretch>
                       <a:fillRect/>
                     </a:stretch>
@@ -5564,7 +7442,7 @@
                     <pic:cNvPicPr/>
                   </pic:nvPicPr>
                   <pic:blipFill>
-                    <a:blip r:embed="rId22"/>
+                    <a:blip r:embed="rId26"/>
                     <a:stretch>
                       <a:fillRect/>
                     </a:stretch>
@@ -5596,7 +7474,43 @@
           <w:sz w:val="19"/>
         </w:rPr>
         <w:lastRenderedPageBreak/>
-        <w:t>Figure 17 — kubectl get all -n heart-disease: 2 pods Running, LoadBalancer active</w:t>
+        <w:t xml:space="preserve">Figure 17 — </w:t>
+      </w:r>
+      <w:proofErr w:type="spellStart"/>
+      <w:r>
+        <w:rPr>
+          <w:i/>
+          <w:color w:val="777777"/>
+          <w:sz w:val="19"/>
+        </w:rPr>
+        <w:t>kubectl</w:t>
+      </w:r>
+      <w:proofErr w:type="spellEnd"/>
+      <w:r>
+        <w:rPr>
+          <w:i/>
+          <w:color w:val="777777"/>
+          <w:sz w:val="19"/>
+        </w:rPr>
+        <w:t xml:space="preserve"> get all -n heart-disease: 2 pods Running, </w:t>
+      </w:r>
+      <w:proofErr w:type="spellStart"/>
+      <w:r>
+        <w:rPr>
+          <w:i/>
+          <w:color w:val="777777"/>
+          <w:sz w:val="19"/>
+        </w:rPr>
+        <w:t>LoadBalancer</w:t>
+      </w:r>
+      <w:proofErr w:type="spellEnd"/>
+      <w:r>
+        <w:rPr>
+          <w:i/>
+          <w:color w:val="777777"/>
+          <w:sz w:val="19"/>
+        </w:rPr>
+        <w:t xml:space="preserve"> active</w:t>
       </w:r>
     </w:p>
     <w:p>
@@ -5623,7 +7537,7 @@
                     <pic:cNvPicPr/>
                   </pic:nvPicPr>
                   <pic:blipFill>
-                    <a:blip r:embed="rId23"/>
+                    <a:blip r:embed="rId27"/>
                     <a:stretch>
                       <a:fillRect/>
                     </a:stretch>
@@ -5681,7 +7595,7 @@
                     <pic:cNvPicPr/>
                   </pic:nvPicPr>
                   <pic:blipFill>
-                    <a:blip r:embed="rId24"/>
+                    <a:blip r:embed="rId28"/>
                     <a:stretch>
                       <a:fillRect/>
                     </a:stretch>
@@ -5739,7 +7653,7 @@
                     <pic:cNvPicPr/>
                   </pic:nvPicPr>
                   <pic:blipFill>
-                    <a:blip r:embed="rId25"/>
+                    <a:blip r:embed="rId29"/>
                     <a:stretch>
                       <a:fillRect/>
                     </a:stretch>
@@ -5770,8 +7684,18 @@
           <w:color w:val="777777"/>
           <w:sz w:val="19"/>
         </w:rPr>
-        <w:t>Figure 20 — Structured prediction log line: prediction, probability, latency_ms</w:t>
-      </w:r>
+        <w:t xml:space="preserve">Figure 20 — Structured prediction log line: prediction, probability, </w:t>
+      </w:r>
+      <w:proofErr w:type="spellStart"/>
+      <w:r>
+        <w:rPr>
+          <w:i/>
+          <w:color w:val="777777"/>
+          <w:sz w:val="19"/>
+        </w:rPr>
+        <w:t>latency_ms</w:t>
+      </w:r>
+      <w:proofErr w:type="spellEnd"/>
     </w:p>
     <w:p>
       <w:pPr>
@@ -5798,7 +7722,7 @@
                     <pic:cNvPicPr/>
                   </pic:nvPicPr>
                   <pic:blipFill>
-                    <a:blip r:embed="rId26"/>
+                    <a:blip r:embed="rId30"/>
                     <a:stretch>
                       <a:fillRect/>
                     </a:stretch>
@@ -5841,7 +7765,7 @@
       <w:pPr>
         <w:pStyle w:val="Heading1"/>
       </w:pPr>
-      <w:bookmarkStart w:id="20" w:name="_Toc234704887"/>
+      <w:bookmarkStart w:id="20" w:name="_Toc234759010"/>
       <w:r>
         <w:lastRenderedPageBreak/>
         <w:t>9. Monitoring &amp; Logging</w:t>
@@ -5852,7 +7776,7 @@
       <w:pPr>
         <w:pStyle w:val="Heading2"/>
       </w:pPr>
-      <w:bookmarkStart w:id="21" w:name="_Toc234704888"/>
+      <w:bookmarkStart w:id="21" w:name="_Toc234759011"/>
       <w:r>
         <w:t>Structured Logging</w:t>
       </w:r>
@@ -5867,7 +7791,23 @@
           <w:rFonts w:ascii="Calibri" w:hAnsi="Calibri"/>
           <w:color w:val="444455"/>
         </w:rPr>
-        <w:t>Every prediction request emits a structured application log line alongside uvicorn's own access log entry:</w:t>
+        <w:t xml:space="preserve">Every prediction request emits a structured application log line alongside </w:t>
+      </w:r>
+      <w:proofErr w:type="spellStart"/>
+      <w:r>
+        <w:rPr>
+          <w:rFonts w:ascii="Calibri" w:hAnsi="Calibri"/>
+          <w:color w:val="444455"/>
+        </w:rPr>
+        <w:t>uvicorn's</w:t>
+      </w:r>
+      <w:proofErr w:type="spellEnd"/>
+      <w:r>
+        <w:rPr>
+          <w:rFonts w:ascii="Calibri" w:hAnsi="Calibri"/>
+          <w:color w:val="444455"/>
+        </w:rPr>
+        <w:t xml:space="preserve"> own access log entry:</w:t>
       </w:r>
     </w:p>
     <w:p>
@@ -5876,13 +7816,41 @@
         <w:spacing w:after="0"/>
         <w:ind w:left="283"/>
       </w:pPr>
+      <w:proofErr w:type="spellStart"/>
       <w:r>
         <w:rPr>
           <w:rFonts w:ascii="Courier New" w:hAnsi="Courier New"/>
           <w:color w:val="1E1E1E"/>
           <w:sz w:val="19"/>
         </w:rPr>
-        <w:t>heart_disease_api INFO predict prediction=&lt;0|1&gt; probability=&lt;p&gt; latency_ms=&lt;t&gt;</w:t>
+        <w:t>heart_disease_api</w:t>
+      </w:r>
+      <w:proofErr w:type="spellEnd"/>
+      <w:r>
+        <w:rPr>
+          <w:rFonts w:ascii="Courier New" w:hAnsi="Courier New"/>
+          <w:color w:val="1E1E1E"/>
+          <w:sz w:val="19"/>
+        </w:rPr>
+        <w:t xml:space="preserve"> INFO predict prediction=&lt;0|1&gt; probability=&lt;p&gt; </w:t>
+      </w:r>
+      <w:proofErr w:type="spellStart"/>
+      <w:r>
+        <w:rPr>
+          <w:rFonts w:ascii="Courier New" w:hAnsi="Courier New"/>
+          <w:color w:val="1E1E1E"/>
+          <w:sz w:val="19"/>
+        </w:rPr>
+        <w:t>latency_ms</w:t>
+      </w:r>
+      <w:proofErr w:type="spellEnd"/>
+      <w:r>
+        <w:rPr>
+          <w:rFonts w:ascii="Courier New" w:hAnsi="Courier New"/>
+          <w:color w:val="1E1E1E"/>
+          <w:sz w:val="19"/>
+        </w:rPr>
+        <w:t>=&lt;t&gt;</w:t>
       </w:r>
     </w:p>
     <w:p/>
@@ -5902,7 +7870,7 @@
       <w:pPr>
         <w:pStyle w:val="Heading2"/>
       </w:pPr>
-      <w:bookmarkStart w:id="22" w:name="_Toc234704889"/>
+      <w:bookmarkStart w:id="22" w:name="_Toc234759012"/>
       <w:r>
         <w:t>Prometheus Metrics</w:t>
       </w:r>
@@ -5917,7 +7885,23 @@
           <w:rFonts w:ascii="Calibri" w:hAnsi="Calibri"/>
           <w:color w:val="444455"/>
         </w:rPr>
-        <w:t>The API exposes a /metrics endpoint via prometheus-fastapi-instrumentator, providing:</w:t>
+        <w:t xml:space="preserve">The API exposes a /metrics endpoint via </w:t>
+      </w:r>
+      <w:proofErr w:type="spellStart"/>
+      <w:r>
+        <w:rPr>
+          <w:rFonts w:ascii="Calibri" w:hAnsi="Calibri"/>
+          <w:color w:val="444455"/>
+        </w:rPr>
+        <w:t>prometheus-fastapi-instrumentator</w:t>
+      </w:r>
+      <w:proofErr w:type="spellEnd"/>
+      <w:r>
+        <w:rPr>
+          <w:rFonts w:ascii="Calibri" w:hAnsi="Calibri"/>
+          <w:color w:val="444455"/>
+        </w:rPr>
+        <w:t>, providing:</w:t>
       </w:r>
     </w:p>
     <w:p>
@@ -5941,14 +7925,46 @@
           <w:rFonts w:ascii="Calibri" w:hAnsi="Calibri"/>
           <w:color w:val="444455"/>
         </w:rPr>
-        <w:t>Custom domain counter: heart_disease_predictions_total{risk_label} — incremented on every prediction</w:t>
+        <w:t xml:space="preserve">Custom domain counter: </w:t>
+      </w:r>
+      <w:proofErr w:type="spellStart"/>
+      <w:r>
+        <w:rPr>
+          <w:rFonts w:ascii="Calibri" w:hAnsi="Calibri"/>
+          <w:color w:val="444455"/>
+        </w:rPr>
+        <w:t>heart_disease_predictions_total</w:t>
+      </w:r>
+      <w:proofErr w:type="spellEnd"/>
+      <w:r>
+        <w:rPr>
+          <w:rFonts w:ascii="Calibri" w:hAnsi="Calibri"/>
+          <w:color w:val="444455"/>
+        </w:rPr>
+        <w:t>{</w:t>
+      </w:r>
+      <w:proofErr w:type="spellStart"/>
+      <w:r>
+        <w:rPr>
+          <w:rFonts w:ascii="Calibri" w:hAnsi="Calibri"/>
+          <w:color w:val="444455"/>
+        </w:rPr>
+        <w:t>risk_label</w:t>
+      </w:r>
+      <w:proofErr w:type="spellEnd"/>
+      <w:r>
+        <w:rPr>
+          <w:rFonts w:ascii="Calibri" w:hAnsi="Calibri"/>
+          <w:color w:val="444455"/>
+        </w:rPr>
+        <w:t>} — incremented on every prediction</w:t>
       </w:r>
     </w:p>
     <w:p>
       <w:pPr>
         <w:pStyle w:val="Heading2"/>
       </w:pPr>
-      <w:bookmarkStart w:id="23" w:name="_Toc234704890"/>
+      <w:bookmarkStart w:id="23" w:name="_Toc234759013"/>
       <w:r>
         <w:t>Grafana Dashboard</w:t>
       </w:r>
@@ -5963,7 +7979,55 @@
           <w:rFonts w:ascii="Calibri" w:hAnsi="Calibri"/>
           <w:color w:val="444455"/>
         </w:rPr>
-        <w:t>Prometheus and Grafana are deployed into the same namespace, fully provisioned from ConfigMaps with a single kubectl apply -f infra/k8s/monitoring/. The pre-built 'Heart Disease API' dashboard covers request rate, p50/p95 latency, non-2xx rate, and predictions by risk label — both services reachable via LoadBalancer on ports 9090 and 3000.</w:t>
+        <w:t xml:space="preserve">Prometheus and Grafana are deployed into the same namespace, fully provisioned from </w:t>
+      </w:r>
+      <w:proofErr w:type="spellStart"/>
+      <w:r>
+        <w:rPr>
+          <w:rFonts w:ascii="Calibri" w:hAnsi="Calibri"/>
+          <w:color w:val="444455"/>
+        </w:rPr>
+        <w:t>ConfigMaps</w:t>
+      </w:r>
+      <w:proofErr w:type="spellEnd"/>
+      <w:r>
+        <w:rPr>
+          <w:rFonts w:ascii="Calibri" w:hAnsi="Calibri"/>
+          <w:color w:val="444455"/>
+        </w:rPr>
+        <w:t xml:space="preserve"> with a single </w:t>
+      </w:r>
+      <w:proofErr w:type="spellStart"/>
+      <w:r>
+        <w:rPr>
+          <w:rFonts w:ascii="Calibri" w:hAnsi="Calibri"/>
+          <w:color w:val="444455"/>
+        </w:rPr>
+        <w:t>kubectl</w:t>
+      </w:r>
+      <w:proofErr w:type="spellEnd"/>
+      <w:r>
+        <w:rPr>
+          <w:rFonts w:ascii="Calibri" w:hAnsi="Calibri"/>
+          <w:color w:val="444455"/>
+        </w:rPr>
+        <w:t xml:space="preserve"> apply -f infra/k8s/monitoring/. The pre-built 'Heart Disease API' dashboard covers request rate, p50/p95 latency, non-2xx rate, and predictions by risk label — both services reachable via </w:t>
+      </w:r>
+      <w:proofErr w:type="spellStart"/>
+      <w:r>
+        <w:rPr>
+          <w:rFonts w:ascii="Calibri" w:hAnsi="Calibri"/>
+          <w:color w:val="444455"/>
+        </w:rPr>
+        <w:t>LoadBalancer</w:t>
+      </w:r>
+      <w:proofErr w:type="spellEnd"/>
+      <w:r>
+        <w:rPr>
+          <w:rFonts w:ascii="Calibri" w:hAnsi="Calibri"/>
+          <w:color w:val="444455"/>
+        </w:rPr>
+        <w:t xml:space="preserve"> on ports 9090 and 3000.</w:t>
       </w:r>
     </w:p>
     <w:p>
@@ -5990,7 +8054,7 @@
                     <pic:cNvPicPr/>
                   </pic:nvPicPr>
                   <pic:blipFill>
-                    <a:blip r:embed="rId27"/>
+                    <a:blip r:embed="rId31"/>
                     <a:stretch>
                       <a:fillRect/>
                     </a:stretch>
@@ -6021,7 +8085,25 @@
           <w:color w:val="777777"/>
           <w:sz w:val="19"/>
         </w:rPr>
-        <w:t>Figure 22 — Prometheus targets page: heart-disease-api scrape target UP</w:t>
+        <w:t>Figure 22 — Prometheus targets page: heart-disease-</w:t>
+      </w:r>
+      <w:proofErr w:type="spellStart"/>
+      <w:r>
+        <w:rPr>
+          <w:i/>
+          <w:color w:val="777777"/>
+          <w:sz w:val="19"/>
+        </w:rPr>
+        <w:t>api</w:t>
+      </w:r>
+      <w:proofErr w:type="spellEnd"/>
+      <w:r>
+        <w:rPr>
+          <w:i/>
+          <w:color w:val="777777"/>
+          <w:sz w:val="19"/>
+        </w:rPr>
+        <w:t xml:space="preserve"> scrape target UP</w:t>
       </w:r>
     </w:p>
     <w:p>
@@ -6049,7 +8131,7 @@
                     <pic:cNvPicPr/>
                   </pic:nvPicPr>
                   <pic:blipFill>
-                    <a:blip r:embed="rId28"/>
+                    <a:blip r:embed="rId32"/>
                     <a:stretch>
                       <a:fillRect/>
                     </a:stretch>
@@ -6107,7 +8189,7 @@
                     <pic:cNvPicPr/>
                   </pic:nvPicPr>
                   <pic:blipFill>
-                    <a:blip r:embed="rId29"/>
+                    <a:blip r:embed="rId33"/>
                     <a:stretch>
                       <a:fillRect/>
                     </a:stretch>
@@ -6145,9 +8227,11 @@
       <w:pPr>
         <w:pStyle w:val="Heading2"/>
       </w:pPr>
+      <w:bookmarkStart w:id="24" w:name="_Toc234759014"/>
       <w:r>
         <w:t>Observability Lesson: Scrape Topology</w:t>
       </w:r>
+      <w:bookmarkEnd w:id="24"/>
     </w:p>
     <w:p>
       <w:r>
@@ -6170,11 +8254,11 @@
       <w:pPr>
         <w:pStyle w:val="Heading1"/>
       </w:pPr>
-      <w:bookmarkStart w:id="24" w:name="_Toc234704892"/>
+      <w:bookmarkStart w:id="25" w:name="_Toc234759015"/>
       <w:r>
         <w:t>10. Conclusion</w:t>
       </w:r>
-      <w:bookmarkEnd w:id="24"/>
+      <w:bookmarkEnd w:id="25"/>
     </w:p>
     <w:p>
       <w:pPr>
@@ -6309,8 +8393,17 @@
           <w:rFonts w:ascii="Calibri" w:hAnsi="Calibri"/>
           <w:color w:val="444455"/>
         </w:rPr>
-        <w:t xml:space="preserve"> tests covering data prep, feature engineering, export logic, and API behaviour</w:t>
-      </w:r>
+        <w:t xml:space="preserve"> tests covering data prep, feature engineering, export logic, and API </w:t>
+      </w:r>
+      <w:proofErr w:type="spellStart"/>
+      <w:r>
+        <w:rPr>
+          <w:rFonts w:ascii="Calibri" w:hAnsi="Calibri"/>
+          <w:color w:val="444455"/>
+        </w:rPr>
+        <w:t>behaviour</w:t>
+      </w:r>
+      <w:proofErr w:type="spellEnd"/>
     </w:p>
     <w:sectPr>
       <w:pgSz w:w="12240" w:h="15840"/>
@@ -17941,6 +20034,30 @@
       <w:u w:val="single"/>
     </w:rPr>
   </w:style>
+  <w:style w:type="character" w:styleId="UnresolvedMention">
+    <w:name w:val="Unresolved Mention"/>
+    <w:basedOn w:val="DefaultParagraphFont"/>
+    <w:uiPriority w:val="99"/>
+    <w:semiHidden/>
+    <w:unhideWhenUsed/>
+    <w:rsid w:val="00C2154E"/>
+    <w:rPr>
+      <w:color w:val="605E5C"/>
+      <w:shd w:val="clear" w:color="auto" w:fill="E1DFDD"/>
+    </w:rPr>
+  </w:style>
+  <w:style w:type="character" w:styleId="FollowedHyperlink">
+    <w:name w:val="FollowedHyperlink"/>
+    <w:basedOn w:val="DefaultParagraphFont"/>
+    <w:uiPriority w:val="99"/>
+    <w:semiHidden/>
+    <w:unhideWhenUsed/>
+    <w:rsid w:val="000C31CD"/>
+    <w:rPr>
+      <w:color w:val="800080" w:themeColor="followedHyperlink"/>
+      <w:u w:val="single"/>
+    </w:rPr>
+  </w:style>
 </w:styles>
 </file>
 

</xml_diff>